<commit_message>
Smooth dashboard pacing and harden module failure paths
Enable adaptive FPS and CPU driven routine scan pacing with distinct footer metrics. Repair sustained work, response recovery, remote evidence, telemetry continuity and Qt lifetime defects. Review all 87 module files and update the master manual, screenshots and validation records.
</commit_message>
<xml_diff>
--- a/Angerona_Master_Manual.docx
+++ b/Angerona_Master_Manual.docx
@@ -33,6 +33,7 @@
     </w:p>
     <w:p>
       <w:pPr>
+        <w:pStyle w:val="Title"/>
         <w:spacing w:after="200"/>
         <w:jc w:val="center"/>
       </w:pPr>
@@ -40,8 +41,9 @@
         <w:rPr>
           <w:rFonts w:ascii="Calibri" w:hAnsi="Calibri" w:eastAsia="Calibri"/>
           <w:b/>
-          <w:color w:val="0B2545"/>
+          <w:color w:val="000000"/>
           <w:sz w:val="64"/>
+          <w:u w:val="none"/>
         </w:rPr>
         <w:t>ANGERONA</w:t>
       </w:r>
@@ -110,7 +112,7 @@
           </w:tcPr>
           <w:p>
             <w:r>
-              <w:t>Current release: v1.13.0 with Cycle 34 post-release defensive convergence across governed detection authority, Fleet custody and lifecycle, loopback canvas isolation, AegisPath lookup bounds, and coherent publisher-key validation.</w:t>
+              <w:t>Current release: v1.13.0 with October dashboard responsiveness, default-on adaptive routine scan pacing, and a review of all 87 module source files covering 84 discovered capabilities.</w:t>
             </w:r>
           </w:p>
         </w:tc>
@@ -134,7 +136,7 @@
           <w:color w:val="0B2545"/>
           <w:sz w:val="22"/>
         </w:rPr>
-        <w:t>30 August 2026</w:t>
+        <w:t>4 October 2026</w:t>
       </w:r>
     </w:p>
     <w:p>
@@ -153,6 +155,8 @@
     <w:p>
       <w:pPr>
         <w:sectPr>
+          <w:footerReference w:type="first" r:id="rId13"/>
+          <w:footerReference w:type="even" r:id="rId14"/>
           <w:type w:val="nextPage"/>
           <w:headerReference w:type="default" r:id="rId12"/>
           <w:footerReference w:type="default" r:id="rId11"/>
@@ -337,7 +341,7 @@
           </w:tcPr>
           <w:p>
             <w:r>
-              <w:t>Cycle 34 three-round convergence and commit-bound release validation complete; GitHub publication is restricted to the guarded canonical publisher</w:t>
+              <w:t>October 2026 maintenance. See section 13.3 for local validation; publication and exact-commit CI remain governed by the canonical publisher and GitHub Actions.</w:t>
             </w:r>
           </w:p>
         </w:tc>
@@ -4871,6 +4875,45 @@
     </w:p>
     <w:p>
       <w:pPr>
+        <w:pStyle w:val="Heading2"/>
+        <w:pageBreakBefore/>
+      </w:pPr>
+      <w:r>
+        <w:t>5.4 Dashboard display and readable module ribbons</w:t>
+      </w:r>
+    </w:p>
+    <w:p>
+      <w:pPr/>
+      <w:r>
+        <w:t>Settings &gt; Appearance &gt; Dashboard display selects Standard or the optional Orbital dashboard. Standard remains the default. Orbital presents existing module and posture snapshots, with click-through details and a Workspace tab for normal operations; it adds no telemetry collectors.</w:t>
+      </w:r>
+    </w:p>
+    <w:p>
+      <w:pPr/>
+      <w:r>
+        <w:t>The bottom HEALTH and ACTIVITY ribbons keep individual modules in readable tiles. Slow synchronized scrolling, pause, wheel and keyboard navigation let you browse without shrinking every module into the window. Reduced motion and hidden-window handling stop unnecessary animation. Activity remains an estimate, separate from health, assurance and actual host CPU.</w:t>
+      </w:r>
+    </w:p>
+    <w:p>
+      <w:pPr/>
+      <w:r>
+        <w:t>The persistent footer shows CPU, RAM, dashboard FPS, Angerona pace, network rates and posture. It reflows into additional rows as space narrows. Hover or keyboard access provides full metric descriptions when a caption is shortened.</w:t>
+      </w:r>
+    </w:p>
+    <w:p>
+      <w:pPr/>
+      <w:r>
+        <w:t>FPS is a tiny Qt footer paint heartbeat targeting 30 deliveries per second. Its percentage is the observed rate divided by 30, capped at 100. It measures dashboard responsiveness, not GPU or monitor refresh rate. Hidden or minimized dashboards show a paused state; startup shows measuring until a real sample is available.</w:t>
+      </w:r>
+    </w:p>
+    <w:p>
+      <w:pPr/>
+      <w:r>
+        <w:t>Angerona pace is a separate bar showing the requested routine scan budget: 100, 50, 25 or about 13 percent for interval multipliers 1, 2, 4 or 8. For example, CPU 10 percent and Angerona pace 25 percent describe different quantities. Pace is neither a CPU reservation nor measured throughput or a security coverage percentage.</w:t>
+      </w:r>
+    </w:p>
+    <w:p>
+      <w:pPr>
         <w:pStyle w:val="Heading1"/>
         <w:pageBreakBefore/>
       </w:pPr>
@@ -7639,6 +7682,38 @@
     </w:p>
     <w:p>
       <w:pPr>
+        <w:pStyle w:val="Heading2"/>
+      </w:pPr>
+      <w:r>
+        <w:t>10.4 Adaptive pacing for dashboard responsiveness</w:t>
+      </w:r>
+    </w:p>
+    <w:p>
+      <w:pPr/>
+      <w:r>
+        <w:t>Adaptive routine scan pacing is enabled by default, including when older settings files do not contain the option. Change it under Settings &gt; Appearance. The controller reuses existing host CPU observations and the small footer heartbeat; it creates no new host sampling thread.</w:t>
+      </w:r>
+    </w:p>
+    <w:p>
+      <w:pPr/>
+      <w:r>
+        <w:t>Sustained slow paints, delayed scheduling, a missing visible heartbeat or high CPU progressively lengthen opted-in routine work. Healthy feedback restores one level every eight seconds. Added interval delay is capped at 30 seconds; cooperative inner-loop checkpoints wait at most 50 milliseconds per batch and remain interruptible by stop.</w:t>
+      </w:r>
+    </w:p>
+    <w:p>
+      <w:pPr/>
+      <w:r>
+        <w:t>Paced work includes routine process and network inventories, Memory Time-Machine, memory injection scanning, YARA file scanning, FIM full-file scanning and Sysmon process fallback. FIM hash chunks and memory-region walks yield during long passes. Event delivery, streaming telemetry, response execution, watchdogs and direct self-tests keep their own cadence. Other governors combine by the greater requested delay instead of multiplying delays.</w:t>
+      </w:r>
+    </w:p>
+    <w:p>
+      <w:pPr/>
+      <w:r>
+        <w:t>Slower routine scans can increase discovery latency. Critical action authority and evidence checks remain mandatory. This cooperative control cannot preempt a blocked native call or promise a CPU quota or a freeze-free host. On a host that keeps up, the requested pace returns to 100 percent.</w:t>
+      </w:r>
+    </w:p>
+    <w:p>
+      <w:pPr>
         <w:pStyle w:val="Heading1"/>
         <w:pageBreakBefore/>
       </w:pPr>
@@ -7784,6 +7859,20 @@
           <w:color w:val="243447"/>
         </w:rPr>
         <w:t>The final live campaign required five automatic rounds. The winning round recorded 52/52 detections, 52/52 responses, 13/13 action contracts, and 13/13 verified closures, with resilience PASS. Post-cleanup state was empty and journal integrity remained valid. This proves the tested campaign, not every possible attack.</w:t>
+      </w:r>
+    </w:p>
+    <w:p>
+      <w:pPr>
+        <w:pStyle w:val="Heading2"/>
+      </w:pPr>
+      <w:r>
+        <w:t>11.3 Responsive sandbox editor</w:t>
+      </w:r>
+    </w:p>
+    <w:p>
+      <w:pPr/>
+      <w:r>
+        <w:t>Opening the Red Team console leaves the unvisited Sandbox Editor unloaded. Its first visit, reload, syntax-checked save and confirmed rollback use one background worker. Busy controls prevent overlapping operations; errors preserve the current buffer and offer retry. All writes remain confined to the isolated source working copy. The installed application is not hot-reloaded.</w:t>
       </w:r>
     </w:p>
     <w:p>
@@ -8057,7 +8146,7 @@
                 <w:color w:val="0B2545"/>
                 <w:sz w:val="19"/>
               </w:rPr>
-              <w:t>Final result</w:t>
+              <w:t>Historical Cycle 34 result</w:t>
             </w:r>
           </w:p>
         </w:tc>
@@ -8697,7 +8786,7 @@
         <w:pStyle w:val="ListBullet"/>
       </w:pPr>
       <w:r>
-        <w:t>The six pytest skips are declared host/platform capability gates; structured classification cannot waive an unknown failure.</w:t>
+        <w:t>The historical Cycle 25 suite had six declared host/platform capability skips; later gates have their own explicit skip counts. Unknown failures cannot be waived as platform skips.</w:t>
       </w:r>
     </w:p>
     <w:p>
@@ -8742,6 +8831,38 @@
       <w:pPr/>
       <w:r>
         <w:t>These gates are strong project evidence, not independent certification, commercial EDR parity, attribution, or proof of complete attack coverage.</w:t>
+      </w:r>
+    </w:p>
+    <w:p>
+      <w:pPr>
+        <w:pStyle w:val="Heading2"/>
+      </w:pPr>
+      <w:r>
+        <w:t>13.3 October module review and regression evidence</w:t>
+      </w:r>
+    </w:p>
+    <w:p>
+      <w:pPr/>
+      <w:r>
+        <w:t>The October review inspected every one of the 87 Python files under src/angerona/modules and the 84 discovered defensive capabilities. Per-file purpose, security boundaries, performance concerns, fixes and remaining limits are recorded in analysis/module-review-2026-10-04. Review is evidence about this source snapshot, not independent certification.</w:t>
+      </w:r>
+    </w:p>
+    <w:p>
+      <w:pPr/>
+      <w:r>
+        <w:t>Fixes cover routine telemetry causing priority escalation, malformed cloud verdicts, uncertain Combat compensation and firewall-state verification, remote observation entering local response correlation, Defender live log continuity, false FRZ health, incomplete forensics and network observations, process identity reuse, provenance cycle checks, bounded SOAR retry state, safe Mobile ECO scope and bounded alert authorization state, nonmutating Intel self-tests, and Smart Deception cancellation.</w:t>
+      </w:r>
+    </w:p>
+    <w:p>
+      <w:pPr/>
+      <w:r>
+        <w:t>The maintenance offline selfcheck passed 26 phases with no failures: 66 module passes and 18 declared skips, plus a passing synthetic event pipeline. Focused regressions cover pacing, cancellation, retained evidence and the repaired authority boundaries. Full-suite totals, compile and lint results, declared skips and publication evidence are maintained in analysis/module-review-2026-10-04/README.md and exact-commit GitHub Actions, rather than reusing historical chapter totals as current results.</w:t>
+      </w:r>
+    </w:p>
+    <w:p>
+      <w:pPr/>
+      <w:r>
+        <w:t>Tests and reproductions use isolated data, inert events and mocked host actions where required. This maintenance did not run a live hostile campaign or exercise actual firewall changes, native process suspension, privileged watchdog isolation or a prolonged elevated all-sensor soak. GitHub Actions records the exact published commit; the publisher must prove public main and the local branch match and public README assets match their tracked bytes.</w:t>
       </w:r>
     </w:p>
     <w:p>
@@ -9735,6 +9856,26 @@
     </w:p>
     <w:p>
       <w:pPr>
+        <w:pStyle w:val="Heading2"/>
+      </w:pPr>
+      <w:r>
+        <w:t>14.3 Sustained responsiveness evidence</w:t>
+      </w:r>
+    </w:p>
+    <w:p>
+      <w:pPr/>
+      <w:r>
+        <w:t>An isolated Memory Time-Machine reproduction found that 257 processes with three unchanged observations caused all 771 observations to be forwarded again on every sweep because the 256-PID index continually evicted the next process. The wider bounded index changes repeat sweeps to zero forwarded observations while preserving the aggregate 1,048,576-fingerprint ceiling and retry after failed queue admission. A 320-process fixture similarly changes 960 redundant observations to zero.</w:t>
+      </w:r>
+    </w:p>
+    <w:p>
+      <w:pPr/>
+      <w:r>
+        <w:t>Historic local watchdog logs recorded roughly six-second stalls while constructing a details view or reading the simulation editor. Deferring editor file operations removes a confirmed GUI-thread I/O path. These reproductions show avoided work and bounded control behavior; they do not measure a guaranteed whole-host CPU or FPS improvement. Restart the updated application and observe a normal sustained session to assess remaining load.</w:t>
+      </w:r>
+    </w:p>
+    <w:p>
+      <w:pPr>
         <w:pStyle w:val="Heading1"/>
         <w:keepNext/>
         <w:pageBreakBefore w:val="0"/>
@@ -9777,7 +9918,7 @@
           </w:tcPr>
           <w:p>
             <w:r>
-              <w:t>Final red-team verdict: Cycle 34 fixed five Round 1 findings, the Round 2 detection/lifecycle and Fleet retained-evidence findings, and every Round 3 replay, ownership, cache, quota, migration, quarantine, and trust-coherence bypass. Final focused re-attacks found no open Critical, High, or Medium release blocker. Full-root rollback still needs an external witness, and Fleet remains a bounded local lab.</w:t>
+              <w:t>Historical Cycle 34 red-team verdict: Cycle 34 fixed five Round 1 findings, the Round 2 detection/lifecycle and Fleet retained-evidence findings, and every Round 3 replay, ownership, cache, quota, migration, quarantine, and trust-coherence bypass. Final focused re-attacks found no open Critical, High, or Medium release blocker. Full-root rollback still needs an external witness, and Fleet remains a bounded local lab.</w:t>
             </w:r>
           </w:p>
         </w:tc>
@@ -9803,7 +9944,7 @@
           <w:i w:val="0"/>
           <w:color w:val="243447"/>
         </w:rPr>
-        <w:t>R6-03 remains open as a Medium defense-in-depth improvement, not a release blocker: path-wide program firewall work would be stronger if Combat retained an OS process handle and a bounded executable-file identity lease for the full action interval. Current controls revalidate PID birth and executable identity, and the final audit found no reproducing unsafe mutation in this surface.</w:t>
+        <w:t>R6-03 remains a defense-in-depth proposal: retaining an OS process handle and a bounded executable identity lease across the complete program-firewall action would strengthen identity custody. October review separately reproduced and fixed failed compensation being terminalized despite uncertain effects; unverified reversal now remains in recovery. Neither finding establishes complete host-mutation safety.</w:t>
       </w:r>
     </w:p>
     <w:p>
@@ -12190,6 +12331,32 @@
     </w:p>
     <w:p>
       <w:pPr>
+        <w:pStyle w:val="Heading2"/>
+      </w:pPr>
+      <w:r>
+        <w:t>17.10 Dashboard responsiveness and module review October 2026</w:t>
+      </w:r>
+    </w:p>
+    <w:p>
+      <w:pPr/>
+      <w:r>
+        <w:t>This v1.13.0 maintenance adds readable responsive dashboard controls, the optional orbital overview, a default-on FPS-guided routine scan controller and a distinct Angerona pacing bar. It also reduces repeated Memory Time-Machine processing and makes sandbox editing asynchronous.</w:t>
+      </w:r>
+    </w:p>
+    <w:p>
+      <w:pPr/>
+      <w:r>
+        <w:t>The complete module review applies reproducible bug, security and performance fixes while preserving exact response authority and truthful incomplete states. Source reports retain unresolved operational and scaling limits, including extended native host validation, bounded-query byte limits on older SQLite bindings, and retention policy work that must not silently delete recovery evidence.</w:t>
+      </w:r>
+    </w:p>
+    <w:p>
+      <w:pPr/>
+      <w:r>
+        <w:t>Primary records: analysis/sustained-responsiveness-2026-10-04.md and analysis/module-review-2026-10-04/README.md. Earlier chapters retain explicitly historical validation results rather than presenting them as this update's test totals.</w:t>
+      </w:r>
+    </w:p>
+    <w:p>
+      <w:pPr>
         <w:pStyle w:val="Heading1"/>
         <w:pageBreakBefore/>
       </w:pPr>
@@ -13850,8 +14017,28 @@
         <w:color w:val="667085"/>
         <w:sz w:val="17"/>
       </w:rPr>
-      <w:t>Angerona Suite  |  v1.13.0  |  30 August 2026</w:t>
+      <w:t>Angerona Suite  |  v1.13.0  |  4 October 2026</w:t>
     </w:r>
+  </w:p>
+</w:ftr>
+</file>
+
+<file path=word/footer3.xml><?xml version="1.0" encoding="utf-8"?>
+<w:ftr xmlns:m="http://schemas.openxmlformats.org/officeDocument/2006/math" xmlns:mc="http://schemas.openxmlformats.org/markup-compatibility/2006" xmlns:mo="http://schemas.microsoft.com/office/mac/office/2008/main" xmlns:mv="urn:schemas-microsoft-com:mac:vml" xmlns:o="urn:schemas-microsoft-com:office:office" xmlns:r="http://schemas.openxmlformats.org/officeDocument/2006/relationships" xmlns:v="urn:schemas-microsoft-com:vml" xmlns:w10="urn:schemas-microsoft-com:office:word" xmlns:w14="http://schemas.microsoft.com/office/word/2010/wordml" xmlns:w="http://schemas.openxmlformats.org/wordprocessingml/2006/main" xmlns:wne="http://schemas.microsoft.com/office/word/2006/wordml" xmlns:wp14="http://schemas.microsoft.com/office/word/2010/wordprocessingDrawing" xmlns:wp="http://schemas.openxmlformats.org/drawingml/2006/wordprocessingDrawing" xmlns:wpc="http://schemas.microsoft.com/office/word/2010/wordprocessingCanvas" xmlns:wpg="http://schemas.microsoft.com/office/word/2010/wordprocessingGroup" xmlns:wpi="http://schemas.microsoft.com/office/word/2010/wordprocessingInk" xmlns:wps="http://schemas.microsoft.com/office/word/2010/wordprocessingShape" mc:Ignorable="w14 wp14">
+  <w:p>
+    <w:pPr>
+      <w:pStyle w:val="Footer"/>
+    </w:pPr>
+  </w:p>
+</w:ftr>
+</file>
+
+<file path=word/footer4.xml><?xml version="1.0" encoding="utf-8"?>
+<w:ftr xmlns:m="http://schemas.openxmlformats.org/officeDocument/2006/math" xmlns:mc="http://schemas.openxmlformats.org/markup-compatibility/2006" xmlns:mo="http://schemas.microsoft.com/office/mac/office/2008/main" xmlns:mv="urn:schemas-microsoft-com:mac:vml" xmlns:o="urn:schemas-microsoft-com:office:office" xmlns:r="http://schemas.openxmlformats.org/officeDocument/2006/relationships" xmlns:v="urn:schemas-microsoft-com:vml" xmlns:w10="urn:schemas-microsoft-com:office:word" xmlns:w14="http://schemas.microsoft.com/office/word/2010/wordml" xmlns:w="http://schemas.openxmlformats.org/wordprocessingml/2006/main" xmlns:wne="http://schemas.microsoft.com/office/word/2006/wordml" xmlns:wp14="http://schemas.microsoft.com/office/word/2010/wordprocessingDrawing" xmlns:wp="http://schemas.openxmlformats.org/drawingml/2006/wordprocessingDrawing" xmlns:wpc="http://schemas.microsoft.com/office/word/2010/wordprocessingCanvas" xmlns:wpg="http://schemas.microsoft.com/office/word/2010/wordprocessingGroup" xmlns:wpi="http://schemas.microsoft.com/office/word/2010/wordprocessingInk" xmlns:wps="http://schemas.microsoft.com/office/word/2010/wordprocessingShape" mc:Ignorable="w14 wp14">
+  <w:p>
+    <w:pPr>
+      <w:pStyle w:val="Footer"/>
+    </w:pPr>
   </w:p>
 </w:ftr>
 </file>

</xml_diff>

<commit_message>
Keep drills running and restore verified unattended response
</commit_message>
<xml_diff>
--- a/Angerona_Master_Manual.docx
+++ b/Angerona_Master_Manual.docx
@@ -136,7 +136,7 @@
           <w:color w:val="0B2545"/>
           <w:sz w:val="22"/>
         </w:rPr>
-        <w:t>4 October 2026</w:t>
+        <w:t>8 October 2026</w:t>
       </w:r>
     </w:p>
     <w:p>
@@ -13881,6 +13881,60 @@
         <w:spacing w:after="40"/>
       </w:pPr>
     </w:p>
+    <w:p>
+      <w:pPr>
+        <w:pStyle w:val="Heading1"/>
+        <w:pageBreakBefore/>
+      </w:pPr>
+      <w:r>
+        <w:rPr>
+          <w:color w:val="000000"/>
+        </w:rPr>
+        <w:t>Operator update 8 October 2026</w:t>
+      </w:r>
+    </w:p>
+    <w:p>
+      <w:pPr/>
+      <w:r>
+        <w:t>Benign Shark and Red Team simulations continue when automatic response is unavailable. An amber warning remains visible through progress and results. Selected profiles, intensity and inert process/file exercises still run. Target ownership, the validation lease and engine startup must still succeed. Only authenticated verified response receipts count as containment; a completed exercise with no receipts remains unverified.</w:t>
+      </w:r>
+    </w:p>
+    <w:p>
+      <w:pPr/>
+      <w:r>
+        <w:t>Adversary Combat already defaults to automatic standing authority. Eligible detector evidence invokes the saved file, process, network, host-isolation and deception rules without asking for each incident and without requiring Ollama. The policy is restricted to exact authenticated detector-authorized targets. Health findings, exposure and model advice do not become containment commands.</w:t>
+      </w:r>
+    </w:p>
+    <w:p>
+      <w:pPr/>
+      <w:r>
+        <w:t>The footer shows Auto ARMED, HELD, OFF, STARTING or UNAVAILABLE beside posture. Settings &gt; Adversary Combat describes the effective rules and retains readiness, verified action history and Undo. Contain mode suspends eligible processes even if a different process action is saved. An armed policy cannot guarantee that every alert has an eligible target or that every action succeeds.</w:t>
+      </w:r>
+    </w:p>
+    <w:p>
+      <w:pPr/>
+      <w:r>
+        <w:t>A narrowly defined interrupted simulation checkpoint can now recover automatically during enabled Combat startup. Recovery requires an authenticated journal with exactly one trailing quarantine intent, agreeing protected checkpoint and independent witness, and no ambiguous pending recovery. The original single-link marker must retain its recorded identity, hash and exact shipped comprehensive-drill bytes in the suite drill sandbox; its quarantine destination must be absent.</w:t>
+      </w:r>
+    </w:p>
+    <w:p>
+      <w:pPr/>
+      <w:r>
+        <w:t>Recovery preserves private, verified copies of the unchanged journal, protected store and witness before advancing the matching checkpoint. It neither moves the marker nor creates signing authority, truncates history or reports a quarantine success. Normal reconciliation records the unapplied intent. Changed files, real containment effects, unrelated files, unsupported history or an unsuccessful proof leave automatic response held for verified recovery.</w:t>
+      </w:r>
+    </w:p>
+    <w:p>
+      <w:pPr/>
+      <w:r>
+        <w:t>When restarting this Windows source installation, use kill-all-angerona.bat with elevation to stop the verified Angerona processes, then reopen start-angerona.bat in the normal user session. The source launcher intentionally runs unelevated in Observe/development mode; the separately installed signed distribution supplies Windows Protect boundaries. Do not delete recovery data to clear a warning.</w:t>
+      </w:r>
+    </w:p>
+    <w:p>
+      <w:pPr/>
+      <w:r>
+        <w:t>The implementation record, regression evidence and remaining limits are in analysis/unattended-response-2026-10-08.md. Earlier validation totals in this manual retain their historical dates. GitHub Actions and the guarded publisher establish the exact published commit and current CI outcome.</w:t>
+      </w:r>
+    </w:p>
     <w:sectPr>
       <w:headerReference w:type="default" r:id="rId9"/>
       <w:footerReference w:type="default" r:id="rId10"/>
@@ -14017,7 +14071,7 @@
         <w:color w:val="667085"/>
         <w:sz w:val="17"/>
       </w:rPr>
-      <w:t>Angerona Suite  |  v1.13.0  |  4 October 2026</w:t>
+      <w:t>Angerona Suite  |  v1.13.0  |  8 October 2026</w:t>
     </w:r>
   </w:p>
 </w:ftr>

</xml_diff>

<commit_message>
Keep simulations, scanners and diagnostics responsive
</commit_message>
<xml_diff>
--- a/Angerona_Master_Manual.docx
+++ b/Angerona_Master_Manual.docx
@@ -136,7 +136,7 @@
           <w:color w:val="0B2545"/>
           <w:sz w:val="22"/>
         </w:rPr>
-        <w:t>8 October 2026</w:t>
+        <w:t>9 October 2026</w:t>
       </w:r>
     </w:p>
     <w:p>
@@ -13935,6 +13935,60 @@
         <w:t>Package installation pins PySide6 6.11.1, the validated GUI runtime; 6.12.0 remains unsupported after native CI crashes. The implementation record, regression evidence and remaining limits are in analysis/unattended-response-2026-10-08.md. Earlier validation totals in this manual retain their historical dates. GitHub Actions and the guarded publisher establish the exact published commit and current CI outcome.</w:t>
       </w:r>
     </w:p>
+    <w:p>
+      <w:pPr>
+        <w:pStyle w:val="Heading1"/>
+        <w:pageBreakBefore/>
+      </w:pPr>
+      <w:r>
+        <w:rPr>
+          <w:color w:val="000000"/>
+        </w:rPr>
+        <w:t>Operator update 9 October 2026</w:t>
+      </w:r>
+    </w:p>
+    <w:p>
+      <w:pPr/>
+      <w:r>
+        <w:t>Simulation preparation and stop cleanup now run outside the dashboard event loop. The console shows preparation while target checks, detector readiness and engine startup complete. Keep the console open to see the handoff. Stop clean cancels pending preparation and retires the run it owns; a cleanup failure remains visible. Duplicate launches wait for preparation or cleanup to finish. Selected exercises and response rules retain their existing behavior.</w:t>
+      </w:r>
+    </w:p>
+    <w:p>
+      <w:pPr/>
+      <w:r>
+        <w:t>The October 9 comprehensive campaign recorded 27 of 80 planned mandatory steps before a validation-producer liveness failure. Its manifest is incomplete and ineligible for scoring. Executed steps are not detections or containment receipts. No finalized October 9 after-action report was available during review; the September 23 report is historical. Live producer and signed-evidence checks remain required, and the failed producer has not been identified from the generic error.</w:t>
+      </w:r>
+    </w:p>
+    <w:p>
+      <w:pPr/>
+      <w:r>
+        <w:t>Repeated BYOVD drill phases now use distinct inert marker paths. This prevents a marker from an earlier phase blocking a later exclusive creation. Detector matching accepts the exact generated name, while response eligibility still requires the registered file identity and content. A similar filename alone grants no authority. Worker-start failure also releases Shark's run state so a later attempt can start.</w:t>
+      </w:r>
+    </w:p>
+    <w:p>
+      <w:pPr/>
+      <w:r>
+        <w:t>Black Box refreshes firewall and SOAR snapshots in background workers and retains the prior view if a refresh fails. SOAR shows at most 200 valid records from the latest 1 MiB. Firewall output, retained rules and visible rows have explicit limits. Log tails drain bounded chunks without deleting or skipping source evidence; large crash logs show a labeled preview. CPU readings now retain a sample for the same process identity.</w:t>
+      </w:r>
+    </w:p>
+    <w:p>
+      <w:pPr/>
+      <w:r>
+        <w:t>Scanners cooperate with the existing responsiveness governor during directory enumeration and file batches. Cancellation remains interruptible, deadlines still apply and partial inventories do not become completed coverage. The standalone scanner closes its resources on failure and cannot start a second sensor loop after a GUI error. Driver inventory has a finite watchdog budget matching its collector timeout; routine network-trust inventory can wait longer under pressure while collecting fresh evidence.</w:t>
+      </w:r>
+    </w:p>
+    <w:p>
+      <w:pPr/>
+      <w:r>
+        <w:t>Sandbox Editor now tests the opened buffer, safely retires completed workers and preserves undo entries when a revert fails. Source files are limited to 4 MiB; undo retains at most 20 copies and 16 MiB. Trusted baseline tests have bounded child output, memory and cleanup. Candidate edits remain AST-only. This editor is not an isolation boundary for executing hostile code, and working copies do not replace production sources.</w:t>
+      </w:r>
+    </w:p>
+    <w:p>
+      <w:pPr/>
+      <w:r>
+        <w:t>Flow windows cancel the initial AI poll when closing and reject late worker updates. These changes address confirmed blocking and lifetime bugs; they do not guarantee a maximum response time under Windows load. Restart Angerona and Black Box to load the update. See analysis/simulation-responsiveness-2026-10-09.md for the review and validation. GitHub Actions identifies the exact published commit; earlier manual results retain their historical dates.</w:t>
+      </w:r>
+    </w:p>
     <w:sectPr>
       <w:headerReference w:type="default" r:id="rId9"/>
       <w:footerReference w:type="default" r:id="rId10"/>
@@ -14071,7 +14125,7 @@
         <w:color w:val="667085"/>
         <w:sz w:val="17"/>
       </w:rPr>
-      <w:t>Angerona Suite  |  v1.13.0  |  8 October 2026</w:t>
+      <w:t>Angerona Suite  |  v1.13.0  |  9 October 2026</w:t>
     </w:r>
   </w:p>
 </w:ftr>

</xml_diff>

<commit_message>
Release v1.14 source with SpywareGuard and live AI review
Add governed SpywareGuard/UGCAP dashboards, live debugging, verified readiness, identity/recovery controls and opt-in daily GitHub checks with custom-code staging. Improve scanner/Black Box reads, process retry fairness, GUI ownership, response custody and packaged backup retention.

Validation: frozen full R10 7554 passed/49 skipped; later 141 focused cases and 29-phase selfcheck; final Python3.10 AST, Ruff, documentation and secret checks. Fresh wheel/sdist/source artifacts match reviewed bytes. Signed deployment and update activation remain separately held.
</commit_message>
<xml_diff>
--- a/Angerona_Master_Manual.docx
+++ b/Angerona_Master_Manual.docx
@@ -112,7 +112,7 @@
           </w:tcPr>
           <w:p>
             <w:r>
-              <w:t>Current release: v1.13.0 with October dashboard responsiveness, default-on adaptive routine scan pacing, and a review of all 87 module source files covering 84 discovered capabilities.</w:t>
+              <w:t>Current development: v1.14.0 with Live AI Review, nine integrated security workstreams, 86 discovered capabilities and the October 22 observation/acceptance register.</w:t>
             </w:r>
           </w:p>
         </w:tc>
@@ -136,7 +136,7 @@
           <w:color w:val="0B2545"/>
           <w:sz w:val="22"/>
         </w:rPr>
-        <w:t>9 October 2026</w:t>
+        <w:t>22 October 2026</w:t>
       </w:r>
     </w:p>
     <w:p>
@@ -295,7 +295,7 @@
           </w:tcPr>
           <w:p>
             <w:r>
-              <w:t>1.13.0</w:t>
+              <w:t>1.14.0</w:t>
             </w:r>
           </w:p>
         </w:tc>
@@ -341,7 +341,7 @@
           </w:tcPr>
           <w:p>
             <w:r>
-              <w:t>October 2026 maintenance. See section 13.3 for local validation; publication and exact-commit CI remain governed by the canonical publisher and GitHub Actions.</w:t>
+              <w:t>v1.14.0 source update. Validation is recorded in analysis/live-debug-2026-10-22; signed package and clean-VM release gates remain separate.</w:t>
             </w:r>
           </w:p>
         </w:tc>
@@ -499,7 +499,7 @@
                 <w:color w:val="243447"/>
                 <w:sz w:val="18"/>
               </w:rPr>
-              <w:t>Current repository code, the unchanged 84-capability inventory, and analysis/loop/cycle34 evidence as of 30 August 2026</w:t>
+              <w:t>Current repository code, the 86-capability inventory and analysis/live-debug-2026-10-22; historical chapters retain their dated evidence</w:t>
             </w:r>
           </w:p>
         </w:tc>
@@ -967,13 +967,19 @@
       </w:r>
     </w:p>
     <w:p>
-      <w:r>
-        <w:rPr>
-          <w:rFonts w:ascii="Calibri" w:hAnsi="Calibri" w:eastAsia="Calibri"/>
-          <w:i w:val="0"/>
-          <w:color w:val="243447"/>
-        </w:rPr>
-        <w:t>Angerona unifies Windows endpoint and network visibility, local evidence retention, case work, MITRE ATT&amp;CK mapping, governed containment, recovery, local AI assistance, and non-destructive purple-team validation. The v1.13.0 inventory discovers 84 defensive capabilities. Every capability receives a validated operational contract and health snapshot; nine declare native contracts and 75 use explicit compatibility adapters. Product version, implementation label, contract maturity, and efficacy remain separate claims.</w:t>
+      <w:pPr>
+        <w:pStyle w:val="Normal"/>
+      </w:pPr>
+      <w:r>
+        <w:t xml:space="preserve">Angerona unifies Windows endpoint and network visibility, local evidence retention, case work, MITRE ATT&amp;CK mapping, governed containment, recovery, local AI assistance, and non-destructive purple-team validation. The v1.14.0 Windows-target inventory discovers 86 defensive capabilities: 13 native operational declarations and 73 explicit compatibility adapters. Every capability receives a validated contract and health snapshot. Native declaration completeness does not establish collection, tested detection, verified response or additional execution authority. Product version, implementation label, contract maturity and efficacy remain separate claims.</w:t>
+      </w:r>
+    </w:p>
+    <w:p>
+      <w:pPr>
+        <w:pStyle w:val="Normal"/>
+      </w:pPr>
+      <w:r>
+        <w:t xml:space="preserve">Current v1.14 reference route: use docs/live-debug-harness.md for AI-assisted testing, docs/releases/v1.14-security-integration.md for the nine security workstreams and analysis/live-debug-2026-10-22 for the current issue map, observations and validation. The Live debug and AI review chapter gives current connection and operator workflows. Earlier numbered validation, performance and version-history sections retain their dated source revisions and results; they are not the current release acceptance record.</w:t>
       </w:r>
     </w:p>
     <w:tbl>
@@ -9821,17 +9827,10 @@
     </w:p>
     <w:p>
       <w:pPr>
-        <w:numPr>
-          <w:ilvl w:val="0"/>
-          <w:numId w:val="10"/>
-        </w:numPr>
-      </w:pPr>
-      <w:r>
-        <w:rPr>
-          <w:rFonts w:ascii="Calibri" w:hAnsi="Calibri" w:eastAsia="Calibri"/>
-          <w:color w:val="243447"/>
-        </w:rPr>
-        <w:t>A global per-CVE detail-worker cap remains proposed so bursts across many distinct CVEs cannot exceed the already bounded per-item UI work.</w:t>
+        <w:pStyle w:val="Normal"/>
+      </w:pPr>
+      <w:r>
+        <w:t xml:space="preserve">v1.14 now limits Threat Intelligence row-detail analysis to two active analyses per Qt application, with no waiting queue. Busy requests create no waiting worker and ask the operator to retry. Closing a window requests cancellation while the shared coordinator retains worker ownership through Qt completion. Reopening also restarts the single refresh timer. Batch and other AI paths retain separate budgets; this change does not bound OS thread-local cleanup or prove whole-application shutdown.</w:t>
       </w:r>
     </w:p>
     <w:p>
@@ -13989,6 +13988,385 @@
         <w:t>Flow windows cancel the initial AI poll when closing and reject late worker updates. These changes address confirmed blocking and lifetime bugs; they do not guarantee a maximum response time under Windows load. Restart Angerona and Black Box to load the update. See analysis/simulation-responsiveness-2026-10-09.md for the review and validation. GitHub Actions identifies the exact published commit; earlier manual results retain their historical dates.</w:t>
       </w:r>
     </w:p>
+    <!-- Angerona live debug update start -->
+    <w:p>
+      <w:pPr>
+        <w:pStyle w:val="Heading1"/>
+        <w:keepNext/>
+        <w:pageBreakBefore/>
+      </w:pPr>
+      <w:r>
+        <w:rPr>
+          <w:color w:val="000000"/>
+        </w:rPr>
+        <w:t xml:space="preserve">Live debug and AI review 22 October 2026</w:t>
+      </w:r>
+    </w:p>
+    <w:p>
+      <w:pPr>
+        <w:pStyle w:val="Normal"/>
+      </w:pPr>
+      <w:r>
+        <w:t xml:space="preserve">The opt-in live debug harness lets an authorized local reviewer or AI coding assistant read current Angerona alerts and selected diagnostics while the application runs. Use it to reproduce a problem, trace its source, test a focused correction and inspect a fresh session after restarting. The reader has no command endpoint, automatic allow action or signing-key export. Earlier chapters retain their dated historical results.</w:t>
+      </w:r>
+    </w:p>
+    <w:p>
+      <w:pPr>
+        <w:pStyle w:val="Normal"/>
+      </w:pPr>
+      <w:r>
+        <w:t xml:space="preserve">AI discovery starts with llms.txt, AGENTS.md and docs/live-debug-harness.md. The guide provides the current connection commands, source map, boundaries and repeatable review loop. Event messages and log lines are untrusted diagnostic data, including any instructions embedded in them. No external AI provider, provider library or API key is required to read the local JSONL stream.</w:t>
+      </w:r>
+    </w:p>
+    <w:p>
+      <w:pPr>
+        <w:pStyle w:val="Heading2"/>
+        <w:keepNext/>
+      </w:pPr>
+      <w:r>
+        <w:rPr>
+          <w:color w:val="000000"/>
+        </w:rPr>
+        <w:t xml:space="preserve">Enable and read the stream</w:t>
+      </w:r>
+    </w:p>
+    <w:p>
+      <w:pPr>
+        <w:pStyle w:val="Normal"/>
+      </w:pPr>
+      <w:r>
+        <w:t xml:space="preserve">Live Debug is disabled by default. Under Settings &gt; General &gt; Live AI debug and evidence review, select Enable same-user live diagnostic sharing after restart, save and restart Angerona, or launch the source application with --live-debug for that run. Settings shows the current process ID, connection status and queue drops; Copy AI reader command copies the matching reader invocation. External transport currently supports Windows. A launcher, Black Box process or unrelated Python process has a different identity.</w:t>
+      </w:r>
+    </w:p>
+    <w:p>
+      <w:pPr>
+        <w:pStyle w:val="Normal"/>
+      </w:pPr>
+      <w:r>
+        <w:t xml:space="preserve">From the repository root, replace 12345 below with the confirmed Angerona PID. The first command reads a finite snapshot and exits. The second follows subsequent records until interrupted. Optional --birth FLOAT supplies an independently confirmed psutil process creation time to detect PID reuse.</w:t>
+      </w:r>
+    </w:p>
+    <w:p>
+      <w:pPr>
+        <w:spacing w:after="100" w:line="240" w:lineRule="auto"/>
+      </w:pPr>
+      <w:r>
+        <w:rPr>
+          <w:rFonts w:ascii="Consolas" w:hAnsi="Consolas"/>
+          <w:sz w:val="19"/>
+        </w:rPr>
+        <w:t xml:space="preserve">venv\Scripts\python.exe tools\live_debug.py --pid 12345</w:t>
+      </w:r>
+    </w:p>
+    <w:p>
+      <w:pPr>
+        <w:spacing w:after="100" w:line="240" w:lineRule="auto"/>
+      </w:pPr>
+      <w:r>
+        <w:rPr>
+          <w:rFonts w:ascii="Consolas" w:hAnsi="Consolas"/>
+          <w:sz w:val="19"/>
+        </w:rPr>
+        <w:t xml:space="preserve">venv\Scripts\python.exe tools\live_debug.py --pid 12345 --follow</w:t>
+      </w:r>
+    </w:p>
+    <w:p>
+      <w:pPr>
+        <w:pStyle w:val="Normal"/>
+      </w:pPr>
+      <w:r>
+        <w:t xml:space="preserve">Create the capture's parent directory first. For a bounded local capture, add --output .tmp\live-review\events.jsonl --max-mib 8 --backups 3. Rotation affects only the reader's own capture files. Original protected Angerona evidence is retained. Black Box also provides a Live AI Review tab with PID, optional creation time and connection controls; its existing out-of-band recorder remains independent.</w:t>
+      </w:r>
+    </w:p>
+    <w:p>
+      <w:pPr>
+        <w:pStyle w:val="Normal"/>
+      </w:pPr>
+      <w:r>
+        <w:t xml:space="preserve">In v1.14.0, SpywareGuard opens from the wider black-spy button at the dashboard's top right. Header buttons adapt to window width. The intelligence window shows dated reference briefs offline and opt-in official news with source details. Modules &gt; Turn all on starts eligible modules in the background and reports held or skipped capabilities while preserving consent, Chill, shutdown and integrity gates. The floating globe identifies Core, Watchdog, Scanner and Black Box through separate colour-coded moons. Read analysis/live-debug-2026-10-22/interaction-map.md for shared-service dependencies, interference paths and the staged individual, scanner-only and combined observation matrix.</w:t>
+      </w:r>
+    </w:p>
+    <w:p>
+      <w:pPr>
+        <w:pStyle w:val="Normal"/>
+      </w:pPr>
+      <w:r>
+        <w:t xml:space="preserve">v1.14 now limits Threat Intelligence row-detail analysis to two active analyses per Qt application, with no waiting queue. Busy requests create no waiting worker and ask the operator to retry. Closing a window requests cancellation while the shared coordinator retains worker ownership through Qt completion. Reopening also restarts the single refresh timer. Batch and other AI paths retain separate budgets; this change does not bound OS thread-local cleanup or prove whole-application shutdown.</w:t>
+      </w:r>
+    </w:p>
+    <w:p>
+      <w:pPr>
+        <w:pStyle w:val="Heading2"/>
+        <w:keepNext/>
+      </w:pPr>
+      <w:r>
+        <w:rPr>
+          <w:color w:val="000000"/>
+        </w:rPr>
+        <w:t xml:space="preserve">Evidence and access boundaries</w:t>
+      </w:r>
+    </w:p>
+    <w:p>
+      <w:pPr>
+        <w:pStyle w:val="Normal"/>
+      </w:pPr>
+      <w:r>
+        <w:t xml:space="preserve">The endpoint is \\.\pipe\Angerona.LiveDebug.&lt;PID&gt;. The Windows named pipe uses first-instance protection, rejects remote clients and restricts access to the server's Windows user SID, SYSTEM and Administrators. The client verifies the expected server PID and can also verify creation time. These checks do not establish an enclave against an administrator or an attacker already controlling the same user's process.</w:t>
+      </w:r>
+    </w:p>
+    <w:p>
+      <w:pPr>
+        <w:pStyle w:val="Normal"/>
+      </w:pPr>
+      <w:r>
+        <w:t xml:space="preserve">The service copies live EventBus events after activation and fixed allowlisted diagnostic logs, including scanner, watchdog and Black Box failures. Initial tails are limited to 128 KiB per file and continue in bounded resumable chunks. Fair worker turns retain unfinished parsing, coalesce blank lines and expose gaps or collection errors. The default ingress queue holds 512 records, history retains 2,000 records and at most four clients connect. There is no replay of the complete historical EventBus ledger.</w:t>
+      </w:r>
+    </w:p>
+    <w:p>
+      <w:pPr>
+        <w:pStyle w:val="Normal"/>
+      </w:pPr>
+      <w:r>
+        <w:t xml:space="preserve">Connection metadata identifies the PID, creation time, run ID, cursor and retained range. Event, diagnostic, coverage and gap records carry sequence information; a heartbeat can repeat the current cursor. A service restart creates a new live session. Check continuity and collection errors before comparing captures. Missing, inaccessible or dropped evidence remains unknown coverage; an empty feed does not prove that the host is secure.</w:t>
+      </w:r>
+    </w:p>
+    <w:p>
+      <w:pPr>
+        <w:pStyle w:val="Normal"/>
+      </w:pPr>
+      <w:r>
+        <w:t xml:space="preserve">The producer copies allowlisted detail fields and applies best-effort secret redaction to free text. This cannot recognize every credential or private value, so review a capture before sharing it externally. Redacted exports are advisory views; they are not the original signed event or a verified response receipt. The feature does not automatically upload evidence to an AI provider.</w:t>
+      </w:r>
+    </w:p>
+    <w:p>
+      <w:pPr>
+        <w:pStyle w:val="Normal"/>
+      </w:pPr>
+      <w:r>
+        <w:t xml:space="preserve">Programmatic LiveDebugClient.connect, read and close belong to one reader worker, never the Qt thread. cancel is a fast cancellation signal; it does not close or retire pending native IO. The reader's finally block closes its client after cancellation, and the Qt owner retains its worker and thread until retirement is confirmed. A stop deadline reports pending ownership rather than destroying a running reader. Finite snapshots must reach the initial retained cursor or report incomplete coverage; --duration limits follow mode only.</w:t>
+      </w:r>
+    </w:p>
+    <w:p>
+      <w:pPr>
+        <w:pStyle w:val="Heading2"/>
+        <w:keepNext/>
+      </w:pPr>
+      <w:r>
+        <w:rPr>
+          <w:color w:val="000000"/>
+        </w:rPr>
+        <w:t xml:space="preserve">Review and validation loop</w:t>
+      </w:r>
+    </w:p>
+    <w:p>
+      <w:pPr>
+        <w:pStyle w:val="Normal"/>
+      </w:pPr>
+      <w:r>
+        <w:t xml:space="preserve">1. Confirm the checkout revision, running process identity and enabled setting. Connect and record status, queue drops, log collection errors and any gap. Reproduce the reported action using ordinary benign inputs. Keep the original evidence and Adversary Combat action receipts intact.</w:t>
+      </w:r>
+    </w:p>
+    <w:p>
+      <w:pPr>
+        <w:pStyle w:val="Normal"/>
+      </w:pPr>
+      <w:r>
+        <w:t xml:space="preserve">2. Annotate the observation locally as a supported threat, a supported false positive or unknown. Authentication establishes event provenance, not the correctness of every heuristic conclusion. A reviewer annotation never becomes an automatic allow rule, ignored alert, threshold change or response authorization.</w:t>
+      </w:r>
+    </w:p>
+    <w:p>
+      <w:pPr>
+        <w:pStyle w:val="Normal"/>
+      </w:pPr>
+      <w:r>
+        <w:t xml:space="preserve">3. Trace the evidence to the smallest responsible code path. Distinguish collection failure, configuration exposure, active detector evidence and verified action results. For a UI stall, investigate callback work and native Qt or scheduling behavior; a sampled Python stack alone does not establish a deadlock.</w:t>
+      </w:r>
+    </w:p>
+    <w:p>
+      <w:pPr>
+        <w:pStyle w:val="Normal"/>
+      </w:pPr>
+      <w:r>
+        <w:t xml:space="preserve">4. Build an isolated bounded regression using temporary data and inert events. Apply a minimally scoped fix while preserving source trust, exact target identity, signatures and response-policy checks. Do not broadly exempt a task or process because its name looks familiar. Do not exercise real containment or a hostile payload merely to test the reader.</w:t>
+      </w:r>
+    </w:p>
+    <w:p>
+      <w:pPr>
+        <w:pStyle w:val="Normal"/>
+      </w:pPr>
+      <w:r>
+        <w:t xml:space="preserve">5. Run affected tests and broaden checks across detector, event, response and GUI boundaries. Pin source-copy imports in every executing child. Record actual child identity, native exit and retained-handle retirement; job-zero and exit codes alone are insufficient. Publish reviewed completed commits through AGENTS.md, retaining failed evidence and uncertainty.</w:t>
+      </w:r>
+    </w:p>
+    <w:p>
+      <w:pPr>
+        <w:pStyle w:val="Normal"/>
+      </w:pPr>
+      <w:r>
+        <w:t xml:space="preserve">6. Restart the updated application and reconnect to the new process/session. Production code is not hot-reloaded through the debug pipe. With UGCAP enabled, intentional changes require a separately reviewed golden baseline and a clean verification before normal operation. Repeat the same benign action, compare evidence and continue while a reproducible issue remains.</w:t>
+      </w:r>
+    </w:p>
+    <w:p>
+      <w:pPr>
+        <w:pStyle w:val="Heading2"/>
+        <w:keepNext/>
+      </w:pPr>
+      <w:r>
+        <w:rPr>
+          <w:color w:val="000000"/>
+        </w:rPr>
+        <w:t xml:space="preserve">Integrity maintenance and remaining uncertainty</w:t>
+      </w:r>
+    </w:p>
+    <w:p>
+      <w:pPr>
+        <w:pStyle w:val="Normal"/>
+      </w:pPr>
+      <w:r>
+        <w:t xml:space="preserve">The October 22 callable-integrity fix replaces marshal-based fingerprints with canonical format v2. A regression exercises the exact process_allowlist.executable_sha256 callable during a concurrent file read without changing its code. The previous dump changes when a constant gains a temporary reference; v2 remains stable while still detecting changed code, constants, nested code, names, exception tables, defaults and closures. Independently approved older fingerprint manifests deliberately remain mismatched until explicitly reviewed and reapproved.</w:t>
+      </w:r>
+    </w:p>
+    <w:p>
+      <w:pPr>
+        <w:pStyle w:val="Normal"/>
+      </w:pPr>
+      <w:r>
+        <w:t xml:space="preserve">Windows state-directory ACL collection now prefers a direct read-only SID-based API audit, avoiding routine icacls subprocess startup and localized principal matching. Access denial, unsupported ACL entries and incomplete collection remain unknown health evidence. Confirmed broad write grants remain security weaknesses. Existing authenticated alert records are not rewritten or silently cleared.</w:t>
+      </w:r>
+    </w:p>
+    <w:p>
+      <w:pPr>
+        <w:pStyle w:val="Normal"/>
+      </w:pPr>
+      <w:r>
+        <w:t xml:space="preserve">These reproductions establish the corrected source behaviors. They cannot conclusively attribute an inaccessible historical alert or prove the cause of a five-second native Qt stall from screenshots. Inspect a restarted ordinary session and retain new diagnostics if the reported behavior continues. The feature and limits are documented in docs/live-debug-harness.md; current validation belongs to the reviewed source revision, not to earlier totals in this manual.</w:t>
+      </w:r>
+    </w:p>
+    <w:p>
+      <w:pPr>
+        <w:pStyle w:val="Heading2"/>
+        <w:keepNext/>
+      </w:pPr>
+      <w:r>
+        <w:rPr>
+          <w:color w:val="000000"/>
+        </w:rPr>
+        <w:t xml:space="preserve">All requested security integrations belong to v1.14</w:t>
+      </w:r>
+    </w:p>
+    <w:p>
+      <w:pPr>
+        <w:pStyle w:val="Normal"/>
+      </w:pPr>
+      <w:r>
+        <w:t xml:space="preserve">The v1.14 scope includes verified readiness, an independent witness, privilege separation, authenticated approvals, process-bound network admission, identity and browser producers, guided prevention, independent recovery and release trust with efficacy evaluation. The current acceptance register is docs/releases/v1.14-security-integration.md. It distinguishes tested implementations, ongoing integration and independently provisioned deployment requirements. Publication follows observation and bug fixes; a version label or declared feature does not establish working enforcement.</w:t>
+      </w:r>
+    </w:p>
+    <w:p>
+      <w:pPr>
+        <w:pStyle w:val="Normal"/>
+      </w:pPr>
+      <w:r>
+        <w:t xml:space="preserve">ATT&amp;CK Coverage now shows declared, collecting, detection-tested and response-verified stages. Collection requires a current registered sensor generation, completed fresh work, health of at least 90 and no unknown or reported event overflow. Stopping or replacing a producer withdraws its readiness. Scoped detection proof expires after 24 hours and response proof after one hour; clock discontinuities withdraw proof. A practice marker and its verified cleanup prove that bounded control only, not the real exploit or every technique mapped to the detector. The tested-coverage percentage is separate from the declaration count.</w:t>
+      </w:r>
+    </w:p>
+    <w:p>
+      <w:pPr>
+        <w:pStyle w:val="Normal"/>
+      </w:pPr>
+      <w:r>
+        <w:t xml:space="preserve">UGCAP &gt; Independent Witness provides opt-in enrollment and cached status for a separately administered private HTTPS witness. Its fixed endpoint must end /v1/ugcap-witness. Explicitly provision the host signing identity, exchange public enrollment and mTLS information with the separate administrator, and enroll the exact TLS leaf certificate pin plus witness Ed25519 PUBLIC PEM. Private PKI and separate host/witness signing-key roles remain required. The tools/ugcap_witness_server.py --initialize operation creates first retained state explicitly; ordinary restart cannot silently reset missing state. No external witness is deployed or configured by this update.</w:t>
+      </w:r>
+    </w:p>
+    <w:p>
+      <w:pPr>
+        <w:pStyle w:val="Normal"/>
+      </w:pPr>
+      <w:r>
+        <w:t xml:space="preserve">Applying witness settings or provisioning a host key invalidates cached assurance. Attach the enrolled vault, supply its passcode AND fresh required TPM-backed hardware proof, then complete a full UGCAP Verify now cycle. Only a fresh authenticated local checkpoint and matching enrolled witness receipt can satisfy the gate. Check witness now subsequently heartbeats an already verified checkpoint; it cannot initialize, advance, reset or reconcile a retained head. Missing or stale required witness evidence keeps the workspace held. No passcode or source contents are transmitted.</w:t>
+      </w:r>
+    </w:p>
+    <w:p>
+      <w:pPr>
+        <w:pStyle w:val="Normal"/>
+      </w:pPr>
+      <w:r>
+        <w:t xml:space="preserve">An intentional golden-baseline or vault identity change also requires separately administered witness enrollment or reconciliation. Do not disable a required witness, delete existing state or reset its head merely to obtain green status. Checkpoints expose an old valid host snapshot against an unchanged independent witness; rollback of the entire witness appliance still requires a further independent freshness floor.</w:t>
+      </w:r>
+    </w:p>
+    <w:p>
+      <w:pPr>
+        <w:pStyle w:val="Normal"/>
+      </w:pPr>
+      <w:r>
+        <w:t xml:space="preserve">Authenticated approval proofs bind an exact operation digest, a short lifetime, a nonce and an enrolled issuer/subject/key identity. Multiple labels for one operator or key do not supply multiple independent approvals. Durable revocations and pre-execution attempt records prevent stale or uncertain actions from being replayed; independent postcondition failure is recorded as verification failure. These checks govern explicitly integrated typed operations. Existing configuration paths are not all globally converted merely by importing the approval library; consult the acceptance register for remaining critical-change routing.</w:t>
+      </w:r>
+    </w:p>
+    <w:p>
+      <w:pPr>
+        <w:pStyle w:val="Normal"/>
+      </w:pPr>
+      <w:r>
+        <w:t xml:space="preserve">The installed response-service boundary is separate from the ordinary-user desktop and sensor graph. Its native pipe authenticates the actual Windows peer token and verifies the installed service before sending requests. Source Python, a caller-supplied name or a same-user bearer secret does not become privileged authority. Immutable publisher/package pins, protected state and a restricted SCM identity must be provisioned independently. The initial service surface is diagnostic only; unavailable native process-egress enforcement remains visibly unavailable. A path firewall rule or observed connection cannot prove PID-birth-bound socket admission.</w:t>
+      </w:r>
+    </w:p>
+    <w:p>
+      <w:pPr>
+        <w:pStyle w:val="Normal"/>
+      </w:pPr>
+      <w:r>
+        <w:t xml:space="preserve">Settings &gt; General and Full Setup expose separate opt-ins for local Windows session events and current-user Chromium extension manifest inventory. Identity Session Guard performs collection on its worker. Windows event access denial, log clearing, retention loss and cursor rollback remain coverage gaps. Manifests supply unverified extension IDs, versions and declared permissions; they do not prove an extension is enabled or has those permissions granted. Neither collector reads credential values, cookies, browser history or page contents. An external identity-provider connector requires a separately authenticated configured source; none is invented or enabled by default.</w:t>
+      </w:r>
+    </w:p>
+    <w:p>
+      <w:pPr>
+        <w:pStyle w:val="Normal"/>
+      </w:pPr>
+      <w:r>
+        <w:t xml:space="preserve">Open Adaptation &gt; Independent Recovery while Immutable Recovery Assurance Guard is running and the workspace has no UGCAP hold. Enroll the separately trusted recovery authority's 32-byte Ed25519 PUBLIC key in base64 form. Explicitly select the authorized local encrypted archive and its signed copy statement. Supply its original 32-byte encryption key and 32-byte proof/audit key, or leave both fields empty to request this user's existing protected recovery-drill keys. The workflow does not generate substitute keys. One-shot inputs are copied to bounded worker requests and wiped best effort; Python/Qt temporary copies cannot be fully erased.</w:t>
+      </w:r>
+    </w:p>
+    <w:p>
+      <w:pPr>
+        <w:pStyle w:val="Normal"/>
+      </w:pPr>
+      <w:r>
+        <w:t xml:space="preserve">A drill extracts the selected authenticated file inventory into a new private directory and rereads its bytes; it never overwrites the live workspace. The latest tested archive's signed revision, checked age and measured restore duration are shown separately from latest signed-copy evidence. A revision is the enrolled signer's association with that archive. The proof does not reconstruct or verify a full Git checkout or system revision. At most 16 plaintext private test directories are retained; capacity requires operator review and no automatic deletion occurs. Physical independence and survival of host loss remain separately verified deployment properties.</w:t>
+      </w:r>
+    </w:p>
+    <w:p>
+      <w:pPr>
+        <w:pStyle w:val="Normal"/>
+      </w:pPr>
+      <w:r>
+        <w:t xml:space="preserve">Recurring recovery tests require explicit consent, a previously verified selected archive and reusable original keys already in protected storage. Choose an interval from 1 through 720 hours. The existing recovery worker owns scheduling; a UGCAP hold pauses admission, and worker/process stop disables recurrence and clears queued one-shot material. Closing the panel leaves admitted work with its guard owner. Native filesystem calls cannot be forcibly preempted, so a pending cancellation cannot be reported as completed.</w:t>
+      </w:r>
+    </w:p>
+    <w:p>
+      <w:pPr>
+        <w:pStyle w:val="Normal"/>
+      </w:pPr>
+      <w:r>
+        <w:t xml:space="preserve">Guided prevention extends the adaptation review toward logging, App Control, memory integrity, vulnerable-driver blocking and Secure Boot. Each control must distinguish requested configuration from effective runtime evidence, describe compatibility and recovery, and use an enrolled typed privileged backend for mutation. Firmware changes, unreviewed App Control policies and unavailable native enforcement stay held. A changed registry value or successful command is insufficient evidence that a reboot-dependent protection is running.</w:t>
+      </w:r>
+    </w:p>
+    <w:p>
+      <w:pPr>
+        <w:pStyle w:val="Normal"/>
+      </w:pPr>
+      <w:r>
+        <w:t xml:space="preserve">For replay quality, tools/evaluate_detections.py accepts --training-cohort PATH in addition to the evaluation cohort and active/candidate packages. It rejects duplicate evaluation payloads and exact event overlap with declared training sets or rule fixtures, regardless of renamed record IDs, revisions or changed labels. It binds the resulting cohort and package digests while retaining false positives and missed detections. Synthetic replay does not prove independent label review, semantic disjointness, exclusion of undeclared training or live-host efficacy. Release signing remains behind its separately administered authority gate; the repository does not generate replacement signing identities.</w:t>
+      </w:r>
+    </w:p>
+    <w:p>
+      <w:pPr>
+        <w:pStyle w:val="Normal"/>
+      </w:pPr>
+      <w:r>
+        <w:t xml:space="preserve">The October 22 live loop also corrected two observation/closure issues. QApplication.quit can be cancelled by the dashboard's intentional close-to-tray handler, so the owned test deadline exits its Qt event loop directly and still runs normal application cleanup. Separately, the Black Box reverse animation can hide a window before final close; its standalone entry now exits only after an accepted close confirms that readers have retired. Preserve actual process exit evidence and distinguish a harness mistake from a detector failure.</w:t>
+      </w:r>
+    </w:p>
+    <!-- Angerona live debug update end -->
     <w:sectPr>
       <w:headerReference w:type="default" r:id="rId9"/>
       <w:footerReference w:type="default" r:id="rId10"/>
@@ -14125,7 +14503,7 @@
         <w:color w:val="667085"/>
         <w:sz w:val="17"/>
       </w:rPr>
-      <w:t>Angerona Suite  |  v1.13.0  |  9 October 2026</w:t>
+      <w:t>Angerona Suite  |  v1.14.0  |  22 October 2026</w:t>
     </w:r>
   </w:p>
 </w:ftr>
@@ -14165,7 +14543,7 @@
         <w:color w:val="667085"/>
         <w:sz w:val="17"/>
       </w:rPr>
-      <w:t>ANGERONA  |  MASTER MANUAL  |  v1.13.0</w:t>
+      <w:t>ANGERONA  |  MASTER MANUAL  |  v1.14.0</w:t>
     </w:r>
   </w:p>
 </w:hdr>

</xml_diff>

<commit_message>
Release v1.14.1 startup recovery and heartbeat reliability
</commit_message>
<xml_diff>
--- a/Angerona_Master_Manual.docx
+++ b/Angerona_Master_Manual.docx
@@ -112,7 +112,7 @@
           </w:tcPr>
           <w:p>
             <w:r>
-              <w:t>Current development: v1.14.0 with Live AI Review, nine integrated security workstreams, 86 discovered capabilities and the October 22 observation/acceptance register.</w:t>
+              <w:t>Current development: v1.14.1 with Live AI Review, nine integrated security workstreams, 86 discovered capabilities and the October 22 observation/acceptance register.</w:t>
             </w:r>
           </w:p>
         </w:tc>
@@ -136,7 +136,7 @@
           <w:color w:val="0B2545"/>
           <w:sz w:val="22"/>
         </w:rPr>
-        <w:t>22 October 2026</w:t>
+        <w:t>28 October 2026</w:t>
       </w:r>
     </w:p>
     <w:p>
@@ -295,7 +295,7 @@
           </w:tcPr>
           <w:p>
             <w:r>
-              <w:t>1.14.0</w:t>
+              <w:t>1.14.1</w:t>
             </w:r>
           </w:p>
         </w:tc>
@@ -341,7 +341,7 @@
           </w:tcPr>
           <w:p>
             <w:r>
-              <w:t>v1.14.0 source update. Validation is recorded in analysis/live-debug-2026-10-22; signed package and clean-VM release gates remain separate.</w:t>
+              <w:t>v1.14.1 source maintenance. Current validation: analysis/startup-storage-recovery-2026-10-28.md. Signed-package and clean-VM acceptance remain separate.</w:t>
             </w:r>
           </w:p>
         </w:tc>
@@ -499,7 +499,7 @@
                 <w:color w:val="243447"/>
                 <w:sz w:val="18"/>
               </w:rPr>
-              <w:t>Current repository code, the 86-capability inventory and analysis/live-debug-2026-10-22; historical chapters retain their dated evidence</w:t>
+              <w:t>Current repository code, the 86-capability inventory and analysis/startup-storage-recovery-2026-10-28.md; October 22 validation and historical chapters retain their dated scope.</w:t>
             </w:r>
           </w:p>
         </w:tc>
@@ -971,7 +971,7 @@
         <w:pStyle w:val="Normal"/>
       </w:pPr>
       <w:r>
-        <w:t xml:space="preserve">Angerona unifies Windows endpoint and network visibility, local evidence retention, case work, MITRE ATT&amp;CK mapping, governed containment, recovery, local AI assistance, and non-destructive purple-team validation. The v1.14.0 Windows-target inventory discovers 86 defensive capabilities: 13 native operational declarations and 73 explicit compatibility adapters. Every capability receives a validated contract and health snapshot. Native declaration completeness does not establish collection, tested detection, verified response or additional execution authority. Product version, implementation label, contract maturity and efficacy remain separate claims.</w:t>
+        <w:t xml:space="preserve">Angerona unifies Windows endpoint and network visibility, local evidence retention, case work, MITRE ATT&amp;CK mapping, governed containment, recovery, local AI assistance, and non-destructive purple-team validation. The v1.14.1 Windows-target inventory discovers 86 defensive capabilities: 13 native operational declarations and 73 explicit compatibility adapters. Every capability receives a validated contract and health snapshot. Native declaration completeness does not establish collection, tested detection, verified response or additional execution authority. Product version, implementation label, contract maturity and efficacy remain separate claims.</w:t>
       </w:r>
     </w:p>
     <w:p>
@@ -14522,7 +14522,7 @@
           <w:color w:val="000000"/>
           <w:sz w:val="22"/>
         </w:rPr>
-        <w:t xml:space="preserve">The source launcher checks canonical local paths, explicit settings, operational startup bytes, runtime/dependency consistency, storage and process exclusion. The parent uses fixed repair tools and ordered candidates; every candidate must pass fresh checks. Readiness is a nonce-bound receipt from a fresh live dashboard after its event loop responds. It does not certify sensors or response readiness. Safe Startup recovery documents the alternatives, preserved edits, private transactions, independent UI and disk budgets.</w:t>
+        <w:t xml:space="preserve">The source launcher checks canonical local paths, explicit settings, operational startup bytes, runtime/dependency consistency, storage and process exclusion. After operational verification, an independent OS Windows Forms startup dashboard paints before Python/dependency checks. It reports verification pending and protection unavailable while the parent runs checks and eligible repairs in owned background processes. A current-run first-paint receipt is separate from application readiness. The parent uses fixed repair tools and ordered candidates; every candidate must pass fresh checks. Readiness is a nonce-bound receipt from a fresh live dashboard after its event loop responds. It does not certify sensors or response readiness. Safe Startup recovery documents the alternatives, preserved edits, private transactions, independent UI and disk budgets.</w:t>
       </w:r>
     </w:p>
     <w:p>
@@ -14640,6 +14640,32 @@
           <w:sz w:val="22"/>
         </w:rPr>
         <w:t xml:space="preserve">Dashboard panels have individual Minimize / Restore buttons in their own headings. Panels start open except Module health &amp; activity, which starts minimized. There is no separate Operations group heading. Collapsing a panel hides its body while retaining its widgets and state; module lifecycle remains separate. Collapse choices apply to the current run; folded stat cards retain their current values. Critical/failed, degraded and live coverage counts remain visible, as does the CPU/RAM/network footer. Small windows can scroll.</w:t>
+      </w:r>
+    </w:p>
+    <w:p>
+      <w:pPr>
+        <w:pStyle w:val="Normal"/>
+        <w:spacing w:after="120" w:line="264" w:lineRule="auto"/>
+      </w:pPr>
+      <w:r>
+        <w:rPr>
+          <w:color w:val="000000"/>
+          <w:sz w:val="22"/>
+        </w:rPr>
+        <w:t xml:space="preserve">The compact EKG beside that footer shows Core, Watch, Scan and BlackBox. A green pulse requires a real recent heartbeat for the exact component generation. Missing, stale, disabled, starting, stopped or unavailable evidence produces a red flatline with its state retained in details. Process presence alone never produces a pulse. Click the strip or press Enter/Space for the PID, native birth-bound generation, heartbeat age, deadline and reason; additional helpers appear there when they publish actual heartbeat evidence.</w:t>
+      </w:r>
+    </w:p>
+    <w:p>
+      <w:pPr>
+        <w:pStyle w:val="Normal"/>
+        <w:spacing w:after="120" w:line="264" w:lineRule="auto"/>
+      </w:pPr>
+      <w:r>
+        <w:rPr>
+          <w:color w:val="000000"/>
+          <w:sz w:val="22"/>
+        </w:rPr>
+        <w:t xml:space="preserve">The GUI consumes only copied in-memory publications. It does not query processes, read heartbeat files or acquire native inspection locks while painting. Freshness uses monotonic time and a finite deadline of at most 120 seconds; the configured component deadline can be shorter. A replacement generation cannot reuse the preceding generation's timestamp. A pulse reports liveness, not sensor coverage, response authority or a verified security state.</w:t>
       </w:r>
     </w:p>
     <w:p>
@@ -14782,6 +14808,19 @@
           <w:color w:val="000000"/>
           <w:sz w:val="22"/>
         </w:rPr>
+        <w:t xml:space="preserve">The core-side supervisor watches the watchdog, scanner and BlackBox. The peer watchdog watches the core and shared helpers. Authenticated advancing heartbeat records, exact process generations, adoption checks, spawn exclusion and bounded backoff govern recovery. Repeated failures enter a visible safe mode rather than an unlimited process-spawn loop. An optional native watchdog requires its own deployment evidence. These peers remain within the same user-mode failure domain; they are not independent protection against a hostile administrator or kernel.</w:t>
+      </w:r>
+    </w:p>
+    <w:p>
+      <w:pPr>
+        <w:pStyle w:val="Normal"/>
+        <w:spacing w:after="120" w:line="264" w:lineRule="auto"/>
+      </w:pPr>
+      <w:r>
+        <w:rPr>
+          <w:color w:val="000000"/>
+          <w:sz w:val="22"/>
+        </w:rPr>
         <w:t xml:space="preserve">The red STOP confirmation and tray Quit use the same application-owned teardown. Closing the window hides it to the tray. On explicit operator exit, the app first durably records authenticated operator standdown. It then fences new work, AI requests and supervisor respawn, and signals a proven parent before teardown. Cleanup follows those checks before the app's own final hard exit. Queued restart requests cannot override that intent. Automatic recovery children cannot clear it. Modern automatic sign-in launch is also inhibit-only: an authenticated STOP returns quietly without opening a UI or starting repair. An explicit source launch can clear an existing authenticated stop once after full preflight, then tags its child to honor any new STOP during warmup. The intent has no age expiry. Generic startup-failure cleanup does not create operator standdown or suppress later recovery.</w:t>
       </w:r>
     </w:p>
@@ -15966,6 +16005,176 @@
                 <w:color w:val="000000"/>
                 <w:sz w:val="19"/>
               </w:rPr>
+              <w:t xml:space="preserve">Dependency timeout misclassified as broken source</w:t>
+            </w:r>
+          </w:p>
+        </w:tc>
+        <w:tc>
+          <w:tcPr>
+            <w:tcW w:w="2600" w:type="dxa"/>
+            <w:shd w:fill="F4F6F8"/>
+            <w:vAlign w:val="center"/>
+          </w:tcPr>
+          <w:p>
+            <w:pPr>
+              <w:pStyle w:val="Normal"/>
+              <w:spacing w:after="120" w:line="264" w:lineRule="auto"/>
+            </w:pPr>
+            <w:r>
+              <w:rPr>
+                <w:color w:val="000000"/>
+                <w:sz w:val="19"/>
+              </w:rPr>
+              <w:t xml:space="preserve">startup.py, tools/Invoke-AngeronaSourceStartup.ps1, tools/startup_repair_common.ps1</w:t>
+            </w:r>
+          </w:p>
+        </w:tc>
+        <w:tc>
+          <w:tcPr>
+            <w:tcW w:w="2400" w:type="dxa"/>
+            <w:shd w:fill="F4F6F8"/>
+            <w:vAlign w:val="center"/>
+          </w:tcPr>
+          <w:p>
+            <w:pPr>
+              <w:pStyle w:val="Normal"/>
+              <w:spacing w:after="120" w:line="264" w:lineRule="auto"/>
+            </w:pPr>
+            <w:r>
+              <w:rPr>
+                <w:color w:val="000000"/>
+                <w:sz w:val="19"/>
+              </w:rPr>
+              <w:t xml:space="preserve">tests/test_safe_startup.py, tests/test_source_startup_strategies.py</w:t>
+            </w:r>
+          </w:p>
+        </w:tc>
+        <w:tc>
+          <w:tcPr>
+            <w:tcW w:w="2360" w:type="dxa"/>
+            <w:shd w:fill="F4F6F8"/>
+            <w:vAlign w:val="center"/>
+          </w:tcPr>
+          <w:p>
+            <w:pPr>
+              <w:pStyle w:val="Normal"/>
+              <w:spacing w:after="120" w:line="264" w:lineRule="auto"/>
+            </w:pPr>
+            <w:r>
+              <w:rPr>
+                <w:color w:val="000000"/>
+                <w:sz w:val="19"/>
+              </w:rPr>
+              <w:t xml:space="preserve">Separate phase/overall budgets, exact disposable-tree retirement, typed infrastructure/cancellation outcomes, no source rollback from probe failure.</w:t>
+            </w:r>
+          </w:p>
+        </w:tc>
+      </w:tr>
+      <w:tr>
+        <w:trPr>
+          <w:cantSplit/>
+        </w:trPr>
+        <w:tc>
+          <w:tcPr>
+            <w:tcW w:w="2000" w:type="dxa"/>
+            <w:shd w:fill="FFFFFF"/>
+            <w:vAlign w:val="center"/>
+          </w:tcPr>
+          <w:p>
+            <w:pPr>
+              <w:pStyle w:val="Normal"/>
+              <w:spacing w:after="120" w:line="264" w:lineRule="auto"/>
+            </w:pPr>
+            <w:r>
+              <w:rPr>
+                <w:color w:val="000000"/>
+                <w:sz w:val="19"/>
+              </w:rPr>
+              <w:t xml:space="preserve">Helper presence mistaken for a real heartbeat</w:t>
+            </w:r>
+          </w:p>
+        </w:tc>
+        <w:tc>
+          <w:tcPr>
+            <w:tcW w:w="2600" w:type="dxa"/>
+            <w:shd w:fill="FFFFFF"/>
+            <w:vAlign w:val="center"/>
+          </w:tcPr>
+          <w:p>
+            <w:pPr>
+              <w:pStyle w:val="Normal"/>
+              <w:spacing w:after="120" w:line="264" w:lineRule="auto"/>
+            </w:pPr>
+            <w:r>
+              <w:rPr>
+                <w:color w:val="000000"/>
+                <w:sz w:val="19"/>
+              </w:rPr>
+              <w:t xml:space="preserve">gui/component_heartbeat.py, resilience/heartbeat.py, resilience/manager.py</w:t>
+            </w:r>
+          </w:p>
+        </w:tc>
+        <w:tc>
+          <w:tcPr>
+            <w:tcW w:w="2400" w:type="dxa"/>
+            <w:shd w:fill="FFFFFF"/>
+            <w:vAlign w:val="center"/>
+          </w:tcPr>
+          <w:p>
+            <w:pPr>
+              <w:pStyle w:val="Normal"/>
+              <w:spacing w:after="120" w:line="264" w:lineRule="auto"/>
+            </w:pPr>
+            <w:r>
+              <w:rPr>
+                <w:color w:val="000000"/>
+                <w:sz w:val="19"/>
+              </w:rPr>
+              <w:t xml:space="preserve">tests/test_component_heartbeat.py, tests/test_resilience_heartbeat_auth.py</w:t>
+            </w:r>
+          </w:p>
+        </w:tc>
+        <w:tc>
+          <w:tcPr>
+            <w:tcW w:w="2360" w:type="dxa"/>
+            <w:shd w:fill="FFFFFF"/>
+            <w:vAlign w:val="center"/>
+          </w:tcPr>
+          <w:p>
+            <w:pPr>
+              <w:pStyle w:val="Normal"/>
+              <w:spacing w:after="120" w:line="264" w:lineRule="auto"/>
+            </w:pPr>
+            <w:r>
+              <w:rPr>
+                <w:color w:val="000000"/>
+                <w:sz w:val="19"/>
+              </w:rPr>
+              <w:t xml:space="preserve">Copied memory only on Qt, exact generation and advancing evidence, finite monotonic freshness, red unavailable/stale flatline.</w:t>
+            </w:r>
+          </w:p>
+        </w:tc>
+      </w:tr>
+      <w:tr>
+        <w:trPr>
+          <w:cantSplit/>
+        </w:trPr>
+        <w:tc>
+          <w:tcPr>
+            <w:tcW w:w="2000" w:type="dxa"/>
+            <w:shd w:fill="F4F6F8"/>
+            <w:vAlign w:val="center"/>
+          </w:tcPr>
+          <w:p>
+            <w:pPr>
+              <w:pStyle w:val="Normal"/>
+              <w:spacing w:after="120" w:line="264" w:lineRule="auto"/>
+            </w:pPr>
+            <w:r>
+              <w:rPr>
+                <w:color w:val="000000"/>
+                <w:sz w:val="19"/>
+              </w:rPr>
               <w:t xml:space="preserve">Dashboard density hides context or changes operation</w:t>
             </w:r>
           </w:p>
@@ -21304,7 +21513,7 @@
           <w:color w:val="000000"/>
           <w:sz w:val="22"/>
         </w:rPr>
-        <w:t xml:space="preserve">Windows source Safe Startup tries a fixed sequence of verified alternatives and keeps an independent recovery interface available when the application cannot open. It records the failed phase, attempted actions and remaining uncertainty. Every candidate needs fresh checks and the live dashboard-ready handshake. A recovery window is not a running protection engine.</w:t>
+        <w:t xml:space="preserve">Windows source Safe Startup opens an independent native dashboard before Python and dependency checks. It then tries a fixed sequence of verified alternatives while showing the failed phase, attempted actions and remaining uncertainty. Every candidate needs fresh checks and the live dashboard-ready handshake. A recovery window is not a running protection engine.</w:t>
       </w:r>
     </w:p>
     <w:p>
@@ -21421,7 +21630,7 @@
           <w:color w:val="000000"/>
           <w:sz w:val="22"/>
         </w:rPr>
-        <w:t xml:space="preserve">The normal unelevated source supervisor can try ordinary startup, software Qt rendering, a dashboard path without the Tk startup window, and one independently verified runtime repair for a recognized runtime/dependency/native GUI failure. For a qualifying application-code failure, it can restore a retained dashboard-ready snapshot, then exact canonical GitHub HEAD or its first parent as candidates. The installed release retains its signed repair boundary. Each explicit Retry starts another bounded round; this is not an unbounded loop of downloads, child processes or writes.</w:t>
+        <w:t xml:space="preserve">After the fixed operational files are verified, the source supervisor starts the OS Windows Forms startup dashboard without importing Python, Qt or application code. It waits up to 20 seconds for a first-paint receipt tied to the exact supervisor and shell PID generations and the current run. Only then do backend checks begin. The native window remains responsive while those checks and eligible repairs run in owned background processes. Missing or unsafe reports leave it open with Verification pending / Protection unavailable.</w:t>
       </w:r>
     </w:p>
     <w:p>
@@ -21434,7 +21643,7 @@
           <w:color w:val="000000"/>
           <w:sz w:val="22"/>
         </w:rPr>
-        <w:t xml:space="preserve">Launcher admission, scratch, process-capture and monitoring failures are infrastructure holds. They do not establish an application-source defect and cannot select source rollback or runtime reinstallation. The diagnostics retain the failed phase and native result; Retry repeats the ownership checks. A genuine returned application failure remains eligible for its scoped recovery.</w:t>
+        <w:t xml:space="preserve">The shell follows bounded private status records from its own run. It closes automatically only after the supervisor verifies the real dashboard-ready handshake. A successful setup-only check does not count as an open dashboard. Retry safe startup becomes available when recovery is held. Close during checking cancels further attempts; the current bounded check may finish before the supervisor stops. Neither button executes diagnostic text or grants response authority. Closing the shell does not terminate an unrelated or possibly live engine.</w:t>
       </w:r>
     </w:p>
     <w:p>
@@ -21447,7 +21656,59 @@
           <w:color w:val="000000"/>
           <w:sz w:val="22"/>
         </w:rPr>
-        <w:t xml:space="preserve">An alive or unretired dashboard, occupied runtime, cancellation, unsafe path, missing trust, low persistent disk space or ambiguous custody stops automatic mutation. A timeout cannot justify a second engine or killing a process guessed from memory use. Independent Tk recovery has a Windows Forms fallback when verified Python/Tk is unavailable. No source program can guarantee a functioning window when the operating system and both GUI runtimes are unavailable.</w:t>
+        <w:t xml:space="preserve">If the supervisor cannot prove retirement of an owned command, it retains that command's native job/process handles and startup leases. The shell shows Process retirement requires review and disables Retry. Closing the interface cannot grant a second attempt against ambiguous process ownership.</w:t>
+      </w:r>
+    </w:p>
+    <w:p>
+      <w:pPr>
+        <w:pStyle w:val="Normal"/>
+        <w:spacing w:after="120" w:line="264" w:lineRule="auto"/>
+      </w:pPr>
+      <w:r>
+        <w:rPr>
+          <w:color w:val="000000"/>
+          <w:sz w:val="22"/>
+        </w:rPr>
+        <w:t xml:space="preserve">The normal unelevated source supervisor can try ordinary startup, software Qt rendering, a dashboard path without the Tk startup window, and one independently verified runtime repair for a recognized runtime/dependency/native GUI failure. For a qualifying application-code failure, it can restore a retained dashboard-ready snapshot, then exact canonical GitHub HEAD or its first parent as candidates. The installed release retains its signed repair boundary. Each explicit Retry starts another bounded round; this is not an unbounded loop of downloads, child processes or writes.</w:t>
+      </w:r>
+    </w:p>
+    <w:p>
+      <w:pPr>
+        <w:pStyle w:val="Normal"/>
+        <w:spacing w:after="120" w:line="264" w:lineRule="auto"/>
+      </w:pPr>
+      <w:r>
+        <w:rPr>
+          <w:color w:val="000000"/>
+          <w:sz w:val="22"/>
+        </w:rPr>
+        <w:t xml:space="preserve">Launcher admission, scratch, process-capture and monitoring failures are infrastructure outcomes. They do not establish an application-source defect and cannot select source rollback or runtime reinstallation. The diagnostics retain the failed phase and native result; Retry repeats the ownership checks. A genuine returned application failure remains eligible for its scoped recovery.</w:t>
+      </w:r>
+    </w:p>
+    <w:p>
+      <w:pPr>
+        <w:pStyle w:val="Normal"/>
+        <w:spacing w:after="120" w:line="264" w:lineRule="auto"/>
+      </w:pPr>
+      <w:r>
+        <w:rPr>
+          <w:color w:val="000000"/>
+          <w:sz w:val="22"/>
+        </w:rPr>
+        <w:t xml:space="preserve">Each disposable dependency/import probe has its own 30-second phase budget, inside a 100-second overall probe budget. Exit 85 identifies infrastructure failure, 87 identifies a timed-out disposable probe whose owned process tree was retired, and 1223 identifies cancellation. A retired probe timeout may try the independently verified path without the Tk startup window once. These outcomes do not select source rollback. Exit 1 becomes an application-code candidate only after successful probes and a verified dashboard-child failure.</w:t>
+      </w:r>
+    </w:p>
+    <w:p>
+      <w:pPr>
+        <w:pStyle w:val="Normal"/>
+        <w:spacing w:after="120" w:line="264" w:lineRule="auto"/>
+      </w:pPr>
+      <w:r>
+        <w:rPr>
+          <w:color w:val="000000"/>
+          <w:sz w:val="22"/>
+        </w:rPr>
+        <w:t xml:space="preserve">An alive or unretired dashboard, occupied runtime, cancellation, unsafe path, missing trust, low persistent disk space or ambiguous custody stops automatic mutation. Read-only source inspection and launching an already coherent runtime can coexist with another diagnostic job using that runtime; replacing the runtime or publishing changed application source still requires exclusive mutation custody. A timeout cannot justify a second engine or killing a process guessed from memory use. The native startup shell needs no Python/Tk/Qt runtime; the separate source-review interface retains its existing fallback. No source program can guarantee a functioning window when the operating system's windowing services are unavailable.</w:t>
       </w:r>
     </w:p>
     <w:p>
@@ -22526,7 +22787,7 @@
         <w:color w:val="667085"/>
         <w:sz w:val="17"/>
       </w:rPr>
-      <w:t>Angerona Suite  |  v1.14.0  |  22 October 2026</w:t>
+      <w:t>Angerona Suite  |  v1.14.1  |  28 October 2026</w:t>
     </w:r>
   </w:p>
 </w:ftr>
@@ -22566,7 +22827,7 @@
         <w:color w:val="667085"/>
         <w:sz w:val="17"/>
       </w:rPr>
-      <w:t>ANGERONA  |  MASTER MANUAL  |  v1.14.0</w:t>
+      <w:t>ANGERONA  |  MASTER MANUAL  |  v1.14.1</w:t>
     </w:r>
   </w:p>
 </w:hdr>

</xml_diff>

<commit_message>
Keep startup available when retained diagnostics fill up
Reuse bounded critical workspaces, retain native read guards through producer exit, and treat normal-startup reserve recommendations as advisory. Bound launcher output without quota-stopping a live dashboard, preserve heartbeat review position, and correct native recovery-window visibility.

Update the manual, flowchart and CI fixtures. Validate focused native lifetime/storage cases and the 151-case combined startup regression before publication.
</commit_message>
<xml_diff>
--- a/Angerona_Master_Manual.docx
+++ b/Angerona_Master_Manual.docx
@@ -14527,6 +14527,19 @@
     </w:p>
     <w:p>
       <w:pPr>
+        <w:pStyle w:val="Normal"/>
+        <w:spacing w:after="120" w:line="264" w:lineRule="auto"/>
+      </w:pPr>
+      <w:r>
+        <w:rPr>
+          <w:color w:val="000000"/>
+          <w:sz w:val="22"/>
+        </w:rPr>
+        <w:t xml:space="preserve">Windows source Safe Startup treats retained diagnostic history and recommended free-space reserves as advisory for normal dashboard startup. Critical launch work uses four reusable purposes per canonical temporary-data base, with fixed admission budgets and managed-output limits. A live producer's inherited lease prevents reuse until that producer exits. Actual private storage access, source/runtime trust and process custody remain checked; optional downloads and repairs retain their separate storage admission.</w:t>
+      </w:r>
+    </w:p>
+    <w:p>
+      <w:pPr>
         <w:pStyle w:val="Heading3"/>
         <w:keepNext/>
         <w:spacing w:after="120" w:line="264" w:lineRule="auto"/>
@@ -21656,6 +21669,19 @@
           <w:color w:val="000000"/>
           <w:sz w:val="22"/>
         </w:rPr>
+        <w:t xml:space="preserve">Each Retry admits its critical working space inside the owned attempt loop. Retained diagnostic quotas and recommended free-space reserves are advisory on this route, so another attempt does not require deleting old nonempty logs. Optional logging can degrade without changing the returned application result.</w:t>
+      </w:r>
+    </w:p>
+    <w:p>
+      <w:pPr>
+        <w:pStyle w:val="Normal"/>
+        <w:spacing w:after="120" w:line="264" w:lineRule="auto"/>
+      </w:pPr>
+      <w:r>
+        <w:rPr>
+          <w:color w:val="000000"/>
+          <w:sz w:val="22"/>
+        </w:rPr>
         <w:t xml:space="preserve">If the supervisor cannot prove retirement of an owned command, it retains that command's native job/process handles and startup leases. The shell shows Process retirement requires review and disables Retry. Closing the interface cannot grant a second attempt against ambiguous process ownership.</w:t>
       </w:r>
     </w:p>
@@ -21708,7 +21734,7 @@
           <w:color w:val="000000"/>
           <w:sz w:val="22"/>
         </w:rPr>
-        <w:t xml:space="preserve">An alive or unretired dashboard, occupied runtime, cancellation, unsafe path, missing trust, low persistent disk space or ambiguous custody stops automatic mutation. Read-only source inspection and launching an already coherent runtime can coexist with another diagnostic job using that runtime; replacing the runtime or publishing changed application source still requires exclusive mutation custody. A timeout cannot justify a second engine or killing a process guessed from memory use. The native startup shell needs no Python/Tk/Qt runtime; the separate source-review interface retains its existing fallback. No source program can guarantee a functioning window when the operating system's windowing services are unavailable.</w:t>
+        <w:t xml:space="preserve">An alive or unretired dashboard, occupied runtime, cancellation, unsafe path, missing trust, low persistent disk space or ambiguous custody stops automatic mutation. Retained diagnostic capacity and recommended reserves do not stop a normal launch with validated private critical working space. Read-only source inspection and launching an already coherent runtime can coexist with another diagnostic job using that runtime; replacing the runtime or publishing changed application source still requires exclusive mutation custody. A timeout cannot justify a second engine or killing a process guessed from memory use. The native startup shell needs no Python/Tk/Qt runtime; the separate source-review interface retains its existing fallback. No source program can guarantee a functioning window when the operating system's windowing services are unavailable.</w:t>
       </w:r>
     </w:p>
     <w:p>
@@ -22030,7 +22056,7 @@
                 <w:color w:val="000000"/>
                 <w:sz w:val="19"/>
               </w:rPr>
-              <w:t xml:space="preserve">Two ready snapshots and one preserved failed candidate at most; each archive up to 64 MiB, 4096 files, 2 MiB per file. Requires 2 GiB free reserve plus staging. Capacity holds preserve undecided edits.</w:t>
+              <w:t xml:space="preserve">Two ready snapshots and one preserved failed candidate at most; each archive up to 64 MiB, 4096 files, 2 MiB per file. New snapshot/repair work requires 2 GiB free reserve plus staging. Capacity holds preserve undecided edits.</w:t>
             </w:r>
           </w:p>
         </w:tc>
@@ -22280,7 +22306,7 @@
                 <w:color w:val="000000"/>
                 <w:sz w:val="19"/>
               </w:rPr>
-              <w:t xml:space="preserve">Startup scratch</w:t>
+              <w:t xml:space="preserve">Critical startup working space</w:t>
             </w:r>
           </w:p>
         </w:tc>
@@ -22300,7 +22326,7 @@
                 <w:color w:val="000000"/>
                 <w:sz w:val="19"/>
               </w:rPr>
-              <w:t xml:space="preserve">Only immediate named startup-temp.* attempts are inspected. Per base: at most 32 attempts, 128 files per attempt, no unknown nested directories, 256 MiB aggregate with 32 MiB reserved for a new attempt and 2 GiB free reserve. Full capacity holds; it does not erase unreviewed evidence.</w:t>
+              <w:t xml:space="preserve">Four fixed startup-temp.critical-* purpose folders per canonical base: interface, control, preflight and recovery. At most eight across the data and repository temporary bases. Admission checks each folder against a 32 MiB / 128-entry flat budget; managed output uses the remaining byte budget. Live producer leases prevent reuse. No new GUID attempt folder is needed on this route.</w:t>
             </w:r>
           </w:p>
         </w:tc>
@@ -22325,6 +22351,96 @@
                 <w:color w:val="000000"/>
                 <w:sz w:val="19"/>
               </w:rPr>
+              <w:t xml:space="preserve">Retained startup diagnostics</w:t>
+            </w:r>
+          </w:p>
+        </w:tc>
+        <w:tc>
+          <w:tcPr>
+            <w:tcW w:w="7160" w:type="dxa"/>
+            <w:shd w:fill="F4F6F8"/>
+            <w:vAlign w:val="center"/>
+          </w:tcPr>
+          <w:p>
+            <w:pPr>
+              <w:pStyle w:val="Normal"/>
+              <w:spacing w:after="120" w:line="264" w:lineRule="auto"/>
+            </w:pPr>
+            <w:r>
+              <w:rPr>
+                <w:color w:val="000000"/>
+                <w:sz w:val="19"/>
+              </w:rPr>
+              <w:t xml:space="preserve">Legacy startup-temp.* history is preserved. Its 32-attempt / 256 MiB admission policy is advisory for normal critical startup. Unknown and nonempty retained diagnostics are not swept to make room.</w:t>
+            </w:r>
+          </w:p>
+        </w:tc>
+      </w:tr>
+      <w:tr>
+        <w:trPr>
+          <w:cantSplit/>
+        </w:trPr>
+        <w:tc>
+          <w:tcPr>
+            <w:tcW w:w="2200" w:type="dxa"/>
+            <w:shd w:fill="FFFFFF"/>
+            <w:vAlign w:val="center"/>
+          </w:tcPr>
+          <w:p>
+            <w:pPr>
+              <w:pStyle w:val="Normal"/>
+              <w:spacing w:after="120" w:line="264" w:lineRule="auto"/>
+            </w:pPr>
+            <w:r>
+              <w:rPr>
+                <w:color w:val="000000"/>
+                <w:sz w:val="19"/>
+              </w:rPr>
+              <w:t xml:space="preserve">Process helper compiler</w:t>
+            </w:r>
+          </w:p>
+        </w:tc>
+        <w:tc>
+          <w:tcPr>
+            <w:tcW w:w="7160" w:type="dxa"/>
+            <w:shd w:fill="FFFFFF"/>
+            <w:vAlign w:val="center"/>
+          </w:tcPr>
+          <w:p>
+            <w:pPr>
+              <w:pStyle w:val="Normal"/>
+              <w:spacing w:after="120" w:line="264" w:lineRule="auto"/>
+            </w:pPr>
+            <w:r>
+              <w:rPr>
+                <w:color w:val="000000"/>
+                <w:sz w:val="19"/>
+              </w:rPr>
+              <w:t xml:space="preserve">Private scratch retains a 2 MiB / 120-entry content guard. Unknown compiler artifacts are preserved and can require review. Critical startup can waive the recommended drive reserve; actual compilation and private I/O still must work.</w:t>
+            </w:r>
+          </w:p>
+        </w:tc>
+      </w:tr>
+      <w:tr>
+        <w:trPr>
+          <w:cantSplit/>
+        </w:trPr>
+        <w:tc>
+          <w:tcPr>
+            <w:tcW w:w="2200" w:type="dxa"/>
+            <w:shd w:fill="F4F6F8"/>
+            <w:vAlign w:val="center"/>
+          </w:tcPr>
+          <w:p>
+            <w:pPr>
+              <w:pStyle w:val="Normal"/>
+              <w:spacing w:after="120" w:line="264" w:lineRule="auto"/>
+            </w:pPr>
+            <w:r>
+              <w:rPr>
+                <w:color w:val="000000"/>
+                <w:sz w:val="19"/>
+              </w:rPr>
               <w:t xml:space="preserve">ShadowShield file recovery</w:t>
             </w:r>
           </w:p>
@@ -22374,6 +22490,45 @@
           <w:color w:val="000000"/>
           <w:sz w:val="22"/>
         </w:rPr>
+        <w:t xml:space="preserve">Critical folders carry a private, zero-byte startup-critical.lease. Read-only lease handles remain with the parent and its explicit child producers, including the launched core, through actual exit. Reuse requires exclusive custody and removes only fixed recognized disposable outputs after per-file checks. Unknown flat files are preserved and count toward the budget; unexpected nesting, redirected paths or oversized working space cannot be silently reclaimed.</w:t>
+      </w:r>
+    </w:p>
+    <w:p>
+      <w:pPr>
+        <w:pStyle w:val="Normal"/>
+        <w:spacing w:after="120" w:line="264" w:lineRule="auto"/>
+      </w:pPr>
+      <w:r>
+        <w:rPr>
+          <w:color w:val="000000"/>
+          <w:sz w:val="22"/>
+        </w:rPr>
+        <w:t xml:space="preserve">With a validated native critical lease and actual private read/write access, normal startup can proceed below the native 2 GiB and Python 128 MiB recommended reserves. An environment variable alone grants no bypass. Optional capture is bounded by each stream's 8 MiB cap and the folder's remaining budget; drained overflow is counted without replacing the application's exit result. Source control replies retain their 64 KiB view limit. Runtime repair, installation and source preservation keep their separate capacity requirements.</w:t>
+      </w:r>
+    </w:p>
+    <w:p>
+      <w:pPr>
+        <w:pStyle w:val="Normal"/>
+        <w:spacing w:after="120" w:line="264" w:lineRule="auto"/>
+      </w:pPr>
+      <w:r>
+        <w:rPr>
+          <w:color w:val="000000"/>
+          <w:sz w:val="22"/>
+        </w:rPr>
+        <w:t xml:space="preserve">These are admission and managed-output limits, not a filesystem-enforced folder quota. The core inherits temporary-file paths; general runtime temporary-file writers are not all hard-capped and still require monitoring and retention.</w:t>
+      </w:r>
+    </w:p>
+    <w:p>
+      <w:pPr>
+        <w:pStyle w:val="Normal"/>
+        <w:spacing w:after="120" w:line="264" w:lineRule="auto"/>
+      </w:pPr>
+      <w:r>
+        <w:rPr>
+          <w:color w:val="000000"/>
+          <w:sz w:val="22"/>
+        </w:rPr>
         <w:t xml:space="preserve">These separate budgets do not cap total suite disk usage. Case evidence, protected history and pending transactions can require operator review. Use Settings &gt; System &gt; Drive space and recovery data and the storage warning to block, delete, allow or change cache policy. Do not delete evidence or keys as a generic cleanup workaround.</w:t>
       </w:r>
     </w:p>
@@ -22588,7 +22743,7 @@
     <w:p>
       <w:pPr>
         <w:pStyle w:val="Normal"/>
-        <w:spacing w:after="120" w:line="264" w:lineRule="auto"/>
+        <w:spacing w:after="0" w:line="264" w:lineRule="auto"/>
       </w:pPr>
       <w:r>
         <w:rPr>
@@ -22601,7 +22756,7 @@
     <w:p>
       <w:pPr>
         <w:pStyle w:val="Normal"/>
-        <w:spacing w:after="120" w:line="264" w:lineRule="auto"/>
+        <w:spacing w:after="0" w:line="264" w:lineRule="auto"/>
       </w:pPr>
       <w:r>
         <w:rPr>
@@ -22614,7 +22769,7 @@
     <w:p>
       <w:pPr>
         <w:pStyle w:val="Normal"/>
-        <w:spacing w:after="120" w:line="264" w:lineRule="auto"/>
+        <w:spacing w:after="0" w:line="264" w:lineRule="auto"/>
       </w:pPr>
       <w:r>
         <w:rPr>
@@ -22627,7 +22782,7 @@
     <w:p>
       <w:pPr>
         <w:pStyle w:val="Normal"/>
-        <w:spacing w:after="120" w:line="264" w:lineRule="auto"/>
+        <w:spacing w:after="0" w:line="264" w:lineRule="auto"/>
       </w:pPr>
       <w:r>
         <w:rPr>
@@ -22640,7 +22795,7 @@
     <w:p>
       <w:pPr>
         <w:pStyle w:val="Normal"/>
-        <w:spacing w:after="120" w:line="264" w:lineRule="auto"/>
+        <w:spacing w:after="0" w:line="264" w:lineRule="auto"/>
       </w:pPr>
       <w:r>
         <w:rPr>

</xml_diff>

<commit_message>
Add curated spyware tools and verified breach review in 1.14.2
</commit_message>
<xml_diff>
--- a/Angerona_Master_Manual.docx
+++ b/Angerona_Master_Manual.docx
@@ -112,7 +112,7 @@
           </w:tcPr>
           <w:p>
             <w:r>
-              <w:t>Current development: v1.14.1 with Live AI Review, nine integrated security workstreams, 86 discovered capabilities and the October 22 observation/acceptance register.</w:t>
+              <w:t>Current development: v1.14.2 with Live AI Review, nine integrated security workstreams, 86 discovered capabilities and the October 22 observation/acceptance register.</w:t>
             </w:r>
           </w:p>
         </w:tc>
@@ -136,7 +136,7 @@
           <w:color w:val="0B2545"/>
           <w:sz w:val="22"/>
         </w:rPr>
-        <w:t>28 October 2026</w:t>
+        <w:t>29 October 2026</w:t>
       </w:r>
     </w:p>
     <w:p>
@@ -295,7 +295,7 @@
           </w:tcPr>
           <w:p>
             <w:r>
-              <w:t>1.14.1</w:t>
+              <w:t>1.14.2</w:t>
             </w:r>
           </w:p>
         </w:tc>
@@ -341,7 +341,7 @@
           </w:tcPr>
           <w:p>
             <w:r>
-              <w:t>v1.14.1 source maintenance. Current validation: analysis/startup-storage-recovery-2026-10-28.md. Signed-package and clean-VM acceptance remain separate.</w:t>
+              <w:t>v1.14.2 source maintenance. Current validation: analysis/curated-tools-breach-2026-10-29.md. Signed-package and clean-VM acceptance remain separate.</w:t>
             </w:r>
           </w:p>
         </w:tc>
@@ -499,7 +499,7 @@
                 <w:color w:val="243447"/>
                 <w:sz w:val="18"/>
               </w:rPr>
-              <w:t>Current repository code, the 86-capability inventory and analysis/startup-storage-recovery-2026-10-28.md; October 22 validation and historical chapters retain their dated scope.</w:t>
+              <w:t>Current repository code, the 86-capability inventory and analysis/curated-tools-breach-2026-10-29.md; October 22 validation and historical chapters retain their dated scope.</w:t>
             </w:r>
           </w:p>
         </w:tc>
@@ -971,7 +971,7 @@
         <w:pStyle w:val="Normal"/>
       </w:pPr>
       <w:r>
-        <w:t xml:space="preserve">Angerona unifies Windows endpoint and network visibility, local evidence retention, case work, MITRE ATT&amp;CK mapping, governed containment, recovery, local AI assistance, and non-destructive purple-team validation. The v1.14.1 Windows-target inventory discovers 86 defensive capabilities: 13 native operational declarations and 73 explicit compatibility adapters. Every capability receives a validated contract and health snapshot. Native declaration completeness does not establish collection, tested detection, verified response or additional execution authority. Product version, implementation label, contract maturity and efficacy remain separate claims.</w:t>
+        <w:t xml:space="preserve">Angerona unifies Windows endpoint and network visibility, local evidence retention, case work, MITRE ATT&amp;CK mapping, governed containment, recovery, local AI assistance, and non-destructive purple-team validation. The v1.14.2 Windows-target inventory discovers 86 defensive capabilities: 13 native operational declarations and 73 explicit compatibility adapters. Every capability receives a validated contract and health snapshot. Native declaration completeness does not establish collection, tested detection, verified response or additional execution authority. Product version, implementation label, contract maturity and efficacy remain separate claims.</w:t>
       </w:r>
     </w:p>
     <w:p>
@@ -14379,7 +14379,7 @@
         <w:rPr>
           <w:color w:val="000000"/>
         </w:rPr>
-        <w:t xml:space="preserve">Security flow and dependable startup</w:t>
+        <w:t xml:space="preserve">Security flow integrations and recovery</w:t>
       </w:r>
     </w:p>
     <w:p>
@@ -14392,7 +14392,7 @@
           <w:color w:val="000000"/>
           <w:sz w:val="22"/>
         </w:rPr>
-        <w:t xml:space="preserve">Current operating guidance 28 October 2026</w:t>
+        <w:t xml:space="preserve">Current operating guidance 29 October 2026</w:t>
       </w:r>
     </w:p>
     <w:p>
@@ -14717,6 +14717,97 @@
         <w:rPr>
           <w:color w:val="000000"/>
         </w:rPr>
+        <w:t xml:space="preserve">Curated tools and priority scans</w:t>
+      </w:r>
+    </w:p>
+    <w:p>
+      <w:pPr>
+        <w:keepNext/>
+        <w:spacing w:after="120"/>
+      </w:pPr>
+      <w:r>
+        <w:drawing>
+          <wp:inline xmlns:wp="http://schemas.openxmlformats.org/drawingml/2006/wordprocessingDrawing" distT="0" distB="0" distL="0" distR="0">
+            <wp:extent cx="5943600" cy="4331398"/>
+            <wp:docPr id="9004" name="security-flow-tools.png" descr="security flow tools"/>
+            <a:graphic xmlns:a="http://schemas.openxmlformats.org/drawingml/2006/main">
+              <a:graphicData uri="http://schemas.openxmlformats.org/drawingml/2006/picture">
+                <pic:pic xmlns:pic="http://schemas.openxmlformats.org/drawingml/2006/picture">
+                  <pic:nvPicPr>
+                    <pic:cNvPr id="0" name="security-flow-tools.png"/>
+                    <pic:cNvPicPr/>
+                  </pic:nvPicPr>
+                  <pic:blipFill>
+                    <a:blip r:embed="rIdAngeronaSecurityFlow4"/>
+                    <a:stretch>
+                      <a:fillRect/>
+                    </a:stretch>
+                  </pic:blipFill>
+                  <pic:spPr>
+                    <a:xfrm>
+                      <a:off x="0" y="0"/>
+                      <a:ext cx="5943600" cy="4331398"/>
+                    </a:xfrm>
+                    <a:prstGeom prst="rect">
+                      <a:avLst/>
+                    </a:prstGeom>
+                  </pic:spPr>
+                </pic:pic>
+              </a:graphicData>
+            </a:graphic>
+          </wp:inline>
+        </w:drawing>
+      </w:r>
+    </w:p>
+    <w:p>
+      <w:pPr>
+        <w:pStyle w:val="Caption"/>
+        <w:spacing w:after="120" w:line="264" w:lineRule="auto"/>
+      </w:pPr>
+      <w:r>
+        <w:rPr>
+          <w:color w:val="000000"/>
+          <w:sz w:val="22"/>
+        </w:rPr>
+        <w:t xml:space="preserve">Figure 2 tools flow</w:t>
+      </w:r>
+    </w:p>
+    <w:p>
+      <w:pPr>
+        <w:pStyle w:val="Normal"/>
+        <w:spacing w:after="120" w:line="264" w:lineRule="auto"/>
+      </w:pPr>
+      <w:r>
+        <w:rPr>
+          <w:color w:val="000000"/>
+          <w:sz w:val="22"/>
+        </w:rPr>
+        <w:t xml:space="preserve">The GitHub Tools hub and SpywareGuard &gt; Zero Breach share one controller and the pinned Zero Breach Toolkit v0.1.10 installation. The complete engine and required notices ship with Angerona; optional restoration uses the fixed reviewed release. Third-party Python runs in a separate owned ordinary-user process, never by importing its socket-changing globals into the core or GUI. Current installed/elevated execution is held pending an accepted ordinary-user broker. The existing Source Library remains a data-only repository review path.</w:t>
+      </w:r>
+    </w:p>
+    <w:p>
+      <w:pPr>
+        <w:pStyle w:val="Normal"/>
+        <w:spacing w:after="120" w:line="264" w:lineRule="auto"/>
+      </w:pPr>
+      <w:r>
+        <w:rPr>
+          <w:color w:val="000000"/>
+          <w:sz w:val="22"/>
+        </w:rPr>
+        <w:t xml:space="preserve">Spyware Scan schedules the selected native and curated checks with visible priority, resource and privilege-coverage controls. High is the supported ceiling; REALTIME is not used. The requested 10% routine-background pace is a cadence choice, not a CPU guarantee. Critical control, heartbeat and event intake retain their cadence. Missing inputs, dependencies, privileges or measurements remain coverage gaps. Full upstream advanced execution remains held until its managed adapters are accepted. See the toolkit guide.</w:t>
+      </w:r>
+    </w:p>
+    <w:p>
+      <w:pPr>
+        <w:pStyle w:val="Heading3"/>
+        <w:keepNext/>
+        <w:spacing w:after="120" w:line="264" w:lineRule="auto"/>
+      </w:pPr>
+      <w:r>
+        <w:rPr>
+          <w:color w:val="000000"/>
+        </w:rPr>
         <w:t xml:space="preserve">5 Response authority and execution</w:t>
       </w:r>
     </w:p>
@@ -14769,7 +14860,7 @@
           <w:color w:val="000000"/>
           <w:sz w:val="22"/>
         </w:rPr>
-        <w:t xml:space="preserve">Figure 2 response flow</w:t>
+        <w:t xml:space="preserve">Figure 3 response flow</w:t>
       </w:r>
     </w:p>
     <w:p>
@@ -14808,12 +14899,51 @@
         <w:rPr>
           <w:color w:val="000000"/>
         </w:rPr>
-        <w:t xml:space="preserve">STOP and deliberate shutdown</w:t>
-      </w:r>
-    </w:p>
-    <w:p>
-      <w:pPr>
-        <w:pStyle w:val="Normal"/>
+        <w:t xml:space="preserve">Verified breach review and lockdown</w:t>
+      </w:r>
+    </w:p>
+    <w:p>
+      <w:pPr>
+        <w:keepNext/>
+        <w:spacing w:after="120"/>
+      </w:pPr>
+      <w:r>
+        <w:drawing>
+          <wp:inline xmlns:wp="http://schemas.openxmlformats.org/drawingml/2006/wordprocessingDrawing" distT="0" distB="0" distL="0" distR="0">
+            <wp:extent cx="5943600" cy="4331398"/>
+            <wp:docPr id="9005" name="security-flow-breach.png" descr="security flow breach"/>
+            <a:graphic xmlns:a="http://schemas.openxmlformats.org/drawingml/2006/main">
+              <a:graphicData uri="http://schemas.openxmlformats.org/drawingml/2006/picture">
+                <pic:pic xmlns:pic="http://schemas.openxmlformats.org/drawingml/2006/picture">
+                  <pic:nvPicPr>
+                    <pic:cNvPr id="0" name="security-flow-breach.png"/>
+                    <pic:cNvPicPr/>
+                  </pic:nvPicPr>
+                  <pic:blipFill>
+                    <a:blip r:embed="rIdAngeronaSecurityFlow5"/>
+                    <a:stretch>
+                      <a:fillRect/>
+                    </a:stretch>
+                  </pic:blipFill>
+                  <pic:spPr>
+                    <a:xfrm>
+                      <a:off x="0" y="0"/>
+                      <a:ext cx="5943600" cy="4331398"/>
+                    </a:xfrm>
+                    <a:prstGeom prst="rect">
+                      <a:avLst/>
+                    </a:prstGeom>
+                  </pic:spPr>
+                </pic:pic>
+              </a:graphicData>
+            </a:graphic>
+          </wp:inline>
+        </w:drawing>
+      </w:r>
+    </w:p>
+    <w:p>
+      <w:pPr>
+        <w:pStyle w:val="Caption"/>
         <w:spacing w:after="120" w:line="264" w:lineRule="auto"/>
       </w:pPr>
       <w:r>
@@ -14821,7 +14951,7 @@
           <w:color w:val="000000"/>
           <w:sz w:val="22"/>
         </w:rPr>
-        <w:t xml:space="preserve">The core-side supervisor watches the watchdog, scanner and BlackBox. The peer watchdog watches the core and shared helpers. Authenticated advancing heartbeat records, exact process generations, adoption checks, spawn exclusion and bounded backoff govern recovery. Repeated failures enter a visible safe mode rather than an unlimited process-spawn loop. An optional native watchdog requires its own deployment evidence. These peers remain within the same user-mode failure domain; they are not independent protection against a hostile administrator or kernel.</w:t>
+        <w:t xml:space="preserve">Figure 4 breach flow</w:t>
       </w:r>
     </w:p>
     <w:p>
@@ -14834,189 +14964,7 @@
           <w:color w:val="000000"/>
           <w:sz w:val="22"/>
         </w:rPr>
-        <w:t xml:space="preserve">The red STOP confirmation and tray Quit use the same application-owned teardown. Closing the window hides it to the tray. On explicit operator exit, the app first durably records authenticated operator standdown. It then fences new work, AI requests and supervisor respawn, and signals a proven parent before teardown. Cleanup follows those checks before the app's own final hard exit. Queued restart requests cannot override that intent. Automatic recovery children cannot clear it. Modern automatic sign-in launch is also inhibit-only: an authenticated STOP returns quietly without opening a UI or starting repair. An explicit source launch can clear an existing authenticated stop once after full preflight, then tags its child to honor any new STOP during warmup. The intent has no age expiry. Generic startup-failure cleanup does not create operator standdown or suppress later recovery.</w:t>
-      </w:r>
-    </w:p>
-    <w:p>
-      <w:pPr>
-        <w:pStyle w:val="Normal"/>
-        <w:spacing w:after="120" w:line="264" w:lineRule="auto"/>
-      </w:pPr>
-      <w:r>
-        <w:rPr>
-          <w:color w:val="000000"/>
-          <w:sz w:val="22"/>
-        </w:rPr>
-        <w:t xml:space="preserve">If the primary stop record cannot be saved, cleanup does not begin and the window stays open with the failure. If the native-parent bridge fails after the local record was saved, exit is held and the app can be partly paused. Follow the reported free-space/permission correction and retry STOP.</w:t>
-      </w:r>
-    </w:p>
-    <w:p>
-      <w:pPr>
-        <w:pStyle w:val="Normal"/>
-        <w:spacing w:after="120" w:line="264" w:lineRule="auto"/>
-      </w:pPr>
-      <w:r>
-        <w:rPr>
-          <w:color w:val="000000"/>
-          <w:sz w:val="22"/>
-        </w:rPr>
-        <w:t xml:space="preserve">Cleanup has a bounded 30-second wait before the app's own hard exit. Direct Black Box and AI retirement precede supervisor/healer and module/storage drains. Windows helpers use retained owned Jobs; adopted helpers require exact native PID/birth/image and validated redirector lineage. Resilience Jobs preserve crash recovery when an owner handle closes; explicit STOP retires proven owned work. Ollama Jobs also stop their owned runners on close. Ownership failures remain explicit rather than authorizing a broad kill. POSIX retains its prior process/API cleanup and was outside this native tree-custody validation.</w:t>
-      </w:r>
-    </w:p>
-    <w:p>
-      <w:pPr>
-        <w:pStyle w:val="Normal"/>
-        <w:spacing w:after="120" w:line="264" w:lineRule="auto"/>
-      </w:pPr>
-      <w:r>
-        <w:rPr>
-          <w:color w:val="000000"/>
-          <w:sz w:val="22"/>
-        </w:rPr>
-        <w:t xml:space="preserve">The app requests unloading of resident app-selected Ollama models. A shared pre-existing daemon stays running; an unload request for a shared model can affect another app using that model. Downloaded model weights remain on disk. No broad process-name or Python-root kill is authorized, and a late startup task cannot bypass the shutdown fence.</w:t>
-      </w:r>
-    </w:p>
-    <w:p>
-      <w:pPr>
-        <w:pStyle w:val="Normal"/>
-        <w:spacing w:after="120" w:line="264" w:lineRule="auto"/>
-      </w:pPr>
-      <w:r>
-        <w:rPr>
-          <w:color w:val="000000"/>
-          <w:sz w:val="22"/>
-        </w:rPr>
-        <w:t xml:space="preserve">The durable ipc/standdown.cmd uses a dedicated protected shutdown.key and HMAC verification. These user-mode controls do not grant kernel authority. Source rollback candidates must satisfy the operator-STOP compatibility floor; that floor is not a trust baseline or signing authority. A local native build or source test does not establish release acceptance. Release binaries still need rebuilding, signing and deployment acceptance; this guide does not claim an already accepted release binary contains these changes. Legacy installed startup retains its older route until rebuilt and accepted.</w:t>
-      </w:r>
-    </w:p>
-    <w:p>
-      <w:pPr>
-        <w:pStyle w:val="Heading3"/>
-        <w:keepNext/>
-        <w:spacing w:after="120" w:line="264" w:lineRule="auto"/>
-      </w:pPr>
-      <w:r>
-        <w:rPr>
-          <w:color w:val="000000"/>
-        </w:rPr>
-        <w:t xml:space="preserve">6 Persistence and capacity</w:t>
-      </w:r>
-    </w:p>
-    <w:p>
-      <w:pPr>
-        <w:pStyle w:val="Normal"/>
-        <w:spacing w:after="120" w:line="264" w:lineRule="auto"/>
-      </w:pPr>
-      <w:r>
-        <w:rPr>
-          <w:color w:val="000000"/>
-          <w:sz w:val="22"/>
-        </w:rPr>
-        <w:t xml:space="preserve">Runtime configuration, IPC keys, approved baselines, authenticated event history, quarantine originals, forensic cases and recovery transactions are separate data classes. Retention must distinguish protected originals from disposable logs, scratch and caches. Bounded readers, archive expansion limits, queues, caches and worker budgets reduce resource exhaustion; explicit loss states preserve the limit's effect on coverage.</w:t>
-      </w:r>
-    </w:p>
-    <w:p>
-      <w:pPr>
-        <w:pStyle w:val="Normal"/>
-        <w:spacing w:after="120" w:line="264" w:lineRule="auto"/>
-      </w:pPr>
-      <w:r>
-        <w:rPr>
-          <w:color w:val="000000"/>
-          <w:sz w:val="22"/>
-        </w:rPr>
-        <w:t xml:space="preserve">ShadowShield file recovery uses cache admission, configurable size and free-space reserve controls in Settings &gt; System &gt; Drive space and recovery data. Startup source backups have their own bounded private quota and never become security baselines. Diagnostics rotate; unknown interrupted transactions and unreviewed source edits are preserved and can hold recovery. An operator can block future cache creation, delete selected copies, or change policy. Deletion permanently removes the selected restore points.</w:t>
-      </w:r>
-    </w:p>
-    <w:p>
-      <w:pPr>
-        <w:pStyle w:val="Heading3"/>
-        <w:keepNext/>
-        <w:spacing w:after="120" w:line="264" w:lineRule="auto"/>
-      </w:pPr>
-      <w:r>
-        <w:rPr>
-          <w:color w:val="000000"/>
-        </w:rPr>
-        <w:t xml:space="preserve">7 Independent trust and recovery</w:t>
-      </w:r>
-    </w:p>
-    <w:p>
-      <w:pPr>
-        <w:pStyle w:val="Normal"/>
-        <w:spacing w:after="120" w:line="264" w:lineRule="auto"/>
-      </w:pPr>
-      <w:r>
-        <w:rPr>
-          <w:color w:val="000000"/>
-          <w:sz w:val="22"/>
-        </w:rPr>
-        <w:t xml:space="preserve">UGCAP requires explicit known-clean vault enrollment and supports selected-path review/recovery. Strict startup and the rotating local mesh depend on their freshness and custody gates. An independent witness needs separately deployed authority, enrolled identity, mTLS and certificate/signing pins; a local process or deleting retained witness state is not an independent failure domain.</w:t>
-      </w:r>
-    </w:p>
-    <w:p>
-      <w:pPr>
-        <w:pStyle w:val="Normal"/>
-        <w:spacing w:after="120" w:line="264" w:lineRule="auto"/>
-      </w:pPr>
-      <w:r>
-        <w:rPr>
-          <w:color w:val="000000"/>
-          <w:sz w:val="22"/>
-        </w:rPr>
-        <w:t xml:space="preserve">Release integrity validates the approved installed payload and publisher chain. Source recovery verifies exact candidates but cannot confer signed installed authority. A writable batch trust anchor, a Python integrity check or a private HMAC key in the same compromised user context cannot make the suite immune to that attacker. Recovery never silently enrolls changed files into UGCAP.</w:t>
-      </w:r>
-    </w:p>
-    <w:p>
-      <w:pPr>
-        <w:pStyle w:val="Heading3"/>
-        <w:keepNext/>
-        <w:spacing w:after="120" w:line="264" w:lineRule="auto"/>
-      </w:pPr>
-      <w:r>
-        <w:rPr>
-          <w:color w:val="000000"/>
-        </w:rPr>
-        <w:t xml:space="preserve">8 Ring 3 and platform limits</w:t>
-      </w:r>
-    </w:p>
-    <w:p>
-      <w:pPr>
-        <w:pStyle w:val="Normal"/>
-        <w:spacing w:after="120" w:line="264" w:lineRule="auto"/>
-      </w:pPr>
-      <w:r>
-        <w:rPr>
-          <w:color w:val="000000"/>
-          <w:sz w:val="22"/>
-        </w:rPr>
-        <w:t xml:space="preserve">The desktop/source application runs in user mode, commonly called Ring 3. Administrator/UAC authority remains user mode. Supported OS interfaces can provide kernel-originated data or authorized enforcement, but availability, privilege and driver/service deployment must be established separately. Angerona ships no production kernel driver and promises no control over a hostile kernel, hypervisor, firmware, compromised OS or hostile administrator. Microsoft describes user and kernel execution and Windows security boundaries.</w:t>
-      </w:r>
-    </w:p>
-    <w:p>
-      <w:pPr>
-        <w:pStyle w:val="Normal"/>
-        <w:spacing w:after="120" w:line="264" w:lineRule="auto"/>
-      </w:pPr>
-      <w:r>
-        <w:rPr>
-          <w:color w:val="000000"/>
-          <w:sz w:val="22"/>
-        </w:rPr>
-        <w:t xml:space="preserve">Kernel integrity, Secure Boot, supported OS security, trusted backups and independent authorities complement the application. On macOS/Linux, module platform gates and Observe scope remain visible; optional Linux eBPF is a separately configured capability, not a blanket parity claim.</w:t>
-      </w:r>
-    </w:p>
-    <w:p>
-      <w:pPr>
-        <w:pStyle w:val="Heading3"/>
-        <w:keepNext/>
-        <w:spacing w:after="120" w:line="264" w:lineRule="auto"/>
-      </w:pPr>
-      <w:r>
-        <w:rPr>
-          <w:color w:val="000000"/>
-        </w:rPr>
-        <w:t xml:space="preserve">9 Network and extension boundaries</w:t>
+        <w:t xml:space="preserve">The red/orange Breached state requires fresh manager-enrolled native LIVE evidence, a registered current producer, an exact response contract and explicit active-attack or active-exploitation evidence. Health failures, exposure, practice markers, remote Observe events, raw critical severity and third-party findings alone cannot create it. An explicit spyware_confirmed=False remains uncertainty. A bounded case identity links the latched brand warning, critical report, border state and after-action review. The threat card and footer project Compromised for the active case while preserving the engine's underlying scores and counts. Displaying a breach grants no response authority.</w:t>
       </w:r>
     </w:p>
     <w:tbl>
@@ -15064,7 +15012,7 @@
                 <w:color w:val="000000"/>
                 <w:sz w:val="19"/>
               </w:rPr>
-              <w:t xml:space="preserve">Path</w:t>
+              <w:t xml:space="preserve">Next step</w:t>
             </w:r>
           </w:p>
         </w:tc>
@@ -15085,7 +15033,7 @@
                 <w:color w:val="000000"/>
                 <w:sz w:val="19"/>
               </w:rPr>
-              <w:t xml:space="preserve">Data and authority boundary</w:t>
+              <w:t xml:space="preserve">Behavior and boundary</w:t>
             </w:r>
           </w:p>
         </w:tc>
@@ -15110,7 +15058,7 @@
                 <w:color w:val="000000"/>
                 <w:sz w:val="19"/>
               </w:rPr>
-              <w:t xml:space="preserve">Source recovery</w:t>
+              <w:t xml:space="preserve">Investigate</w:t>
             </w:r>
           </w:p>
         </w:tc>
@@ -15130,7 +15078,7 @@
                 <w:color w:val="000000"/>
                 <w:sz w:val="19"/>
               </w:rPr>
-              <w:t xml:space="preserve">Fixed canonical GitHub commit/tree/archive or pinned blob HTTPS reads. No host evidence/failed-edit uploads. GitHub sees ordinary request metadata. Optional GitHub setting and master recovery control apply.</w:t>
+              <w:t xml:space="preserve">Opens the case and retained report for read-only review.</w:t>
             </w:r>
           </w:p>
         </w:tc>
@@ -15155,7 +15103,7 @@
                 <w:color w:val="000000"/>
                 <w:sz w:val="19"/>
               </w:rPr>
-              <w:t xml:space="preserve">Runtime repair</w:t>
+              <w:t xml:space="preserve">Trace</w:t>
             </w:r>
           </w:p>
         </w:tc>
@@ -15175,7 +15123,7 @@
                 <w:color w:val="000000"/>
                 <w:sz w:val="19"/>
               </w:rPr>
-              <w:t xml:space="preserve">Reviewed signed PSF Python and hash-locked dependencies; successful download does not bypass runtime/source/readiness gates.</w:t>
+              <w:t xml:space="preserve">Follows the case's process, network and evidence context without mutation.</w:t>
             </w:r>
           </w:p>
         </w:tc>
@@ -15200,7 +15148,7 @@
                 <w:color w:val="000000"/>
                 <w:sz w:val="19"/>
               </w:rPr>
-              <w:t xml:space="preserve">Local AI</w:t>
+              <w:t xml:space="preserve">Isolate</w:t>
             </w:r>
           </w:p>
         </w:tc>
@@ -15220,7 +15168,7 @@
                 <w:color w:val="000000"/>
                 <w:sz w:val="19"/>
               </w:rPr>
-              <w:t xml:space="preserve">Explicit configured local endpoint and integrity/privacy gates. SentinelLens narrative has a strict loopback boundary; no cloud fallback. Manual consultation needs preview/Send.</w:t>
+              <w:t xml:space="preserve">Requests host network lockdown only with current evidence, its original host-scope contract, saved policy and verified signed installed Protect/Administrator authority.</w:t>
             </w:r>
           </w:p>
         </w:tc>
@@ -15245,7 +15193,7 @@
                 <w:color w:val="000000"/>
                 <w:sz w:val="19"/>
               </w:rPr>
-              <w:t xml:space="preserve">Intelligence/news/research</w:t>
+              <w:t xml:space="preserve">Kill</w:t>
             </w:r>
           </w:p>
         </w:tc>
@@ -15265,7 +15213,7 @@
                 <w:color w:val="000000"/>
                 <w:sz w:val="19"/>
               </w:rPr>
-              <w:t xml:space="preserve">Per-feature opt-in/configured source rules. Imported URLs and retrieved prose are data, never executable repair or response instructions.</w:t>
+              <w:t xml:space="preserve">Requires an exact current process target, its permitted action and the same response authority; confirmation cannot create a missing contract.</w:t>
             </w:r>
           </w:p>
         </w:tc>
@@ -15290,7 +15238,7 @@
                 <w:color w:val="000000"/>
                 <w:sz w:val="19"/>
               </w:rPr>
-              <w:t xml:space="preserve">Witness and fleet</w:t>
+              <w:t xml:space="preserve">Patch</w:t>
             </w:r>
           </w:p>
         </w:tc>
@@ -15310,7 +15258,7 @@
                 <w:color w:val="000000"/>
                 <w:sz w:val="19"/>
               </w:rPr>
-              <w:t xml:space="preserve">Separate enrolled remote authority, endpoint authentication and typed schema. Disabled/unavailable deployment stays a gap.</w:t>
+              <w:t xml:space="preserve">Disabled when no reviewed patch operation is bound to this evidence; report text cannot become a command.</w:t>
             </w:r>
           </w:p>
         </w:tc>
@@ -15335,7 +15283,7 @@
                 <w:color w:val="000000"/>
                 <w:sz w:val="19"/>
               </w:rPr>
-              <w:t xml:space="preserve">Live Debug and engine IPC</w:t>
+              <w:t xml:space="preserve">Lift Lockdown</w:t>
             </w:r>
           </w:p>
         </w:tc>
@@ -15355,7 +15303,378 @@
                 <w:color w:val="000000"/>
                 <w:sz w:val="19"/>
               </w:rPr>
-              <w:t xml:space="preserve">Authenticated bounded local records and typed controls. Read-only review cannot authorize mutation. Shared user context remains part of the threat model.</w:t>
+              <w:t xml:space="preserve">Removes only verified Angerona-managed lockdown rules through authenticated Undo and absence checks; unrelated policy and preferences remain.</w:t>
+            </w:r>
+          </w:p>
+        </w:tc>
+      </w:tr>
+    </w:tbl>
+    <w:p>
+      <w:pPr>
+        <w:pStyle w:val="Normal"/>
+        <w:spacing w:after="120" w:line="264" w:lineRule="auto"/>
+      </w:pPr>
+      <w:r>
+        <w:rPr>
+          <w:color w:val="000000"/>
+          <w:sz w:val="22"/>
+        </w:rPr>
+        <w:t xml:space="preserve"/>
+      </w:r>
+    </w:p>
+    <w:p>
+      <w:pPr>
+        <w:pStyle w:val="Normal"/>
+        <w:spacing w:after="120" w:line="264" w:lineRule="auto"/>
+      </w:pPr>
+      <w:r>
+        <w:rPr>
+          <w:color w:val="000000"/>
+          <w:sz w:val="22"/>
+        </w:rPr>
+        <w:t xml:space="preserve">The automatic-lockdown preference defaults on, but mutation still goes through the existing Adversary Combat worker and its full policy, deployment and journal checks. Current source Observe controls show HELD with their reason. There is no accepted signed release implied by these implemented source controls.</w:t>
+      </w:r>
+    </w:p>
+    <w:p>
+      <w:pPr>
+        <w:pStyle w:val="Normal"/>
+        <w:spacing w:after="120" w:line="264" w:lineRule="auto"/>
+      </w:pPr>
+      <w:r>
+        <w:rPr>
+          <w:color w:val="000000"/>
+          <w:sz w:val="22"/>
+        </w:rPr>
+        <w:t xml:space="preserve">The requested network scope covers Ethernet, Wi-Fi and other interfaces; IPv4/IPv6, inbound/outbound traffic, all protocols and ports. The adapter must verify rule scope, enabled profiles and effective-policy prerequisites before it can report containment. Unknown enterprise policy or ambiguous readback remains held or unverified. Rule configuration and an authenticated receipt do not prove packet drops, kernel integrity or resistance to a hostile administrator.</w:t>
+      </w:r>
+    </w:p>
+    <w:p>
+      <w:pPr>
+        <w:pStyle w:val="Normal"/>
+        <w:spacing w:after="120" w:line="264" w:lineRule="auto"/>
+      </w:pPr>
+      <w:r>
+        <w:rPr>
+          <w:color w:val="000000"/>
+          <w:sz w:val="22"/>
+        </w:rPr>
+        <w:t xml:space="preserve">On Windows, the fixed owned query reads Domain, Private and Public profiles from Get-NetFirewallProfile -PolicyStore ActiveStore and checks INetFwPolicy2.LocalPolicyModifyState. Every required enabled-profile, local-rule-merge and inbound-rule setting must be explicit, with no excluded interfaces. Unknown or NotConfigured results remain held; the adapter preserves the existing policy. Microsoft documents the ActiveStore profile query and the read-only local-policy modification state.</w:t>
+      </w:r>
+    </w:p>
+    <w:p>
+      <w:pPr>
+        <w:pStyle w:val="Normal"/>
+        <w:spacing w:after="120" w:line="264" w:lineRule="auto"/>
+      </w:pPr>
+      <w:r>
+        <w:rPr>
+          <w:color w:val="000000"/>
+          <w:sz w:val="22"/>
+        </w:rPr>
+        <w:t xml:space="preserve">Lift requires the exact managed receipt and verified removal. A saved bounded case decision prevents automatic relocking of that same lifted case; a new case can request containment again. Lifting restrictions does not erase the breach evidence or resolve the red review state. Review resolved remains separate. STOP does not automatically remove persistent lockdown rules.</w:t>
+      </w:r>
+    </w:p>
+    <w:p>
+      <w:pPr>
+        <w:pStyle w:val="Normal"/>
+        <w:spacing w:after="120" w:line="264" w:lineRule="auto"/>
+      </w:pPr>
+      <w:r>
+        <w:rPr>
+          <w:color w:val="000000"/>
+          <w:sz w:val="22"/>
+        </w:rPr>
+        <w:t xml:space="preserve">If isolation removes remote access, use the local console or an approved out-of-band administration route. Prefer the report's Lift Lockdown control. If Angerona cannot open, review Windows Defender Firewall with Advanced Security locally and match the exact rule names to the retained authenticated action receipt before changing only those rules. Preserve the case and receipt; a matching name prefix alone is insufficient. Do not reset the whole firewall, disable protection or remove unrelated rules as a recovery shortcut. Missing or ambiguous receipts require reviewed OS administration rather than a guessed Undo.</w:t>
+      </w:r>
+    </w:p>
+    <w:p>
+      <w:pPr>
+        <w:pStyle w:val="Heading3"/>
+        <w:keepNext/>
+        <w:spacing w:after="120" w:line="264" w:lineRule="auto"/>
+      </w:pPr>
+      <w:r>
+        <w:rPr>
+          <w:color w:val="000000"/>
+        </w:rPr>
+        <w:t xml:space="preserve">STOP and deliberate shutdown</w:t>
+      </w:r>
+    </w:p>
+    <w:p>
+      <w:pPr>
+        <w:pStyle w:val="Normal"/>
+        <w:spacing w:after="120" w:line="264" w:lineRule="auto"/>
+      </w:pPr>
+      <w:r>
+        <w:rPr>
+          <w:color w:val="000000"/>
+          <w:sz w:val="22"/>
+        </w:rPr>
+        <w:t xml:space="preserve">The core-side supervisor watches the watchdog, scanner and BlackBox. The peer watchdog watches the core and shared helpers. Authenticated advancing heartbeat records, exact process generations, adoption checks, spawn exclusion and bounded backoff govern recovery. Repeated failures enter a visible safe mode rather than an unlimited process-spawn loop. An optional native watchdog requires its own deployment evidence. These peers remain within the same user-mode failure domain; they are not independent protection against a hostile administrator or kernel.</w:t>
+      </w:r>
+    </w:p>
+    <w:p>
+      <w:pPr>
+        <w:pStyle w:val="Normal"/>
+        <w:spacing w:after="120" w:line="264" w:lineRule="auto"/>
+      </w:pPr>
+      <w:r>
+        <w:rPr>
+          <w:color w:val="000000"/>
+          <w:sz w:val="22"/>
+        </w:rPr>
+        <w:t xml:space="preserve">The red STOP confirmation and tray Quit use the same application-owned teardown. Closing the window hides it to the tray. On explicit operator exit, the app first durably records authenticated operator standdown. It then fences new work, AI requests and supervisor respawn, and signals a proven parent before teardown. Cleanup follows those checks before the app's own final hard exit. Queued restart requests cannot override that intent. Automatic recovery children cannot clear it. Modern automatic sign-in launch is also inhibit-only: an authenticated STOP returns quietly without opening a UI or starting repair. An explicit source launch can clear an existing authenticated stop once after full preflight, then tags its child to honor any new STOP during warmup. The intent has no age expiry. Generic startup-failure cleanup does not create operator standdown or suppress later recovery.</w:t>
+      </w:r>
+    </w:p>
+    <w:p>
+      <w:pPr>
+        <w:pStyle w:val="Normal"/>
+        <w:spacing w:after="120" w:line="264" w:lineRule="auto"/>
+      </w:pPr>
+      <w:r>
+        <w:rPr>
+          <w:color w:val="000000"/>
+          <w:sz w:val="22"/>
+        </w:rPr>
+        <w:t xml:space="preserve">If the primary stop record cannot be saved, cleanup does not begin and the window stays open with the failure. If the native-parent bridge fails after the local record was saved, exit is held and the app can be partly paused. Follow the reported free-space/permission correction and retry STOP.</w:t>
+      </w:r>
+    </w:p>
+    <w:p>
+      <w:pPr>
+        <w:pStyle w:val="Normal"/>
+        <w:spacing w:after="120" w:line="264" w:lineRule="auto"/>
+      </w:pPr>
+      <w:r>
+        <w:rPr>
+          <w:color w:val="000000"/>
+          <w:sz w:val="22"/>
+        </w:rPr>
+        <w:t xml:space="preserve">Cleanup has a bounded 30-second wait before the app's own hard exit. Direct Black Box and AI retirement precede supervisor/healer and module/storage drains. Windows helpers use retained owned Jobs; adopted helpers require exact native PID/birth/image and validated redirector lineage. Resilience Jobs preserve crash recovery when an owner handle closes; explicit STOP retires proven owned work. Ollama Jobs also stop their owned runners on close. Ownership failures remain explicit rather than authorizing a broad kill. POSIX retains its prior process/API cleanup and was outside this native tree-custody validation.</w:t>
+      </w:r>
+    </w:p>
+    <w:p>
+      <w:pPr>
+        <w:pStyle w:val="Normal"/>
+        <w:spacing w:after="120" w:line="264" w:lineRule="auto"/>
+      </w:pPr>
+      <w:r>
+        <w:rPr>
+          <w:color w:val="000000"/>
+          <w:sz w:val="22"/>
+        </w:rPr>
+        <w:t xml:space="preserve">The app requests unloading of resident app-selected Ollama models. A shared pre-existing daemon stays running; an unload request for a shared model can affect another app using that model. Downloaded model weights remain on disk. No broad process-name or Python-root kill is authorized, and a late startup task cannot bypass the shutdown fence.</w:t>
+      </w:r>
+    </w:p>
+    <w:p>
+      <w:pPr>
+        <w:pStyle w:val="Normal"/>
+        <w:spacing w:after="120" w:line="264" w:lineRule="auto"/>
+      </w:pPr>
+      <w:r>
+        <w:rPr>
+          <w:color w:val="000000"/>
+          <w:sz w:val="22"/>
+        </w:rPr>
+        <w:t xml:space="preserve">The durable ipc/standdown.cmd uses a dedicated protected shutdown.key and HMAC verification. These user-mode controls do not grant kernel authority. Source rollback candidates must satisfy the operator-STOP compatibility floor; that floor is not a trust baseline or signing authority. A local native build or source test does not establish release acceptance. Release binaries still need rebuilding, signing and deployment acceptance; this guide does not claim an already accepted release binary contains these changes. Legacy installed startup retains its older route until rebuilt and accepted.</w:t>
+      </w:r>
+    </w:p>
+    <w:p>
+      <w:pPr>
+        <w:pStyle w:val="Heading3"/>
+        <w:keepNext/>
+        <w:spacing w:after="120" w:line="264" w:lineRule="auto"/>
+      </w:pPr>
+      <w:r>
+        <w:rPr>
+          <w:color w:val="000000"/>
+        </w:rPr>
+        <w:t xml:space="preserve">6 Persistence and capacity</w:t>
+      </w:r>
+    </w:p>
+    <w:p>
+      <w:pPr>
+        <w:pStyle w:val="Normal"/>
+        <w:spacing w:after="120" w:line="264" w:lineRule="auto"/>
+      </w:pPr>
+      <w:r>
+        <w:rPr>
+          <w:color w:val="000000"/>
+          <w:sz w:val="22"/>
+        </w:rPr>
+        <w:t xml:space="preserve">Runtime configuration, IPC keys, approved baselines, authenticated event history, quarantine originals, forensic cases and recovery transactions are separate data classes. Retention must distinguish protected originals from disposable logs, scratch and caches. Bounded readers, archive expansion limits, queues, caches and worker budgets reduce resource exhaustion; explicit loss states preserve the limit's effect on coverage.</w:t>
+      </w:r>
+    </w:p>
+    <w:p>
+      <w:pPr>
+        <w:pStyle w:val="Normal"/>
+        <w:spacing w:after="120" w:line="264" w:lineRule="auto"/>
+      </w:pPr>
+      <w:r>
+        <w:rPr>
+          <w:color w:val="000000"/>
+          <w:sz w:val="22"/>
+        </w:rPr>
+        <w:t xml:space="preserve">ShadowShield file recovery uses cache admission, configurable size and free-space reserve controls in Settings &gt; System &gt; Drive space and recovery data. Startup source backups have their own bounded private quota and never become security baselines. Diagnostics rotate; unknown interrupted transactions and unreviewed source edits are preserved and can hold recovery. An operator can block future cache creation, delete selected copies, or change policy. Deletion permanently removes the selected restore points.</w:t>
+      </w:r>
+    </w:p>
+    <w:p>
+      <w:pPr>
+        <w:pStyle w:val="Heading3"/>
+        <w:keepNext/>
+        <w:spacing w:after="120" w:line="264" w:lineRule="auto"/>
+      </w:pPr>
+      <w:r>
+        <w:rPr>
+          <w:color w:val="000000"/>
+        </w:rPr>
+        <w:t xml:space="preserve">7 Independent trust and recovery</w:t>
+      </w:r>
+    </w:p>
+    <w:p>
+      <w:pPr>
+        <w:pStyle w:val="Normal"/>
+        <w:spacing w:after="120" w:line="264" w:lineRule="auto"/>
+      </w:pPr>
+      <w:r>
+        <w:rPr>
+          <w:color w:val="000000"/>
+          <w:sz w:val="22"/>
+        </w:rPr>
+        <w:t xml:space="preserve">UGCAP requires explicit known-clean vault enrollment and supports selected-path review/recovery. Strict startup and the rotating local mesh depend on their freshness and custody gates. An independent witness needs separately deployed authority, enrolled identity, mTLS and certificate/signing pins; a local process or deleting retained witness state is not an independent failure domain.</w:t>
+      </w:r>
+    </w:p>
+    <w:p>
+      <w:pPr>
+        <w:pStyle w:val="Normal"/>
+        <w:spacing w:after="120" w:line="264" w:lineRule="auto"/>
+      </w:pPr>
+      <w:r>
+        <w:rPr>
+          <w:color w:val="000000"/>
+          <w:sz w:val="22"/>
+        </w:rPr>
+        <w:t xml:space="preserve">Release integrity validates the approved installed payload and publisher chain. Source recovery verifies exact candidates but cannot confer signed installed authority. A writable batch trust anchor, a Python integrity check or a private HMAC key in the same compromised user context cannot make the suite immune to that attacker. Recovery never silently enrolls changed files into UGCAP.</w:t>
+      </w:r>
+    </w:p>
+    <w:p>
+      <w:pPr>
+        <w:pStyle w:val="Heading3"/>
+        <w:keepNext/>
+        <w:spacing w:after="120" w:line="264" w:lineRule="auto"/>
+      </w:pPr>
+      <w:r>
+        <w:rPr>
+          <w:color w:val="000000"/>
+        </w:rPr>
+        <w:t xml:space="preserve">8 Ring 3 and platform limits</w:t>
+      </w:r>
+    </w:p>
+    <w:p>
+      <w:pPr>
+        <w:pStyle w:val="Normal"/>
+        <w:spacing w:after="120" w:line="264" w:lineRule="auto"/>
+      </w:pPr>
+      <w:r>
+        <w:rPr>
+          <w:color w:val="000000"/>
+          <w:sz w:val="22"/>
+        </w:rPr>
+        <w:t xml:space="preserve">The desktop/source application runs in user mode, commonly called Ring 3. Administrator/UAC authority remains user mode. Supported OS interfaces can provide kernel-originated data or authorized enforcement, but availability, privilege and driver/service deployment must be established separately. Angerona ships no production kernel driver and promises no control over a hostile kernel, hypervisor, firmware, compromised OS or hostile administrator. Microsoft describes user and kernel execution and Windows security boundaries.</w:t>
+      </w:r>
+    </w:p>
+    <w:p>
+      <w:pPr>
+        <w:pStyle w:val="Normal"/>
+        <w:spacing w:after="120" w:line="264" w:lineRule="auto"/>
+      </w:pPr>
+      <w:r>
+        <w:rPr>
+          <w:color w:val="000000"/>
+          <w:sz w:val="22"/>
+        </w:rPr>
+        <w:t xml:space="preserve">Kernel integrity, Secure Boot, supported OS security, trusted backups and independent authorities complement the application. On macOS/Linux, module platform gates and Observe scope remain visible; optional Linux eBPF is a separately configured capability, not a blanket parity claim.</w:t>
+      </w:r>
+    </w:p>
+    <w:p>
+      <w:pPr>
+        <w:pStyle w:val="Heading3"/>
+        <w:keepNext/>
+        <w:spacing w:after="120" w:line="264" w:lineRule="auto"/>
+      </w:pPr>
+      <w:r>
+        <w:rPr>
+          <w:color w:val="000000"/>
+        </w:rPr>
+        <w:t xml:space="preserve">9 Network and extension boundaries</w:t>
+      </w:r>
+    </w:p>
+    <w:tbl>
+      <w:tblPr>
+        <w:tblW w:w="9360" w:type="dxa"/>
+        <w:tblLayout w:type="fixed"/>
+        <w:tblBorders>
+          <w:top w:val="single" w:sz="4" w:color="D9D9D9"/>
+          <w:left w:val="single" w:sz="4" w:color="D9D9D9"/>
+          <w:bottom w:val="single" w:sz="4" w:color="D9D9D9"/>
+          <w:right w:val="single" w:sz="4" w:color="D9D9D9"/>
+          <w:insideH w:val="single" w:sz="4" w:color="D9D9D9"/>
+          <w:insideV w:val="single" w:sz="4" w:color="D9D9D9"/>
+        </w:tblBorders>
+        <w:tblCellMar>
+          <w:top w:w="100" w:type="dxa"/>
+          <w:left w:w="110" w:type="dxa"/>
+          <w:bottom w:w="100" w:type="dxa"/>
+          <w:right w:w="110" w:type="dxa"/>
+        </w:tblCellMar>
+      </w:tblPr>
+      <w:tblGrid>
+        <w:gridCol w:w="2200"/>
+        <w:gridCol w:w="7160"/>
+      </w:tblGrid>
+      <w:tr>
+        <w:trPr>
+          <w:cantSplit/>
+          <w:tblHeader/>
+        </w:trPr>
+        <w:tc>
+          <w:tcPr>
+            <w:tcW w:w="2200" w:type="dxa"/>
+            <w:shd w:fill="DCE7F0"/>
+            <w:vAlign w:val="center"/>
+          </w:tcPr>
+          <w:p>
+            <w:pPr>
+              <w:pStyle w:val="Normal"/>
+              <w:spacing w:after="120" w:line="264" w:lineRule="auto"/>
+            </w:pPr>
+            <w:r>
+              <w:rPr>
+                <w:b/>
+                <w:color w:val="000000"/>
+                <w:sz w:val="19"/>
+              </w:rPr>
+              <w:t xml:space="preserve">Path</w:t>
+            </w:r>
+          </w:p>
+        </w:tc>
+        <w:tc>
+          <w:tcPr>
+            <w:tcW w:w="7160" w:type="dxa"/>
+            <w:shd w:fill="DCE7F0"/>
+            <w:vAlign w:val="center"/>
+          </w:tcPr>
+          <w:p>
+            <w:pPr>
+              <w:pStyle w:val="Normal"/>
+              <w:spacing w:after="120" w:line="264" w:lineRule="auto"/>
+            </w:pPr>
+            <w:r>
+              <w:rPr>
+                <w:b/>
+                <w:color w:val="000000"/>
+                <w:sz w:val="19"/>
+              </w:rPr>
+              <w:t xml:space="preserve">Data and authority boundary</w:t>
             </w:r>
           </w:p>
         </w:tc>
@@ -15380,7 +15699,7 @@
                 <w:color w:val="000000"/>
                 <w:sz w:val="19"/>
               </w:rPr>
-              <w:t xml:space="preserve">Third-party Python modules</w:t>
+              <w:t xml:space="preserve">Source recovery</w:t>
             </w:r>
           </w:p>
         </w:tc>
@@ -15400,7 +15719,322 @@
                 <w:color w:val="000000"/>
                 <w:sz w:val="19"/>
               </w:rPr>
+              <w:t xml:space="preserve">Fixed canonical GitHub commit/tree/archive or pinned blob HTTPS reads. No host evidence/failed-edit uploads. GitHub sees ordinary request metadata. Optional GitHub setting and master recovery control apply.</w:t>
+            </w:r>
+          </w:p>
+        </w:tc>
+      </w:tr>
+      <w:tr>
+        <w:trPr>
+          <w:cantSplit/>
+        </w:trPr>
+        <w:tc>
+          <w:tcPr>
+            <w:tcW w:w="2200" w:type="dxa"/>
+            <w:shd w:fill="F4F6F8"/>
+            <w:vAlign w:val="center"/>
+          </w:tcPr>
+          <w:p>
+            <w:pPr>
+              <w:pStyle w:val="Normal"/>
+              <w:spacing w:after="120" w:line="264" w:lineRule="auto"/>
+            </w:pPr>
+            <w:r>
+              <w:rPr>
+                <w:color w:val="000000"/>
+                <w:sz w:val="19"/>
+              </w:rPr>
+              <w:t xml:space="preserve">Runtime repair</w:t>
+            </w:r>
+          </w:p>
+        </w:tc>
+        <w:tc>
+          <w:tcPr>
+            <w:tcW w:w="7160" w:type="dxa"/>
+            <w:shd w:fill="F4F6F8"/>
+            <w:vAlign w:val="center"/>
+          </w:tcPr>
+          <w:p>
+            <w:pPr>
+              <w:pStyle w:val="Normal"/>
+              <w:spacing w:after="120" w:line="264" w:lineRule="auto"/>
+            </w:pPr>
+            <w:r>
+              <w:rPr>
+                <w:color w:val="000000"/>
+                <w:sz w:val="19"/>
+              </w:rPr>
+              <w:t xml:space="preserve">Reviewed signed PSF Python and hash-locked dependencies; successful download does not bypass runtime/source/readiness gates.</w:t>
+            </w:r>
+          </w:p>
+        </w:tc>
+      </w:tr>
+      <w:tr>
+        <w:trPr>
+          <w:cantSplit/>
+        </w:trPr>
+        <w:tc>
+          <w:tcPr>
+            <w:tcW w:w="2200" w:type="dxa"/>
+            <w:shd w:fill="FFFFFF"/>
+            <w:vAlign w:val="center"/>
+          </w:tcPr>
+          <w:p>
+            <w:pPr>
+              <w:pStyle w:val="Normal"/>
+              <w:spacing w:after="120" w:line="264" w:lineRule="auto"/>
+            </w:pPr>
+            <w:r>
+              <w:rPr>
+                <w:color w:val="000000"/>
+                <w:sz w:val="19"/>
+              </w:rPr>
+              <w:t xml:space="preserve">Local AI</w:t>
+            </w:r>
+          </w:p>
+        </w:tc>
+        <w:tc>
+          <w:tcPr>
+            <w:tcW w:w="7160" w:type="dxa"/>
+            <w:shd w:fill="FFFFFF"/>
+            <w:vAlign w:val="center"/>
+          </w:tcPr>
+          <w:p>
+            <w:pPr>
+              <w:pStyle w:val="Normal"/>
+              <w:spacing w:after="120" w:line="264" w:lineRule="auto"/>
+            </w:pPr>
+            <w:r>
+              <w:rPr>
+                <w:color w:val="000000"/>
+                <w:sz w:val="19"/>
+              </w:rPr>
+              <w:t xml:space="preserve">Explicit configured local endpoint and integrity/privacy gates. SentinelLens narrative has a strict loopback boundary; no cloud fallback. Manual consultation needs preview/Send.</w:t>
+            </w:r>
+          </w:p>
+        </w:tc>
+      </w:tr>
+      <w:tr>
+        <w:trPr>
+          <w:cantSplit/>
+        </w:trPr>
+        <w:tc>
+          <w:tcPr>
+            <w:tcW w:w="2200" w:type="dxa"/>
+            <w:shd w:fill="F4F6F8"/>
+            <w:vAlign w:val="center"/>
+          </w:tcPr>
+          <w:p>
+            <w:pPr>
+              <w:pStyle w:val="Normal"/>
+              <w:spacing w:after="120" w:line="264" w:lineRule="auto"/>
+            </w:pPr>
+            <w:r>
+              <w:rPr>
+                <w:color w:val="000000"/>
+                <w:sz w:val="19"/>
+              </w:rPr>
+              <w:t xml:space="preserve">Intelligence/news/research</w:t>
+            </w:r>
+          </w:p>
+        </w:tc>
+        <w:tc>
+          <w:tcPr>
+            <w:tcW w:w="7160" w:type="dxa"/>
+            <w:shd w:fill="F4F6F8"/>
+            <w:vAlign w:val="center"/>
+          </w:tcPr>
+          <w:p>
+            <w:pPr>
+              <w:pStyle w:val="Normal"/>
+              <w:spacing w:after="120" w:line="264" w:lineRule="auto"/>
+            </w:pPr>
+            <w:r>
+              <w:rPr>
+                <w:color w:val="000000"/>
+                <w:sz w:val="19"/>
+              </w:rPr>
+              <w:t xml:space="preserve">Per-feature opt-in/configured source rules. Imported URLs and retrieved prose are data, never executable repair or response instructions.</w:t>
+            </w:r>
+          </w:p>
+        </w:tc>
+      </w:tr>
+      <w:tr>
+        <w:trPr>
+          <w:cantSplit/>
+        </w:trPr>
+        <w:tc>
+          <w:tcPr>
+            <w:tcW w:w="2200" w:type="dxa"/>
+            <w:shd w:fill="FFFFFF"/>
+            <w:vAlign w:val="center"/>
+          </w:tcPr>
+          <w:p>
+            <w:pPr>
+              <w:pStyle w:val="Normal"/>
+              <w:spacing w:after="120" w:line="264" w:lineRule="auto"/>
+            </w:pPr>
+            <w:r>
+              <w:rPr>
+                <w:color w:val="000000"/>
+                <w:sz w:val="19"/>
+              </w:rPr>
+              <w:t xml:space="preserve">Witness and fleet</w:t>
+            </w:r>
+          </w:p>
+        </w:tc>
+        <w:tc>
+          <w:tcPr>
+            <w:tcW w:w="7160" w:type="dxa"/>
+            <w:shd w:fill="FFFFFF"/>
+            <w:vAlign w:val="center"/>
+          </w:tcPr>
+          <w:p>
+            <w:pPr>
+              <w:pStyle w:val="Normal"/>
+              <w:spacing w:after="120" w:line="264" w:lineRule="auto"/>
+            </w:pPr>
+            <w:r>
+              <w:rPr>
+                <w:color w:val="000000"/>
+                <w:sz w:val="19"/>
+              </w:rPr>
+              <w:t xml:space="preserve">Separate enrolled remote authority, endpoint authentication and typed schema. Disabled/unavailable deployment stays a gap.</w:t>
+            </w:r>
+          </w:p>
+        </w:tc>
+      </w:tr>
+      <w:tr>
+        <w:trPr>
+          <w:cantSplit/>
+        </w:trPr>
+        <w:tc>
+          <w:tcPr>
+            <w:tcW w:w="2200" w:type="dxa"/>
+            <w:shd w:fill="F4F6F8"/>
+            <w:vAlign w:val="center"/>
+          </w:tcPr>
+          <w:p>
+            <w:pPr>
+              <w:pStyle w:val="Normal"/>
+              <w:spacing w:after="120" w:line="264" w:lineRule="auto"/>
+            </w:pPr>
+            <w:r>
+              <w:rPr>
+                <w:color w:val="000000"/>
+                <w:sz w:val="19"/>
+              </w:rPr>
+              <w:t xml:space="preserve">Live Debug and engine IPC</w:t>
+            </w:r>
+          </w:p>
+        </w:tc>
+        <w:tc>
+          <w:tcPr>
+            <w:tcW w:w="7160" w:type="dxa"/>
+            <w:shd w:fill="F4F6F8"/>
+            <w:vAlign w:val="center"/>
+          </w:tcPr>
+          <w:p>
+            <w:pPr>
+              <w:pStyle w:val="Normal"/>
+              <w:spacing w:after="120" w:line="264" w:lineRule="auto"/>
+            </w:pPr>
+            <w:r>
+              <w:rPr>
+                <w:color w:val="000000"/>
+                <w:sz w:val="19"/>
+              </w:rPr>
+              <w:t xml:space="preserve">Authenticated bounded local records and typed controls. Read-only review cannot authorize mutation. Shared user context remains part of the threat model.</w:t>
+            </w:r>
+          </w:p>
+        </w:tc>
+      </w:tr>
+      <w:tr>
+        <w:trPr>
+          <w:cantSplit/>
+        </w:trPr>
+        <w:tc>
+          <w:tcPr>
+            <w:tcW w:w="2200" w:type="dxa"/>
+            <w:shd w:fill="FFFFFF"/>
+            <w:vAlign w:val="center"/>
+          </w:tcPr>
+          <w:p>
+            <w:pPr>
+              <w:pStyle w:val="Normal"/>
+              <w:spacing w:after="120" w:line="264" w:lineRule="auto"/>
+            </w:pPr>
+            <w:r>
+              <w:rPr>
+                <w:color w:val="000000"/>
+                <w:sz w:val="19"/>
+              </w:rPr>
+              <w:t xml:space="preserve">Third-party Python modules</w:t>
+            </w:r>
+          </w:p>
+        </w:tc>
+        <w:tc>
+          <w:tcPr>
+            <w:tcW w:w="7160" w:type="dxa"/>
+            <w:shd w:fill="FFFFFF"/>
+            <w:vAlign w:val="center"/>
+          </w:tcPr>
+          <w:p>
+            <w:pPr>
+              <w:pStyle w:val="Normal"/>
+              <w:spacing w:after="120" w:line="264" w:lineRule="auto"/>
+            </w:pPr>
+            <w:r>
+              <w:rPr>
+                <w:color w:val="000000"/>
+                <w:sz w:val="19"/>
+              </w:rPr>
               <w:t xml:space="preserve">Explicitly loaded code executes in a process with that process's authority. Contract metadata is not sandboxing; review extensions and their dependencies.</w:t>
+            </w:r>
+          </w:p>
+        </w:tc>
+      </w:tr>
+      <w:tr>
+        <w:trPr>
+          <w:cantSplit/>
+        </w:trPr>
+        <w:tc>
+          <w:tcPr>
+            <w:tcW w:w="2200" w:type="dxa"/>
+            <w:shd w:fill="F4F6F8"/>
+            <w:vAlign w:val="center"/>
+          </w:tcPr>
+          <w:p>
+            <w:pPr>
+              <w:pStyle w:val="Normal"/>
+              <w:spacing w:after="120" w:line="264" w:lineRule="auto"/>
+            </w:pPr>
+            <w:r>
+              <w:rPr>
+                <w:color w:val="000000"/>
+                <w:sz w:val="19"/>
+              </w:rPr>
+              <w:t xml:space="preserve">Curated Zero Breach scanner</w:t>
+            </w:r>
+          </w:p>
+        </w:tc>
+        <w:tc>
+          <w:tcPr>
+            <w:tcW w:w="7160" w:type="dxa"/>
+            <w:shd w:fill="F4F6F8"/>
+            <w:vAlign w:val="center"/>
+          </w:tcPr>
+          <w:p>
+            <w:pPr>
+              <w:pStyle w:val="Normal"/>
+              <w:spacing w:after="120" w:line="264" w:lineRule="auto"/>
+            </w:pPr>
+            <w:r>
+              <w:rPr>
+                <w:color w:val="000000"/>
+                <w:sz w:val="19"/>
+              </w:rPr>
+              <w:t xml:space="preserve">Exact bundled or pinned-release bytes and retained licenses; separate owned ordinary-user job, private temporary data and validated reports. No automatic feed refresh; third-party results remain leads. Source Library imports and advanced acquisition/dependencies retain separate holds.</w:t>
             </w:r>
           </w:p>
         </w:tc>
@@ -17443,6 +18077,261 @@
           </w:p>
         </w:tc>
       </w:tr>
+      <w:tr>
+        <w:trPr>
+          <w:cantSplit/>
+        </w:trPr>
+        <w:tc>
+          <w:tcPr>
+            <w:tcW w:w="2000" w:type="dxa"/>
+            <w:shd w:fill="FFFFFF"/>
+            <w:vAlign w:val="center"/>
+          </w:tcPr>
+          <w:p>
+            <w:pPr>
+              <w:pStyle w:val="Normal"/>
+              <w:spacing w:after="120" w:line="264" w:lineRule="auto"/>
+            </w:pPr>
+            <w:r>
+              <w:rPr>
+                <w:color w:val="000000"/>
+                <w:sz w:val="19"/>
+              </w:rPr>
+              <w:t xml:space="preserve">Curated engine tamper, orphan job or unsafe report cleanup</w:t>
+            </w:r>
+          </w:p>
+        </w:tc>
+        <w:tc>
+          <w:tcPr>
+            <w:tcW w:w="2600" w:type="dxa"/>
+            <w:shd w:fill="FFFFFF"/>
+            <w:vAlign w:val="center"/>
+          </w:tcPr>
+          <w:p>
+            <w:pPr>
+              <w:pStyle w:val="Normal"/>
+              <w:spacing w:after="120" w:line="264" w:lineRule="auto"/>
+            </w:pPr>
+            <w:r>
+              <w:rPr>
+                <w:color w:val="000000"/>
+                <w:sz w:val="19"/>
+              </w:rPr>
+              <w:t xml:space="preserve">core/curated_tools.py, core/curated_tool_worker.py, gui/curated_tools.py</w:t>
+            </w:r>
+          </w:p>
+        </w:tc>
+        <w:tc>
+          <w:tcPr>
+            <w:tcW w:w="2400" w:type="dxa"/>
+            <w:shd w:fill="FFFFFF"/>
+            <w:vAlign w:val="center"/>
+          </w:tcPr>
+          <w:p>
+            <w:pPr>
+              <w:pStyle w:val="Normal"/>
+              <w:spacing w:after="120" w:line="264" w:lineRule="auto"/>
+            </w:pPr>
+            <w:r>
+              <w:rPr>
+                <w:color w:val="000000"/>
+                <w:sz w:val="19"/>
+              </w:rPr>
+              <w:t xml:space="preserve">tests/test_curated_tools.py, tests/test_zero_breach_bundle.py, tests/test_curated_app_lifecycle.py</w:t>
+            </w:r>
+          </w:p>
+        </w:tc>
+        <w:tc>
+          <w:tcPr>
+            <w:tcW w:w="2360" w:type="dxa"/>
+            <w:shd w:fill="FFFFFF"/>
+            <w:vAlign w:val="center"/>
+          </w:tcPr>
+          <w:p>
+            <w:pPr>
+              <w:pStyle w:val="Normal"/>
+              <w:spacing w:after="120" w:line="264" w:lineRule="auto"/>
+            </w:pPr>
+            <w:r>
+              <w:rPr>
+                <w:color w:val="000000"/>
+                <w:sz w:val="19"/>
+              </w:rPr>
+              <w:t xml:space="preserve">Fixed artifact identities, separate process/job custody, validated bounded reports, private job roots and preservation of unknown or modified originals.</w:t>
+            </w:r>
+          </w:p>
+        </w:tc>
+      </w:tr>
+      <w:tr>
+        <w:trPr>
+          <w:cantSplit/>
+        </w:trPr>
+        <w:tc>
+          <w:tcPr>
+            <w:tcW w:w="2000" w:type="dxa"/>
+            <w:shd w:fill="F4F6F8"/>
+            <w:vAlign w:val="center"/>
+          </w:tcPr>
+          <w:p>
+            <w:pPr>
+              <w:pStyle w:val="Normal"/>
+              <w:spacing w:after="120" w:line="264" w:lineRule="auto"/>
+            </w:pPr>
+            <w:r>
+              <w:rPr>
+                <w:color w:val="000000"/>
+                <w:sz w:val="19"/>
+              </w:rPr>
+              <w:t xml:space="preserve">Priority scan starves essential work or overstates privileges</w:t>
+            </w:r>
+          </w:p>
+        </w:tc>
+        <w:tc>
+          <w:tcPr>
+            <w:tcW w:w="2600" w:type="dxa"/>
+            <w:shd w:fill="F4F6F8"/>
+            <w:vAlign w:val="center"/>
+          </w:tcPr>
+          <w:p>
+            <w:pPr>
+              <w:pStyle w:val="Normal"/>
+              <w:spacing w:after="120" w:line="264" w:lineRule="auto"/>
+            </w:pPr>
+            <w:r>
+              <w:rPr>
+                <w:color w:val="000000"/>
+                <w:sz w:val="19"/>
+              </w:rPr>
+              <w:t xml:space="preserve">SpywareGuard, core/background_pacing.py, curated scan controls</w:t>
+            </w:r>
+          </w:p>
+        </w:tc>
+        <w:tc>
+          <w:tcPr>
+            <w:tcW w:w="2400" w:type="dxa"/>
+            <w:shd w:fill="F4F6F8"/>
+            <w:vAlign w:val="center"/>
+          </w:tcPr>
+          <w:p>
+            <w:pPr>
+              <w:pStyle w:val="Normal"/>
+              <w:spacing w:after="120" w:line="264" w:lineRule="auto"/>
+            </w:pPr>
+            <w:r>
+              <w:rPr>
+                <w:color w:val="000000"/>
+                <w:sz w:val="19"/>
+              </w:rPr>
+              <w:t xml:space="preserve">tests/test_spyware_priority_scan.py, tests/test_curated_tools_ui.py</w:t>
+            </w:r>
+          </w:p>
+        </w:tc>
+        <w:tc>
+          <w:tcPr>
+            <w:tcW w:w="2360" w:type="dxa"/>
+            <w:shd w:fill="F4F6F8"/>
+            <w:vAlign w:val="center"/>
+          </w:tcPr>
+          <w:p>
+            <w:pPr>
+              <w:pStyle w:val="Normal"/>
+              <w:spacing w:after="120" w:line="264" w:lineRule="auto"/>
+            </w:pPr>
+            <w:r>
+              <w:rPr>
+                <w:color w:val="000000"/>
+                <w:sz w:val="19"/>
+              </w:rPr>
+              <w:t xml:space="preserve">Explicit scanner toggles, supported priority ceiling, copied resource state and coverage; critical controls/intake remain independent of routine pacing.</w:t>
+            </w:r>
+          </w:p>
+        </w:tc>
+      </w:tr>
+      <w:tr>
+        <w:trPr>
+          <w:cantSplit/>
+        </w:trPr>
+        <w:tc>
+          <w:tcPr>
+            <w:tcW w:w="2000" w:type="dxa"/>
+            <w:shd w:fill="FFFFFF"/>
+            <w:vAlign w:val="center"/>
+          </w:tcPr>
+          <w:p>
+            <w:pPr>
+              <w:pStyle w:val="Normal"/>
+              <w:spacing w:after="120" w:line="264" w:lineRule="auto"/>
+            </w:pPr>
+            <w:r>
+              <w:rPr>
+                <w:color w:val="000000"/>
+                <w:sz w:val="19"/>
+              </w:rPr>
+              <w:t xml:space="preserve">Untrusted lead becomes breach or unjustified lockdown</w:t>
+            </w:r>
+          </w:p>
+        </w:tc>
+        <w:tc>
+          <w:tcPr>
+            <w:tcW w:w="2600" w:type="dxa"/>
+            <w:shd w:fill="FFFFFF"/>
+            <w:vAlign w:val="center"/>
+          </w:tcPr>
+          <w:p>
+            <w:pPr>
+              <w:pStyle w:val="Normal"/>
+              <w:spacing w:after="120" w:line="264" w:lineRule="auto"/>
+            </w:pPr>
+            <w:r>
+              <w:rPr>
+                <w:color w:val="000000"/>
+                <w:sz w:val="19"/>
+              </w:rPr>
+              <w:t xml:space="preserve">core/breach_state.py, Adversary Combat, gui/breach_display.py</w:t>
+            </w:r>
+          </w:p>
+        </w:tc>
+        <w:tc>
+          <w:tcPr>
+            <w:tcW w:w="2400" w:type="dxa"/>
+            <w:shd w:fill="FFFFFF"/>
+            <w:vAlign w:val="center"/>
+          </w:tcPr>
+          <w:p>
+            <w:pPr>
+              <w:pStyle w:val="Normal"/>
+              <w:spacing w:after="120" w:line="264" w:lineRule="auto"/>
+            </w:pPr>
+            <w:r>
+              <w:rPr>
+                <w:color w:val="000000"/>
+                <w:sz w:val="19"/>
+              </w:rPr>
+              <w:t xml:space="preserve">tests/test_breach_state.py, tests/test_breach_lockdown.py, tests/test_breach_display.py</w:t>
+            </w:r>
+          </w:p>
+        </w:tc>
+        <w:tc>
+          <w:tcPr>
+            <w:tcW w:w="2360" w:type="dxa"/>
+            <w:shd w:fill="FFFFFF"/>
+            <w:vAlign w:val="center"/>
+          </w:tcPr>
+          <w:p>
+            <w:pPr>
+              <w:pStyle w:val="Normal"/>
+              <w:spacing w:after="120" w:line="264" w:lineRule="auto"/>
+            </w:pPr>
+            <w:r>
+              <w:rPr>
+                <w:color w:val="000000"/>
+                <w:sz w:val="19"/>
+              </w:rPr>
+              <w:t xml:space="preserve">Fresh native current-generation evidence, original target/action contract, signed installed authority, effective-policy/scope checks, durable receipts and managed-only verified Lift.</w:t>
+            </w:r>
+          </w:p>
+        </w:tc>
+      </w:tr>
     </w:tbl>
     <w:p>
       <w:pPr>
@@ -21501,6 +22390,1178 @@
           <w:sz w:val="22"/>
         </w:rPr>
         <w:t xml:space="preserve"/>
+      </w:r>
+    </w:p>
+    <w:p>
+      <w:pPr>
+        <w:pStyle w:val="Heading2"/>
+        <w:keepNext/>
+        <w:spacing w:after="120" w:line="264" w:lineRule="auto"/>
+      </w:pPr>
+      <w:r>
+        <w:rPr>
+          <w:color w:val="000000"/>
+        </w:rPr>
+        <w:t xml:space="preserve">GitHub Tools and Zero Breach Toolkit</w:t>
+      </w:r>
+    </w:p>
+    <w:p>
+      <w:pPr>
+        <w:pStyle w:val="Normal"/>
+        <w:spacing w:after="120" w:line="264" w:lineRule="auto"/>
+      </w:pPr>
+      <w:r>
+        <w:rPr>
+          <w:color w:val="000000"/>
+          <w:sz w:val="22"/>
+        </w:rPr>
+        <w:t xml:space="preserve">Angerona's GitHub Tools button opens curated scanners, source review, verification, settings, analysis and credits. SpywareGuard &gt; Zero Breach uses the same prepared tool and job state. Opening a second view does not install a second copy or start a second scan.</w:t>
+      </w:r>
+    </w:p>
+    <w:p>
+      <w:pPr>
+        <w:pStyle w:val="Normal"/>
+        <w:spacing w:after="120" w:line="264" w:lineRule="auto"/>
+      </w:pPr>
+      <w:r>
+        <w:rPr>
+          <w:color w:val="000000"/>
+          <w:sz w:val="22"/>
+        </w:rPr>
+        <w:t xml:space="preserve">The first curated engine is Zero Breach Toolkit v0.1.10, by archivegenocide.com / interplains. Its complete single-file release is bundled unchanged, alongside its licenses and notices. It runs as a separate supervised process behind Angerona's controls. It is never imported into the security core or GUI interpreter: the upstream scanner temporarily changes Python socket functions while scanning, which must not affect Angerona's other services.</w:t>
+      </w:r>
+    </w:p>
+    <w:p>
+      <w:pPr>
+        <w:pStyle w:val="Heading3"/>
+        <w:keepNext/>
+        <w:spacing w:after="120" w:line="264" w:lineRule="auto"/>
+      </w:pPr>
+      <w:r>
+        <w:rPr>
+          <w:color w:val="000000"/>
+        </w:rPr>
+        <w:t xml:space="preserve">Installation, download and revert</w:t>
+      </w:r>
+    </w:p>
+    <w:p>
+      <w:pPr>
+        <w:pStyle w:val="Normal"/>
+        <w:spacing w:after="120" w:line="264" w:lineRule="auto"/>
+      </w:pPr>
+      <w:r>
+        <w:rPr>
+          <w:color w:val="000000"/>
+          <w:sz w:val="22"/>
+        </w:rPr>
+        <w:t xml:space="preserve">Optional automatic preparation happens after the dashboard paints. Preparing the bundled standard-library engine needs no pip installation and does not modify Angerona's Python environment. A download/restore action retrieves the exact cataloged release; a newer upstream branch or release does not silently replace that reviewed version.</w:t>
+      </w:r>
+    </w:p>
+    <w:p>
+      <w:pPr>
+        <w:pStyle w:val="Normal"/>
+        <w:spacing w:after="120" w:line="264" w:lineRule="auto"/>
+      </w:pPr>
+      <w:r>
+        <w:rPr>
+          <w:color w:val="000000"/>
+          <w:sz w:val="22"/>
+        </w:rPr>
+        <w:t xml:space="preserve">Both views expose the prepared version, integrity state, job status and storage information. Settings control automatic preparation, permitted downloads and job/report limits. Disabling preparation or a failed optional download does not make the dashboard depend on the toolkit.</w:t>
+      </w:r>
+    </w:p>
+    <w:p>
+      <w:pPr>
+        <w:pStyle w:val="Normal"/>
+        <w:spacing w:after="120" w:line="264" w:lineRule="auto"/>
+      </w:pPr>
+      <w:r>
+        <w:rPr>
+          <w:color w:val="000000"/>
+          <w:sz w:val="22"/>
+        </w:rPr>
+        <w:t xml:space="preserve">Revert retires the exact managed installation after confirmation. Preferences and retained reports remain available. Unknown or changed files require review rather than becoming targets for a broad cleanup. Prepare/Restore can make a verified copy available again.</w:t>
+      </w:r>
+    </w:p>
+    <w:p>
+      <w:pPr>
+        <w:pStyle w:val="Heading3"/>
+        <w:keepNext/>
+        <w:spacing w:after="120" w:line="264" w:lineRule="auto"/>
+      </w:pPr>
+      <w:r>
+        <w:rPr>
+          <w:color w:val="000000"/>
+        </w:rPr>
+        <w:t xml:space="preserve">Integrated checks</w:t>
+      </w:r>
+    </w:p>
+    <w:p>
+      <w:pPr>
+        <w:pStyle w:val="Normal"/>
+        <w:spacing w:after="120" w:line="264" w:lineRule="auto"/>
+      </w:pPr>
+      <w:r>
+        <w:rPr>
+          <w:color w:val="000000"/>
+          <w:sz w:val="22"/>
+        </w:rPr>
+        <w:t xml:space="preserve">Use the native controls to select a default, full, browser or selected-target check; quick/preview options, existing Windows records, custom local indicators and supported local phone collections can refine that request. The adapter can inspect existing AndroidQF collections and local iPhone backup, filesystem or sysdiagnose inputs. Availability depends on the selected input and platform; unavailable or skipped checks remain visible as coverage gaps.</w:t>
+      </w:r>
+    </w:p>
+    <w:p>
+      <w:pPr>
+        <w:pStyle w:val="Normal"/>
+        <w:spacing w:after="120" w:line="264" w:lineRule="auto"/>
+      </w:pPr>
+      <w:r>
+        <w:rPr>
+          <w:color w:val="000000"/>
+          <w:sz w:val="22"/>
+        </w:rPr>
+        <w:t xml:space="preserve">Integrated execution currently requires an ordinary-user source process. Installed or elevated execution remains HELD until an accepted ordinary-user broker is available. Opening the native page or verifying Administrator coverage does not bypass that boundary or request elevation for the third-party engine.</w:t>
+      </w:r>
+    </w:p>
+    <w:p>
+      <w:pPr>
+        <w:pStyle w:val="Normal"/>
+        <w:spacing w:after="120" w:line="264" w:lineRule="auto"/>
+      </w:pPr>
+      <w:r>
+        <w:rPr>
+          <w:color w:val="000000"/>
+          <w:sz w:val="22"/>
+        </w:rPr>
+        <w:t xml:space="preserve">Ordinary integrated scans use the bundled indicators without refreshing feeds. The scanner does not require administrator privileges. Angerona does not infer that a privileged collector succeeded merely because a window or process opened.</w:t>
+      </w:r>
+    </w:p>
+    <w:p>
+      <w:pPr>
+        <w:pStyle w:val="Normal"/>
+        <w:spacing w:after="120" w:line="264" w:lineRule="auto"/>
+      </w:pPr>
+      <w:r>
+        <w:rPr>
+          <w:color w:val="000000"/>
+          <w:sz w:val="22"/>
+        </w:rPr>
+        <w:t xml:space="preserve">Advanced toolkit options explains the following upstream capabilities and links the complete pinned release and its download. Their execution inside Angerona remains HELD until separate managed adapters and dependency or acquisition runtimes are reviewed; this is not a runnable native full-menu path:</w:t>
+      </w:r>
+    </w:p>
+    <w:p>
+      <w:pPr>
+        <w:pStyle w:val="Normal"/>
+        <w:spacing w:after="120" w:line="264" w:lineRule="auto"/>
+      </w:pPr>
+      <w:r>
+        <w:rPr>
+          <w:color w:val="000000"/>
+          <w:sz w:val="22"/>
+        </w:rPr>
+        <w:t xml:space="preserve">• Encrypted iPhone backups use a private terminal password prompt. Passwords</w:t>
+      </w:r>
+    </w:p>
+    <w:p>
+      <w:pPr>
+        <w:pStyle w:val="Normal"/>
+        <w:spacing w:after="120" w:line="264" w:lineRule="auto"/>
+      </w:pPr>
+      <w:r>
+        <w:rPr>
+          <w:color w:val="000000"/>
+          <w:sz w:val="22"/>
+        </w:rPr>
+        <w:t xml:space="preserve">must not be supplied through command-line arguments, environment variables, logs or saved settings.</w:t>
+      </w:r>
+    </w:p>
+    <w:p>
+      <w:pPr>
+        <w:pStyle w:val="Normal"/>
+        <w:spacing w:after="120" w:line="264" w:lineRule="auto"/>
+      </w:pPr>
+      <w:r>
+        <w:rPr>
+          <w:color w:val="000000"/>
+          <w:sz w:val="22"/>
+        </w:rPr>
+        <w:t xml:space="preserve">• Optional Candiru patterns require the separately pinned YARA-X dependency;</w:t>
+      </w:r>
+    </w:p>
+    <w:p>
+      <w:pPr>
+        <w:pStyle w:val="Normal"/>
+        <w:spacing w:after="120" w:line="264" w:lineRule="auto"/>
+      </w:pPr>
+      <w:r>
+        <w:rPr>
+          <w:color w:val="000000"/>
+          <w:sz w:val="22"/>
+        </w:rPr>
+        <w:t xml:space="preserve">encrypted-backup extras also have their own requirements. They do not belong in Angerona's shared environment.</w:t>
+      </w:r>
+    </w:p>
+    <w:p>
+      <w:pPr>
+        <w:pStyle w:val="Normal"/>
+        <w:spacing w:after="120" w:line="264" w:lineRule="auto"/>
+      </w:pPr>
+      <w:r>
+        <w:rPr>
+          <w:color w:val="000000"/>
+          <w:sz w:val="22"/>
+        </w:rPr>
+        <w:t xml:space="preserve">• Indicator refresh is a network operation. The upstream updater's per-source</w:t>
+      </w:r>
+    </w:p>
+    <w:p>
+      <w:pPr>
+        <w:pStyle w:val="Normal"/>
+        <w:spacing w:after="120" w:line="264" w:lineRule="auto"/>
+      </w:pPr>
+      <w:r>
+        <w:rPr>
+          <w:color w:val="000000"/>
+          <w:sz w:val="22"/>
+        </w:rPr>
+        <w:t xml:space="preserve">limit is not an aggregate cache quota; automatic execution must retain the managed adapter's download/storage policy.</w:t>
+      </w:r>
+    </w:p>
+    <w:p>
+      <w:pPr>
+        <w:pStyle w:val="Normal"/>
+        <w:spacing w:after="120" w:line="264" w:lineRule="auto"/>
+      </w:pPr>
+      <w:r>
+        <w:rPr>
+          <w:color w:val="000000"/>
+          <w:sz w:val="22"/>
+        </w:rPr>
+        <w:t xml:space="preserve">• AndroidQF acquisition is separate from examining an existing collection. It</w:t>
+      </w:r>
+    </w:p>
+    <w:p>
+      <w:pPr>
+        <w:pStyle w:val="Normal"/>
+        <w:spacing w:after="120" w:line="264" w:lineRule="auto"/>
+      </w:pPr>
+      <w:r>
+        <w:rPr>
+          <w:color w:val="000000"/>
+          <w:sz w:val="22"/>
+        </w:rPr>
+        <w:t xml:space="preserve">downloads a collector, needs device-owner consent, changes device state and can retain sensitive partial output.</w:t>
+      </w:r>
+    </w:p>
+    <w:p>
+      <w:pPr>
+        <w:pStyle w:val="Normal"/>
+        <w:spacing w:after="120" w:line="264" w:lineRule="auto"/>
+      </w:pPr>
+      <w:r>
+        <w:rPr>
+          <w:color w:val="000000"/>
+          <w:sz w:val="22"/>
+        </w:rPr>
+        <w:t xml:space="preserve">• Evidence exports are private, unencrypted ZIP files. Only explicitly selected</w:t>
+      </w:r>
+    </w:p>
+    <w:p>
+      <w:pPr>
+        <w:pStyle w:val="Normal"/>
+        <w:spacing w:after="120" w:line="264" w:lineRule="auto"/>
+      </w:pPr>
+      <w:r>
+        <w:rPr>
+          <w:color w:val="000000"/>
+          <w:sz w:val="22"/>
+        </w:rPr>
+        <w:t xml:space="preserve">originals belong in an export; a path mentioned in a finding is not permission to copy that file.</w:t>
+      </w:r>
+    </w:p>
+    <w:p>
+      <w:pPr>
+        <w:pStyle w:val="Normal"/>
+        <w:spacing w:after="120" w:line="264" w:lineRule="auto"/>
+      </w:pPr>
+      <w:r>
+        <w:rPr>
+          <w:color w:val="000000"/>
+          <w:sz w:val="22"/>
+        </w:rPr>
+        <w:t xml:space="preserve">• The optional browser ad-blocking test opens an external website after a user</w:t>
+      </w:r>
+    </w:p>
+    <w:p>
+      <w:pPr>
+        <w:pStyle w:val="Normal"/>
+        <w:spacing w:after="120" w:line="264" w:lineRule="auto"/>
+      </w:pPr>
+      <w:r>
+        <w:rPr>
+          <w:color w:val="000000"/>
+          <w:sz w:val="22"/>
+        </w:rPr>
+        <w:t xml:space="preserve">action. It is separate from the scanner's offline checks.</w:t>
+      </w:r>
+    </w:p>
+    <w:p>
+      <w:pPr>
+        <w:pStyle w:val="Normal"/>
+        <w:spacing w:after="120" w:line="264" w:lineRule="auto"/>
+      </w:pPr>
+      <w:r>
+        <w:rPr>
+          <w:color w:val="000000"/>
+          <w:sz w:val="22"/>
+        </w:rPr>
+        <w:t xml:space="preserve">The upstream --deep option is unimplemented and is not a supported capability. See the pinned machine contract and privacy documentation for the original behavior and limitations.</w:t>
+      </w:r>
+    </w:p>
+    <w:p>
+      <w:pPr>
+        <w:pStyle w:val="Heading3"/>
+        <w:keepNext/>
+        <w:spacing w:after="120" w:line="264" w:lineRule="auto"/>
+      </w:pPr>
+      <w:r>
+        <w:rPr>
+          <w:color w:val="000000"/>
+        </w:rPr>
+        <w:t xml:space="preserve">Reports, cancellation and storage</w:t>
+      </w:r>
+    </w:p>
+    <w:p>
+      <w:pPr>
+        <w:pStyle w:val="Normal"/>
+        <w:spacing w:after="120" w:line="264" w:lineRule="auto"/>
+      </w:pPr>
+      <w:r>
+        <w:rPr>
+          <w:color w:val="000000"/>
+          <w:sz w:val="22"/>
+        </w:rPr>
+        <w:t xml:space="preserve">Every job receives a fresh private temporary directory. The upstream tool can delete old matching-prefix temporary folders and can create complete browser database snapshots or temporary plaintext phone databases. Its temporary path must therefore never be Angerona's general temp directory or the user's system temp directory. Interrupted sensitive snapshots need controlled retention and cleanup; deletion is not secure erasure.</w:t>
+      </w:r>
+    </w:p>
+    <w:p>
+      <w:pPr>
+        <w:pStyle w:val="Normal"/>
+        <w:spacing w:after="120" w:line="264" w:lineRule="auto"/>
+      </w:pPr>
+      <w:r>
+        <w:rPr>
+          <w:color w:val="000000"/>
+          <w:sz w:val="22"/>
+        </w:rPr>
+        <w:t xml:space="preserve">Managed jobs apply their own deadlines, output/workspace budgets and cancellation. Dashboard STOP cancels owned scanner work; hiding a tool view does not create another controller or silently restart a job. Forced termination or an incomplete report remains an explicit coverage gap.</w:t>
+      </w:r>
+    </w:p>
+    <w:p>
+      <w:pPr>
+        <w:pStyle w:val="Normal"/>
+        <w:spacing w:after="120" w:line="264" w:lineRule="auto"/>
+      </w:pPr>
+      <w:r>
+        <w:rPr>
+          <w:color w:val="000000"/>
+          <w:sz w:val="22"/>
+        </w:rPr>
+        <w:t xml:space="preserve">Monitored byte budgets are not an operating-system filesystem quota. An upstream browser snapshot can be as large as 1 GiB and can grow between monitor samples. Optional scans require a 3 GiB free-space reserve plus the configured working-data allowance before admission. Optional preparation requires 64 MiB free and does not run on the dashboard's startup-critical path. Settings expose working-data and retained-report limits and a scan deadline; cooperating Python copies/writes are bounded, while native writers are monitored and can exceed a sample between checks. A tool storage hold does not prevent Angerona itself from opening. Unknown or modified output is preserved for review; report cleanup is separate from Revert and cannot erase source evidence.</w:t>
+      </w:r>
+    </w:p>
+    <w:tbl>
+      <w:tblPr>
+        <w:tblW w:w="9360" w:type="dxa"/>
+        <w:tblLayout w:type="fixed"/>
+        <w:tblBorders>
+          <w:top w:val="single" w:sz="4" w:color="D9D9D9"/>
+          <w:left w:val="single" w:sz="4" w:color="D9D9D9"/>
+          <w:bottom w:val="single" w:sz="4" w:color="D9D9D9"/>
+          <w:right w:val="single" w:sz="4" w:color="D9D9D9"/>
+          <w:insideH w:val="single" w:sz="4" w:color="D9D9D9"/>
+          <w:insideV w:val="single" w:sz="4" w:color="D9D9D9"/>
+        </w:tblBorders>
+        <w:tblCellMar>
+          <w:top w:w="100" w:type="dxa"/>
+          <w:left w:w="110" w:type="dxa"/>
+          <w:bottom w:w="100" w:type="dxa"/>
+          <w:right w:w="110" w:type="dxa"/>
+        </w:tblCellMar>
+      </w:tblPr>
+      <w:tblGrid>
+        <w:gridCol w:w="2200"/>
+        <w:gridCol w:w="7160"/>
+      </w:tblGrid>
+      <w:tr>
+        <w:trPr>
+          <w:cantSplit/>
+          <w:tblHeader/>
+        </w:trPr>
+        <w:tc>
+          <w:tcPr>
+            <w:tcW w:w="2200" w:type="dxa"/>
+            <w:shd w:fill="DCE7F0"/>
+            <w:vAlign w:val="center"/>
+          </w:tcPr>
+          <w:p>
+            <w:pPr>
+              <w:pStyle w:val="Normal"/>
+              <w:spacing w:after="120" w:line="264" w:lineRule="auto"/>
+            </w:pPr>
+            <w:r>
+              <w:rPr>
+                <w:b/>
+                <w:color w:val="000000"/>
+                <w:sz w:val="19"/>
+              </w:rPr>
+              <w:t xml:space="preserve">Managed data</w:t>
+            </w:r>
+          </w:p>
+        </w:tc>
+        <w:tc>
+          <w:tcPr>
+            <w:tcW w:w="7160" w:type="dxa"/>
+            <w:shd w:fill="DCE7F0"/>
+            <w:vAlign w:val="center"/>
+          </w:tcPr>
+          <w:p>
+            <w:pPr>
+              <w:pStyle w:val="Normal"/>
+              <w:spacing w:after="120" w:line="264" w:lineRule="auto"/>
+            </w:pPr>
+            <w:r>
+              <w:rPr>
+                <w:b/>
+                <w:color w:val="000000"/>
+                <w:sz w:val="19"/>
+              </w:rPr>
+              <w:t xml:space="preserve">Admission and retention</w:t>
+            </w:r>
+          </w:p>
+        </w:tc>
+      </w:tr>
+      <w:tr>
+        <w:trPr>
+          <w:cantSplit/>
+        </w:trPr>
+        <w:tc>
+          <w:tcPr>
+            <w:tcW w:w="2200" w:type="dxa"/>
+            <w:shd w:fill="FFFFFF"/>
+            <w:vAlign w:val="center"/>
+          </w:tcPr>
+          <w:p>
+            <w:pPr>
+              <w:pStyle w:val="Normal"/>
+              <w:spacing w:after="120" w:line="264" w:lineRule="auto"/>
+            </w:pPr>
+            <w:r>
+              <w:rPr>
+                <w:color w:val="000000"/>
+                <w:sz w:val="19"/>
+              </w:rPr>
+              <w:t xml:space="preserve">Prepared engine</w:t>
+            </w:r>
+          </w:p>
+        </w:tc>
+        <w:tc>
+          <w:tcPr>
+            <w:tcW w:w="7160" w:type="dxa"/>
+            <w:shd w:fill="FFFFFF"/>
+            <w:vAlign w:val="center"/>
+          </w:tcPr>
+          <w:p>
+            <w:pPr>
+              <w:pStyle w:val="Normal"/>
+              <w:spacing w:after="120" w:line="264" w:lineRule="auto"/>
+            </w:pPr>
+            <w:r>
+              <w:rPr>
+                <w:color w:val="000000"/>
+                <w:sz w:val="19"/>
+              </w:rPr>
+              <w:t xml:space="preserve">16 MiB aggregate allowance and at most two managed versions; unknown or edited originals remain preserved.</w:t>
+            </w:r>
+          </w:p>
+        </w:tc>
+      </w:tr>
+      <w:tr>
+        <w:trPr>
+          <w:cantSplit/>
+        </w:trPr>
+        <w:tc>
+          <w:tcPr>
+            <w:tcW w:w="2200" w:type="dxa"/>
+            <w:shd w:fill="F4F6F8"/>
+            <w:vAlign w:val="center"/>
+          </w:tcPr>
+          <w:p>
+            <w:pPr>
+              <w:pStyle w:val="Normal"/>
+              <w:spacing w:after="120" w:line="264" w:lineRule="auto"/>
+            </w:pPr>
+            <w:r>
+              <w:rPr>
+                <w:color w:val="000000"/>
+                <w:sz w:val="19"/>
+              </w:rPr>
+              <w:t xml:space="preserve">Job working data</w:t>
+            </w:r>
+          </w:p>
+        </w:tc>
+        <w:tc>
+          <w:tcPr>
+            <w:tcW w:w="7160" w:type="dxa"/>
+            <w:shd w:fill="F4F6F8"/>
+            <w:vAlign w:val="center"/>
+          </w:tcPr>
+          <w:p>
+            <w:pPr>
+              <w:pStyle w:val="Normal"/>
+              <w:spacing w:after="120" w:line="264" w:lineRule="auto"/>
+            </w:pPr>
+            <w:r>
+              <w:rPr>
+                <w:color w:val="000000"/>
+                <w:sz w:val="19"/>
+              </w:rPr>
+              <w:t xml:space="preserve">Default 256 MiB, configurable from 64 to 1024 MiB; native growth is monitored rather than filesystem-quota enforced.</w:t>
+            </w:r>
+          </w:p>
+        </w:tc>
+      </w:tr>
+      <w:tr>
+        <w:trPr>
+          <w:cantSplit/>
+        </w:trPr>
+        <w:tc>
+          <w:tcPr>
+            <w:tcW w:w="2200" w:type="dxa"/>
+            <w:shd w:fill="FFFFFF"/>
+            <w:vAlign w:val="center"/>
+          </w:tcPr>
+          <w:p>
+            <w:pPr>
+              <w:pStyle w:val="Normal"/>
+              <w:spacing w:after="120" w:line="264" w:lineRule="auto"/>
+            </w:pPr>
+            <w:r>
+              <w:rPr>
+                <w:color w:val="000000"/>
+                <w:sz w:val="19"/>
+              </w:rPr>
+              <w:t xml:space="preserve">Retained reports</w:t>
+            </w:r>
+          </w:p>
+        </w:tc>
+        <w:tc>
+          <w:tcPr>
+            <w:tcW w:w="7160" w:type="dxa"/>
+            <w:shd w:fill="FFFFFF"/>
+            <w:vAlign w:val="center"/>
+          </w:tcPr>
+          <w:p>
+            <w:pPr>
+              <w:pStyle w:val="Normal"/>
+              <w:spacing w:after="120" w:line="264" w:lineRule="auto"/>
+            </w:pPr>
+            <w:r>
+              <w:rPr>
+                <w:color w:val="000000"/>
+                <w:sz w:val="19"/>
+              </w:rPr>
+              <w:t xml:space="preserve">At most eight report sets; default 64 MiB aggregate, configurable from 8 to 256 MiB. Cleanup must verify the exact managed artifacts.</w:t>
+            </w:r>
+          </w:p>
+        </w:tc>
+      </w:tr>
+    </w:tbl>
+    <w:p>
+      <w:pPr>
+        <w:pStyle w:val="Normal"/>
+        <w:spacing w:after="120" w:line="264" w:lineRule="auto"/>
+      </w:pPr>
+      <w:r>
+        <w:rPr>
+          <w:color w:val="000000"/>
+          <w:sz w:val="22"/>
+        </w:rPr>
+        <w:t xml:space="preserve"/>
+      </w:r>
+    </w:p>
+    <w:p>
+      <w:pPr>
+        <w:pStyle w:val="Normal"/>
+        <w:spacing w:after="120" w:line="264" w:lineRule="auto"/>
+      </w:pPr>
+      <w:r>
+        <w:rPr>
+          <w:color w:val="000000"/>
+          <w:sz w:val="22"/>
+        </w:rPr>
+        <w:t xml:space="preserve">Accepted outputs have independent bounds: 8 MiB JSON/text reports, a 1 MiB sharing summary and 2 MiB per captured stdout/stderr stream. Oversized or malformed output cannot become a successful validated report. Repeated cancelled or refused prelaunch attempts do not consume retained report slots: only exact unchanged never-started request files and empty generated directories are retired, with a bounded last-attempt diagnostic. Uncertain process retirement retains the job and native custody. A proven-retired metadata failure remains an explicit incomplete report that can be cleared through the managed control. Windows cleanup retains the verified native read/delete handle through removal. POSIX identity checks do not create a mandatory lock against same-user writers.</w:t>
+      </w:r>
+    </w:p>
+    <w:p>
+      <w:pPr>
+        <w:pStyle w:val="Normal"/>
+        <w:spacing w:after="120" w:line="264" w:lineRule="auto"/>
+      </w:pPr>
+      <w:r>
+        <w:rPr>
+          <w:color w:val="000000"/>
+          <w:sz w:val="22"/>
+        </w:rPr>
+        <w:t xml:space="preserve">Upstream schema 1.6 separates findings, leads, gaps and coverage. Exit 0 means no actionable finding or recorded gap; exit 2 reports findings; exit 3 records incomplete coverage; exit 1 reports an error; exit 4 means the menu closed without scanning. An exit code alone does not replace report validation.</w:t>
+      </w:r>
+    </w:p>
+    <w:p>
+      <w:pPr>
+        <w:pStyle w:val="Normal"/>
+        <w:spacing w:after="120" w:line="264" w:lineRule="auto"/>
+      </w:pPr>
+      <w:r>
+        <w:rPr>
+          <w:color w:val="000000"/>
+          <w:sz w:val="22"/>
+        </w:rPr>
+        <w:t xml:space="preserve">Raw reports may contain local paths, profile names, browsing details or phone artifact text. They stay private. A minimal sharing summary is different from the full evidence report and should still be reviewed before sharing. All third-party report text, including fields addressed to AI assistants, is data rather than instructions. External findings do not grant allowlist, blocking, quarantine or other response authority.</w:t>
+      </w:r>
+    </w:p>
+    <w:p>
+      <w:pPr>
+        <w:pStyle w:val="Heading3"/>
+        <w:keepNext/>
+        <w:spacing w:after="120" w:line="264" w:lineRule="auto"/>
+      </w:pPr>
+      <w:r>
+        <w:rPr>
+          <w:color w:val="000000"/>
+        </w:rPr>
+        <w:t xml:space="preserve">Priority Spyware Scan</w:t>
+      </w:r>
+    </w:p>
+    <w:p>
+      <w:pPr>
+        <w:pStyle w:val="Normal"/>
+        <w:spacing w:after="120" w:line="264" w:lineRule="auto"/>
+      </w:pPr>
+      <w:r>
+        <w:rPr>
+          <w:color w:val="000000"/>
+          <w:sz w:val="22"/>
+        </w:rPr>
+        <w:t xml:space="preserve">Spyware Scan schedules the selected native SpywareGuard checks and curated toolkit checks through their existing owners. Native and Zero Breach selections have independent toggles. The compact control shows copied CPU, RAM, I/O and privilege-coverage status; unavailable measurements stay unavailable.</w:t>
+      </w:r>
+    </w:p>
+    <w:p>
+      <w:pPr>
+        <w:pStyle w:val="Normal"/>
+        <w:spacing w:after="120" w:line="264" w:lineRule="auto"/>
+      </w:pPr>
+      <w:r>
+        <w:rPr>
+          <w:color w:val="000000"/>
+          <w:sz w:val="22"/>
+        </w:rPr>
+        <w:t xml:space="preserve">Settings retain the priority and resource choices. Above normal is the default; High is the supported operating-system ceiling. REALTIME priority is not used. The default requested routine-background pace is 10% while the priority scan is active. That is scheduling intent, not a guarantee that other programs or modules will consume exactly 10% CPU. Critical control, watchdog/heartbeat work and event intake keep their own cadence. Limits and cancellation remain subject to actual platform support and the scan's native process custody.</w:t>
+      </w:r>
+    </w:p>
+    <w:p>
+      <w:pPr>
+        <w:pStyle w:val="Normal"/>
+        <w:spacing w:after="120" w:line="264" w:lineRule="auto"/>
+      </w:pPr>
+      <w:r>
+        <w:rPr>
+          <w:color w:val="000000"/>
+          <w:sz w:val="22"/>
+        </w:rPr>
+        <w:t xml:space="preserve">Privilege verification reports current coverage; it does not silently grant Administrator rights. A tool report or resource graph is not a detection-rate benchmark, proof of full collection or permission to terminate a process.</w:t>
+      </w:r>
+    </w:p>
+    <w:p>
+      <w:pPr>
+        <w:pStyle w:val="Heading3"/>
+        <w:keepNext/>
+        <w:spacing w:after="120" w:line="264" w:lineRule="auto"/>
+      </w:pPr>
+      <w:r>
+        <w:rPr>
+          <w:color w:val="000000"/>
+        </w:rPr>
+        <w:t xml:space="preserve">Analysis and sandbox controls</w:t>
+      </w:r>
+    </w:p>
+    <w:p>
+      <w:pPr>
+        <w:pStyle w:val="Normal"/>
+        <w:spacing w:after="120" w:line="264" w:lineRule="auto"/>
+      </w:pPr>
+      <w:r>
+        <w:rPr>
+          <w:color w:val="000000"/>
+          <w:sz w:val="22"/>
+        </w:rPr>
+        <w:t xml:space="preserve">Source Library retains the existing pinned GitHub import/review workflow. Imported repositories remain data-only archives; marking one reviewed does not install it or make it runnable. A curated execution adapter and its fixed artifact are a separate maintained integration.</w:t>
+      </w:r>
+    </w:p>
+    <w:p>
+      <w:pPr>
+        <w:pStyle w:val="Normal"/>
+        <w:spacing w:after="120" w:line="264" w:lineRule="auto"/>
+      </w:pPr>
+      <w:r>
+        <w:rPr>
+          <w:color w:val="000000"/>
+          <w:sz w:val="22"/>
+        </w:rPr>
+        <w:t xml:space="preserve">Analysis/Sandbox opens the existing source-analysis facilities and their readiness controls. A host-evidence scan reads the host and is not a VM-isolated scan. The upstream Python socket guard is not an operating-system network or filesystem sandbox. Existing Analysis Lab acceptance holds remain meaningful; opening this page does not establish a working hypervisor or sandbox.</w:t>
+      </w:r>
+    </w:p>
+    <w:p>
+      <w:pPr>
+        <w:pStyle w:val="Heading3"/>
+        <w:keepNext/>
+        <w:spacing w:after="120" w:line="264" w:lineRule="auto"/>
+      </w:pPr>
+      <w:r>
+        <w:rPr>
+          <w:color w:val="000000"/>
+        </w:rPr>
+        <w:t xml:space="preserve">Credits, licenses and integrity</w:t>
+      </w:r>
+    </w:p>
+    <w:p>
+      <w:pPr>
+        <w:pStyle w:val="Normal"/>
+        <w:spacing w:after="120" w:line="264" w:lineRule="auto"/>
+      </w:pPr>
+      <w:r>
+        <w:rPr>
+          <w:color w:val="000000"/>
+          <w:sz w:val="22"/>
+        </w:rPr>
+        <w:t xml:space="preserve">The visible Credits control links to each curated project's repository, source commit, release and license notices. Imported source-library entries retain their own repository/version/license metadata; that metadata is separate from Angerona's curated execution catalog.</w:t>
+      </w:r>
+    </w:p>
+    <w:tbl>
+      <w:tblPr>
+        <w:tblW w:w="9360" w:type="dxa"/>
+        <w:tblLayout w:type="fixed"/>
+        <w:tblBorders>
+          <w:top w:val="single" w:sz="4" w:color="D9D9D9"/>
+          <w:left w:val="single" w:sz="4" w:color="D9D9D9"/>
+          <w:bottom w:val="single" w:sz="4" w:color="D9D9D9"/>
+          <w:right w:val="single" w:sz="4" w:color="D9D9D9"/>
+          <w:insideH w:val="single" w:sz="4" w:color="D9D9D9"/>
+          <w:insideV w:val="single" w:sz="4" w:color="D9D9D9"/>
+        </w:tblBorders>
+        <w:tblCellMar>
+          <w:top w:w="100" w:type="dxa"/>
+          <w:left w:w="110" w:type="dxa"/>
+          <w:bottom w:w="100" w:type="dxa"/>
+          <w:right w:w="110" w:type="dxa"/>
+        </w:tblCellMar>
+      </w:tblPr>
+      <w:tblGrid>
+        <w:gridCol w:w="2400"/>
+        <w:gridCol w:w="3480"/>
+        <w:gridCol w:w="3480"/>
+      </w:tblGrid>
+      <w:tr>
+        <w:trPr>
+          <w:cantSplit/>
+          <w:tblHeader/>
+        </w:trPr>
+        <w:tc>
+          <w:tcPr>
+            <w:tcW w:w="2400" w:type="dxa"/>
+            <w:shd w:fill="DCE7F0"/>
+            <w:vAlign w:val="center"/>
+          </w:tcPr>
+          <w:p>
+            <w:pPr>
+              <w:pStyle w:val="Normal"/>
+              <w:spacing w:after="120" w:line="264" w:lineRule="auto"/>
+            </w:pPr>
+            <w:r>
+              <w:rPr>
+                <w:b/>
+                <w:color w:val="000000"/>
+                <w:sz w:val="19"/>
+              </w:rPr>
+              <w:t xml:space="preserve">Component</w:t>
+            </w:r>
+          </w:p>
+        </w:tc>
+        <w:tc>
+          <w:tcPr>
+            <w:tcW w:w="3480" w:type="dxa"/>
+            <w:shd w:fill="DCE7F0"/>
+            <w:vAlign w:val="center"/>
+          </w:tcPr>
+          <w:p>
+            <w:pPr>
+              <w:pStyle w:val="Normal"/>
+              <w:spacing w:after="120" w:line="264" w:lineRule="auto"/>
+            </w:pPr>
+            <w:r>
+              <w:rPr>
+                <w:b/>
+                <w:color w:val="000000"/>
+                <w:sz w:val="19"/>
+              </w:rPr>
+              <w:t xml:space="preserve">Author / source</w:t>
+            </w:r>
+          </w:p>
+        </w:tc>
+        <w:tc>
+          <w:tcPr>
+            <w:tcW w:w="3480" w:type="dxa"/>
+            <w:shd w:fill="DCE7F0"/>
+            <w:vAlign w:val="center"/>
+          </w:tcPr>
+          <w:p>
+            <w:pPr>
+              <w:pStyle w:val="Normal"/>
+              <w:spacing w:after="120" w:line="264" w:lineRule="auto"/>
+            </w:pPr>
+            <w:r>
+              <w:rPr>
+                <w:b/>
+                <w:color w:val="000000"/>
+                <w:sz w:val="19"/>
+              </w:rPr>
+              <w:t xml:space="preserve">Terms retained with the bundle</w:t>
+            </w:r>
+          </w:p>
+        </w:tc>
+      </w:tr>
+      <w:tr>
+        <w:trPr>
+          <w:cantSplit/>
+        </w:trPr>
+        <w:tc>
+          <w:tcPr>
+            <w:tcW w:w="2400" w:type="dxa"/>
+            <w:shd w:fill="FFFFFF"/>
+            <w:vAlign w:val="center"/>
+          </w:tcPr>
+          <w:p>
+            <w:pPr>
+              <w:pStyle w:val="Normal"/>
+              <w:spacing w:after="120" w:line="264" w:lineRule="auto"/>
+            </w:pPr>
+            <w:r>
+              <w:rPr>
+                <w:color w:val="000000"/>
+                <w:sz w:val="19"/>
+              </w:rPr>
+              <w:t xml:space="preserve">Zero Breach Toolkit code</w:t>
+            </w:r>
+          </w:p>
+        </w:tc>
+        <w:tc>
+          <w:tcPr>
+            <w:tcW w:w="3480" w:type="dxa"/>
+            <w:shd w:fill="FFFFFF"/>
+            <w:vAlign w:val="center"/>
+          </w:tcPr>
+          <w:p>
+            <w:pPr>
+              <w:pStyle w:val="Normal"/>
+              <w:spacing w:after="120" w:line="264" w:lineRule="auto"/>
+            </w:pPr>
+            <w:r>
+              <w:rPr>
+                <w:color w:val="000000"/>
+                <w:sz w:val="19"/>
+              </w:rPr>
+              <w:t xml:space="preserve">archivegenocide.com / interplains</w:t>
+            </w:r>
+          </w:p>
+        </w:tc>
+        <w:tc>
+          <w:tcPr>
+            <w:tcW w:w="3480" w:type="dxa"/>
+            <w:shd w:fill="FFFFFF"/>
+            <w:vAlign w:val="center"/>
+          </w:tcPr>
+          <w:p>
+            <w:pPr>
+              <w:pStyle w:val="Normal"/>
+              <w:spacing w:after="120" w:line="264" w:lineRule="auto"/>
+            </w:pPr>
+            <w:r>
+              <w:rPr>
+                <w:color w:val="000000"/>
+                <w:sz w:val="19"/>
+              </w:rPr>
+              <w:t xml:space="preserve">Apache-2.0; original LICENSE, NOTICE and PRIVACY.md</w:t>
+            </w:r>
+          </w:p>
+        </w:tc>
+      </w:tr>
+      <w:tr>
+        <w:trPr>
+          <w:cantSplit/>
+        </w:trPr>
+        <w:tc>
+          <w:tcPr>
+            <w:tcW w:w="2400" w:type="dxa"/>
+            <w:shd w:fill="F4F6F8"/>
+            <w:vAlign w:val="center"/>
+          </w:tcPr>
+          <w:p>
+            <w:pPr>
+              <w:pStyle w:val="Normal"/>
+              <w:spacing w:after="120" w:line="264" w:lineRule="auto"/>
+            </w:pPr>
+            <w:r>
+              <w:rPr>
+                <w:color w:val="000000"/>
+                <w:sz w:val="19"/>
+              </w:rPr>
+              <w:t xml:space="preserve">Curated indicator data</w:t>
+            </w:r>
+          </w:p>
+        </w:tc>
+        <w:tc>
+          <w:tcPr>
+            <w:tcW w:w="3480" w:type="dxa"/>
+            <w:shd w:fill="F4F6F8"/>
+            <w:vAlign w:val="center"/>
+          </w:tcPr>
+          <w:p>
+            <w:pPr>
+              <w:pStyle w:val="Normal"/>
+              <w:spacing w:after="120" w:line="264" w:lineRule="auto"/>
+            </w:pPr>
+            <w:r>
+              <w:rPr>
+                <w:color w:val="000000"/>
+                <w:sz w:val="19"/>
+              </w:rPr>
+              <w:t xml:space="preserve">Published research, curated by the toolkit authors</w:t>
+            </w:r>
+          </w:p>
+        </w:tc>
+        <w:tc>
+          <w:tcPr>
+            <w:tcW w:w="3480" w:type="dxa"/>
+            <w:shd w:fill="F4F6F8"/>
+            <w:vAlign w:val="center"/>
+          </w:tcPr>
+          <w:p>
+            <w:pPr>
+              <w:pStyle w:val="Normal"/>
+              <w:spacing w:after="120" w:line="264" w:lineRule="auto"/>
+            </w:pPr>
+            <w:r>
+              <w:rPr>
+                <w:color w:val="000000"/>
+                <w:sz w:val="19"/>
+              </w:rPr>
+              <w:t xml:space="preserve">CC0-1.0; iocs/LICENSE.md retains the research citations</w:t>
+            </w:r>
+          </w:p>
+        </w:tc>
+      </w:tr>
+      <w:tr>
+        <w:trPr>
+          <w:cantSplit/>
+        </w:trPr>
+        <w:tc>
+          <w:tcPr>
+            <w:tcW w:w="2400" w:type="dxa"/>
+            <w:shd w:fill="FFFFFF"/>
+            <w:vAlign w:val="center"/>
+          </w:tcPr>
+          <w:p>
+            <w:pPr>
+              <w:pStyle w:val="Normal"/>
+              <w:spacing w:after="120" w:line="264" w:lineRule="auto"/>
+            </w:pPr>
+            <w:r>
+              <w:rPr>
+                <w:color w:val="000000"/>
+                <w:sz w:val="19"/>
+              </w:rPr>
+              <w:t xml:space="preserve">MAL_DevilsTongue_HijackDll</w:t>
+            </w:r>
+          </w:p>
+        </w:tc>
+        <w:tc>
+          <w:tcPr>
+            <w:tcW w:w="3480" w:type="dxa"/>
+            <w:shd w:fill="FFFFFF"/>
+            <w:vAlign w:val="center"/>
+          </w:tcPr>
+          <w:p>
+            <w:pPr>
+              <w:pStyle w:val="Normal"/>
+              <w:spacing w:after="120" w:line="264" w:lineRule="auto"/>
+            </w:pPr>
+            <w:r>
+              <w:rPr>
+                <w:color w:val="000000"/>
+                <w:sz w:val="19"/>
+              </w:rPr>
+              <w:t xml:space="preserve">Microsoft Threat Intelligence Center (MSTIC), via Signature-Base</w:t>
+            </w:r>
+          </w:p>
+        </w:tc>
+        <w:tc>
+          <w:tcPr>
+            <w:tcW w:w="3480" w:type="dxa"/>
+            <w:shd w:fill="FFFFFF"/>
+            <w:vAlign w:val="center"/>
+          </w:tcPr>
+          <w:p>
+            <w:pPr>
+              <w:pStyle w:val="Normal"/>
+              <w:spacing w:after="120" w:line="264" w:lineRule="auto"/>
+            </w:pPr>
+            <w:r>
+              <w:rPr>
+                <w:color w:val="000000"/>
+                <w:sz w:val="19"/>
+              </w:rPr>
+              <w:t xml:space="preserve">Detection Rule License 1.1; author attribution must remain in match messages</w:t>
+            </w:r>
+          </w:p>
+        </w:tc>
+      </w:tr>
+      <w:tr>
+        <w:trPr>
+          <w:cantSplit/>
+        </w:trPr>
+        <w:tc>
+          <w:tcPr>
+            <w:tcW w:w="2400" w:type="dxa"/>
+            <w:shd w:fill="F4F6F8"/>
+            <w:vAlign w:val="center"/>
+          </w:tcPr>
+          <w:p>
+            <w:pPr>
+              <w:pStyle w:val="Normal"/>
+              <w:spacing w:after="120" w:line="264" w:lineRule="auto"/>
+            </w:pPr>
+            <w:r>
+              <w:rPr>
+                <w:color w:val="000000"/>
+                <w:sz w:val="19"/>
+              </w:rPr>
+              <w:t xml:space="preserve">win_devilstongue_auto</w:t>
+            </w:r>
+          </w:p>
+        </w:tc>
+        <w:tc>
+          <w:tcPr>
+            <w:tcW w:w="3480" w:type="dxa"/>
+            <w:shd w:fill="F4F6F8"/>
+            <w:vAlign w:val="center"/>
+          </w:tcPr>
+          <w:p>
+            <w:pPr>
+              <w:pStyle w:val="Normal"/>
+              <w:spacing w:after="120" w:line="264" w:lineRule="auto"/>
+            </w:pPr>
+            <w:r>
+              <w:rPr>
+                <w:color w:val="000000"/>
+                <w:sz w:val="19"/>
+              </w:rPr>
+              <w:t xml:space="preserve">Felix Bilstein, via Malpedia</w:t>
+            </w:r>
+          </w:p>
+        </w:tc>
+        <w:tc>
+          <w:tcPr>
+            <w:tcW w:w="3480" w:type="dxa"/>
+            <w:shd w:fill="F4F6F8"/>
+            <w:vAlign w:val="center"/>
+          </w:tcPr>
+          <w:p>
+            <w:pPr>
+              <w:pStyle w:val="Normal"/>
+              <w:spacing w:after="120" w:line="264" w:lineRule="auto"/>
+            </w:pPr>
+            <w:r>
+              <w:rPr>
+                <w:color w:val="000000"/>
+                <w:sz w:val="19"/>
+              </w:rPr>
+              <w:t xml:space="preserve">CC BY-SA 4.0; unchanged rule, author, original and license links</w:t>
+            </w:r>
+          </w:p>
+        </w:tc>
+      </w:tr>
+    </w:tbl>
+    <w:p>
+      <w:pPr>
+        <w:pStyle w:val="Normal"/>
+        <w:spacing w:after="120" w:line="264" w:lineRule="auto"/>
+      </w:pPr>
+      <w:r>
+        <w:rPr>
+          <w:color w:val="000000"/>
+          <w:sz w:val="22"/>
+        </w:rPr>
+        <w:t xml:space="preserve"/>
+      </w:r>
+    </w:p>
+    <w:p>
+      <w:pPr>
+        <w:pStyle w:val="Normal"/>
+        <w:spacing w:after="120" w:line="264" w:lineRule="auto"/>
+      </w:pPr>
+      <w:r>
+        <w:rPr>
+          <w:color w:val="000000"/>
+          <w:sz w:val="22"/>
+        </w:rPr>
+        <w:t xml:space="preserve">The upstream NOTICE names The Citizen Lab, Confiant, Recorded Future / Insikt Group, Amnesty International Security Lab, Access Now, Microsoft, ESET, Avast / Gen, Google Threat Analysis Group, the MVT project, Echap, Kaspersky, Rapid7 / Velociraptor and SigmaHQ as research/help sources. These citations do not imply affiliation or endorsement of either project. Optional dependencies retain their separate licenses.</w:t>
+      </w:r>
+    </w:p>
+    <w:p>
+      <w:pPr>
+        <w:pStyle w:val="Normal"/>
+        <w:spacing w:after="120" w:line="264" w:lineRule="auto"/>
+      </w:pPr>
+      <w:r>
+        <w:rPr>
+          <w:color w:val="000000"/>
+          <w:sz w:val="22"/>
+        </w:rPr>
+        <w:t xml:space="preserve">The catalog pins release commit 81bd556ba604685dbd1c0ecb48138c10f43cccf8 and the 968,987-byte single-file engine's SHA-256:</w:t>
+      </w:r>
+    </w:p>
+    <w:p>
+      <w:pPr>
+        <w:pStyle w:val="Normal"/>
+        <w:spacing w:after="120" w:line="264" w:lineRule="auto"/>
+      </w:pPr>
+      <w:r>
+        <w:rPr>
+          <w:color w:val="000000"/>
+          <w:sz w:val="19"/>
+        </w:rPr>
+        <w:t xml:space="preserve">075b2a0ac20f285fa4385d6b6c5cda2cedd410364c4f4686db3c1b8b033265d3</w:t>
+      </w:r>
+    </w:p>
+    <w:p>
+      <w:pPr>
+        <w:pStyle w:val="Normal"/>
+        <w:spacing w:after="120" w:line="264" w:lineRule="auto"/>
+      </w:pPr>
+      <w:r>
+        <w:rPr>
+          <w:color w:val="000000"/>
+          <w:sz w:val="22"/>
+        </w:rPr>
+        <w:t xml:space="preserve">Original published checksums, signatures and the public key are retained under verification/. Their byte identities were checked against the official release metadata. Independent trust in that signing key and cryptographic signature verification were not established by this integration. A pinned hash proves the selected bytes, not that a third-party program or the host is free of defects. A report of no known indicators found is not proof that a device is clean.</w:t>
       </w:r>
     </w:p>
     <w:p>
@@ -21578,7 +23639,7 @@
           <w:color w:val="000000"/>
           <w:sz w:val="22"/>
         </w:rPr>
-        <w:t xml:space="preserve">Figure 3 startup flow</w:t>
+        <w:t xml:space="preserve">Figure 5 startup flow</w:t>
       </w:r>
     </w:p>
     <w:p>
@@ -22730,6 +24791,7 @@
     <w:p>
       <w:pPr>
         <w:pStyle w:val="Heading2"/>
+        <w:pageBreakBefore/>
         <w:keepNext/>
         <w:spacing w:after="120" w:line="264" w:lineRule="auto"/>
       </w:pPr>
@@ -22737,7 +24799,7 @@
         <w:rPr>
           <w:color w:val="000000"/>
         </w:rPr>
-        <w:t xml:space="preserve">Primary platform and protocol references</w:t>
+        <w:t xml:space="preserve">Primary platform and toolkit references</w:t>
       </w:r>
     </w:p>
     <w:p>
@@ -22803,6 +24865,71 @@
           <w:sz w:val="19"/>
         </w:rPr>
         <w:t xml:space="preserve">https://docs.github.com/en/rest/git/trees</w:t>
+      </w:r>
+    </w:p>
+    <w:p>
+      <w:pPr>
+        <w:pStyle w:val="Normal"/>
+        <w:spacing w:after="0" w:line="264" w:lineRule="auto"/>
+      </w:pPr>
+      <w:r>
+        <w:rPr>
+          <w:color w:val="000000"/>
+          <w:sz w:val="19"/>
+        </w:rPr>
+        <w:t xml:space="preserve">https://learn.microsoft.com/en-us/powershell/module/netsecurity/get-netfirewallprofile?view=windowsserver2025-ps</w:t>
+      </w:r>
+    </w:p>
+    <w:p>
+      <w:pPr>
+        <w:pStyle w:val="Normal"/>
+        <w:spacing w:after="0" w:line="264" w:lineRule="auto"/>
+      </w:pPr>
+      <w:r>
+        <w:rPr>
+          <w:color w:val="000000"/>
+          <w:sz w:val="19"/>
+        </w:rPr>
+        <w:t xml:space="preserve">https://learn.microsoft.com/en-us/windows/win32/api/netfw/nf-netfw-inetfwpolicy2-get_localpolicymodifystate</w:t>
+      </w:r>
+    </w:p>
+    <w:p>
+      <w:pPr>
+        <w:pStyle w:val="Normal"/>
+        <w:spacing w:after="0" w:line="264" w:lineRule="auto"/>
+      </w:pPr>
+      <w:r>
+        <w:rPr>
+          <w:color w:val="000000"/>
+          <w:sz w:val="19"/>
+        </w:rPr>
+        <w:t xml:space="preserve">https://github.com/interplains/Zero-Breach-Toolkit/releases/tag/v0.1.10</w:t>
+      </w:r>
+    </w:p>
+    <w:p>
+      <w:pPr>
+        <w:pStyle w:val="Normal"/>
+        <w:spacing w:after="0" w:line="264" w:lineRule="auto"/>
+      </w:pPr>
+      <w:r>
+        <w:rPr>
+          <w:color w:val="000000"/>
+          <w:sz w:val="19"/>
+        </w:rPr>
+        <w:t xml:space="preserve">https://github.com/interplains/Zero-Breach-Toolkit/blob/81bd556ba604685dbd1c0ecb48138c10f43cccf8/scan/CONTRACT.md</w:t>
+      </w:r>
+    </w:p>
+    <w:p>
+      <w:pPr>
+        <w:pStyle w:val="Normal"/>
+        <w:spacing w:after="0" w:line="264" w:lineRule="auto"/>
+      </w:pPr>
+      <w:r>
+        <w:rPr>
+          <w:color w:val="000000"/>
+          <w:sz w:val="19"/>
+        </w:rPr>
+        <w:t xml:space="preserve">https://github.com/interplains/Zero-Breach-Toolkit/blob/81bd556ba604685dbd1c0ecb48138c10f43cccf8/PRIVACY.md</w:t>
       </w:r>
     </w:p>
     <!-- ANGERONA_SECURITY_FLOW_END -->
@@ -22942,7 +25069,7 @@
         <w:color w:val="667085"/>
         <w:sz w:val="17"/>
       </w:rPr>
-      <w:t>Angerona Suite  |  v1.14.1  |  28 October 2026</w:t>
+      <w:t>Angerona Suite  |  v1.14.2  |  29 October 2026</w:t>
     </w:r>
   </w:p>
 </w:ftr>
@@ -22982,7 +25109,7 @@
         <w:color w:val="667085"/>
         <w:sz w:val="17"/>
       </w:rPr>
-      <w:t>ANGERONA  |  MASTER MANUAL  |  v1.14.1</w:t>
+      <w:t>ANGERONA  |  MASTER MANUAL  |  v1.14.2</w:t>
     </w:r>
   </w:p>
 </w:hdr>

</xml_diff>

<commit_message>
Clarify SpywareScan progress and fit auxiliary workspaces
</commit_message>
<xml_diff>
--- a/Angerona_Master_Manual.docx
+++ b/Angerona_Master_Manual.docx
@@ -23051,7 +23051,33 @@
           <w:color w:val="000000"/>
           <w:sz w:val="22"/>
         </w:rPr>
-        <w:t xml:space="preserve">Spyware Scan schedules the selected native SpywareGuard checks and curated toolkit checks through their existing owners. Native and Zero Breach selections have independent toggles. The compact control shows copied CPU, RAM, I/O and privilege-coverage status; unavailable measurements stay unavailable.</w:t>
+        <w:t xml:space="preserve">Spyware Scan schedules the selected native SpywareGuard checks and curated toolkit checks through their existing owners. The red SpywareScan button uses separate Scope, Included checks, Progress, What's happening now and Resource and privilege details sections. Native and Zero Breach selections have independent toggles. Resource details show copied CPU, RAM, I/O and privilege coverage; unavailable measurements stay unavailable.</w:t>
+      </w:r>
+    </w:p>
+    <w:p>
+      <w:pPr>
+        <w:pStyle w:val="Normal"/>
+        <w:spacing w:after="120" w:line="264" w:lineRule="auto"/>
+      </w:pPr>
+      <w:r>
+        <w:rPr>
+          <w:color w:val="000000"/>
+          <w:sz w:val="22"/>
+        </w:rPr>
+        <w:t xml:space="preserve">Entire PC is the initial scope. Click the scope control to choose browser checks or selected local evidence. Entire PC requests the toolkit's supported system-wide checks; it does not promise examination of every file or privileged collection. Scrolling the page does not change scan options. Status refreshes preserve the selected scope, inputs, open details and review position.</w:t>
+      </w:r>
+    </w:p>
+    <w:p>
+      <w:pPr>
+        <w:pStyle w:val="Normal"/>
+        <w:spacing w:after="120" w:line="264" w:lineRule="auto"/>
+      </w:pPr>
+      <w:r>
+        <w:rPr>
+          <w:color w:val="000000"/>
+          <w:sz w:val="22"/>
+        </w:rPr>
+        <w:t xml:space="preserve">The progress ring reports completed workflow stages: preparation, selected native checks, selected toolkit checks and report assembly. Its percentage is stage completion, not a file count or assurance that every check succeeded. Held or unavailable checks remain visible in the coverage summary. When valid stage counters are absent, progress is indeterminate. Animation follows active scan state, stops when hidden or idle and respects reduced-motion preferences. What's happening now explains the current stage; expand its details for collection limits, report handling and the next step.</w:t>
       </w:r>
     </w:p>
     <w:p>

</xml_diff>

<commit_message>
Track measured scan progress and fix isolated report creation
</commit_message>
<xml_diff>
--- a/Angerona_Master_Manual.docx
+++ b/Angerona_Master_Manual.docx
@@ -14800,6 +14800,19 @@
     </w:p>
     <w:p>
       <w:pPr>
+        <w:pStyle w:val="Normal"/>
+        <w:spacing w:after="120" w:line="264" w:lineRule="auto"/>
+      </w:pPr>
+      <w:r>
+        <w:rPr>
+          <w:color w:val="000000"/>
+          <w:sz w:val="22"/>
+        </w:rPr>
+        <w:t xml:space="preserve">Request-bound progress describes each selected check, its current task or observed file, elapsed time and available estimates. The toolkit worker publishes only a bounded latest snapshot under its owned job. Paths and activity text are untrusted display data; neither progress nor resource samples grant response authority. Timeout, incomplete coverage and native cancellation remain visible until the corresponding owner has settled.</w:t>
+      </w:r>
+    </w:p>
+    <w:p>
+      <w:pPr>
         <w:pStyle w:val="Heading3"/>
         <w:keepNext/>
         <w:spacing w:after="120" w:line="264" w:lineRule="auto"/>
@@ -23051,7 +23064,7 @@
           <w:color w:val="000000"/>
           <w:sz w:val="22"/>
         </w:rPr>
-        <w:t xml:space="preserve">Spyware Scan schedules the selected native SpywareGuard checks and curated toolkit checks through their existing owners. The red SpywareScan button uses separate Scope, Included checks, Progress, What's happening now and Resource and privilege details sections. Native and Zero Breach selections have independent toggles. Resource details show copied CPU, RAM, I/O and privilege coverage; unavailable measurements stay unavailable.</w:t>
+        <w:t xml:space="preserve">Spyware Scan schedules the selected native SpywareGuard checks and curated toolkit checks through their existing owners. The red SpywareScan button uses separate Scope, Included checks, Progress, What's happening now and Resource and privilege details sections. Native and Zero Breach selections have independent toggles. Resource details show the latest available toolkit-process CPU, RAM and I/O samples, process liveness and current privilege coverage; unavailable measurements stay unavailable.</w:t>
       </w:r>
     </w:p>
     <w:p>
@@ -23077,7 +23090,46 @@
           <w:color w:val="000000"/>
           <w:sz w:val="22"/>
         </w:rPr>
-        <w:t xml:space="preserve">The progress ring reports completed workflow stages: preparation, selected native checks, selected toolkit checks and report assembly. Its percentage is stage completion, not a file count or assurance that every check succeeded. Held or unavailable checks remain visible in the coverage summary. When valid stage counters are absent, progress is indeterminate. Animation follows active scan state, stops when hidden or idle and respects reduced-motion preferences. What's happening now explains the current stage; expand its details for collection limits, report handling and the next step.</w:t>
+        <w:t xml:space="preserve">Each selected scanner retains its own check rows with state, progress, current task, observed file or item, elapsed time and estimated time remaining. Known work counts advance that check's percentage; unknown totals remain explicit. An estimated time is shown only when measurements support it; otherwise the display says Calculating. The configured time budget is separate from that estimate. Overall progress combines the selected checks and remains below 100% while work or cancellation is still active. A percentage describes the requested workflow, not every file on the PC or a clean-host verdict.</w:t>
+      </w:r>
+    </w:p>
+    <w:p>
+      <w:pPr>
+        <w:pStyle w:val="Normal"/>
+        <w:spacing w:after="120" w:line="264" w:lineRule="auto"/>
+      </w:pPr>
+      <w:r>
+        <w:rPr>
+          <w:color w:val="000000"/>
+          <w:sz w:val="22"/>
+        </w:rPr>
+        <w:t xml:space="preserve">The latest activity and exact failure or timeout reason stay visible. Failed or cancelled checks retain their last progress and partial coverage. Stopping means the owned work is still draining; it does not mean retirement was proved. Native SpywareGuard's continuous monitoring status is separate from the requested priority scan. A stopped toolkit does not establish that every selected native check has stopped. A new request waits for its prior owner to settle.</w:t>
+      </w:r>
+    </w:p>
+    <w:p>
+      <w:pPr>
+        <w:pStyle w:val="Normal"/>
+        <w:spacing w:after="120" w:line="264" w:lineRule="auto"/>
+      </w:pPr>
+      <w:r>
+        <w:rPr>
+          <w:color w:val="000000"/>
+          <w:sz w:val="22"/>
+        </w:rPr>
+        <w:t xml:space="preserve">Large browser profiles can exceed a short time budget. Adjust the per-run budget and retry when appropriate; this does not silently overwrite saved preferences. Saved budgets above five minutes must reach the operation owner rather than being clamped to a five-minute constructor default. Deadline expiry remains incomplete coverage, with preserved diagnostics. Animation follows active visible work and respects reduced-motion preferences. Expand What's happening now for collection limits, report handling and next steps; live refreshes retain the review position.</w:t>
+      </w:r>
+    </w:p>
+    <w:p>
+      <w:pPr>
+        <w:pStyle w:val="Normal"/>
+        <w:spacing w:after="120" w:line="264" w:lineRule="auto"/>
+      </w:pPr>
+      <w:r>
+        <w:rPr>
+          <w:color w:val="000000"/>
+          <w:sz w:val="22"/>
+        </w:rPr>
+        <w:t xml:space="preserve">Toolkit progress crosses a bounded, job-bound latest-snapshot channel from the separate worker. It does not create a growing per-file log. Current file names and toolkit activity text are untrusted display data; they cannot grant trust, change a baseline or authorize response. The pinned upstream engine and license bytes remain unchanged.</w:t>
       </w:r>
     </w:p>
     <w:p>

</xml_diff>

<commit_message>
Open shared after-action review when spyware scans finish
</commit_message>
<xml_diff>
--- a/Angerona_Master_Manual.docx
+++ b/Angerona_Master_Manual.docx
@@ -23130,6 +23130,19 @@
           <w:sz w:val="22"/>
         </w:rPr>
         <w:t xml:space="preserve">Toolkit progress crosses a bounded, job-bound latest-snapshot channel from the separate worker. It does not create a growing per-file log. Current file names and toolkit activity text are untrusted display data; they cannot grant trust, change a baseline or authorize response. The pinned upstream engine and license bytes remain unchanged.</w:t>
+      </w:r>
+    </w:p>
+    <w:p>
+      <w:pPr>
+        <w:pStyle w:val="Normal"/>
+        <w:spacing w:after="120" w:line="264" w:lineRule="auto"/>
+      </w:pPr>
+      <w:r>
+        <w:rPr>
+          <w:color w:val="000000"/>
+          <w:sz w:val="22"/>
+        </w:rPr>
+        <w:t xml:space="preserve">After the requested scan finishes and both selected scanners have stopped, one after-action report opens automatically. It includes completed, cancelled, failed and incomplete outcomes with their retained findings and coverage gaps. Investigate and Trace reopen the same review; dismissing it does not repeat the scan. External-tool findings remain leads and do not authorize containment.</w:t>
       </w:r>
     </w:p>
     <w:p>

</xml_diff>

<commit_message>
Release Angerona 1.15 hardening controls and residual risk review
Add provider-specific telemetry assurance, WER precursor correlation, retained containment custody, independent recorder epochs and freshness, isolated service admission, governed driver-policy execution, rollback review and TPM verification plans. Include bounded lifecycle and logging fixes, source version metadata, demo assets, a rendered security report and updated manual. Preserve explicit deployment, coverage and unresolved native availability limits.
</commit_message>
<xml_diff>
--- a/Angerona_Master_Manual.docx
+++ b/Angerona_Master_Manual.docx
@@ -112,7 +112,7 @@
           </w:tcPr>
           <w:p>
             <w:r>
-              <w:t>Current development: v1.14.2 with Live AI Review, nine integrated security workstreams, 86 discovered capabilities and the October 22 observation/acceptance register.</w:t>
+              <w:t>Current development: v1.15.0 with Live AI Review, nine integrated security workstreams, 86 discovered capabilities and the October 22 observation/acceptance register.</w:t>
             </w:r>
           </w:p>
         </w:tc>
@@ -136,7 +136,7 @@
           <w:color w:val="0B2545"/>
           <w:sz w:val="22"/>
         </w:rPr>
-        <w:t>29 October 2026</w:t>
+        <w:t>30 October 2026</w:t>
       </w:r>
     </w:p>
     <w:p>
@@ -213,6 +213,7 @@
           </w:tcPr>
           <w:p>
             <w:pPr>
+              <w:keepNext/>
               <w:spacing w:after="0"/>
               <w:jc w:val="left"/>
             </w:pPr>
@@ -241,6 +242,7 @@
           </w:tcPr>
           <w:p>
             <w:pPr>
+              <w:keepNext/>
               <w:spacing w:after="0"/>
               <w:jc w:val="left"/>
             </w:pPr>
@@ -295,7 +297,7 @@
           </w:tcPr>
           <w:p>
             <w:r>
-              <w:t>1.14.2</w:t>
+              <w:t>1.15.0</w:t>
             </w:r>
           </w:p>
         </w:tc>
@@ -341,7 +343,7 @@
           </w:tcPr>
           <w:p>
             <w:r>
-              <w:t>v1.14.2 source maintenance. Current validation: analysis/curated-tools-breach-2026-10-29.md. Signed-package and clean-VM acceptance remain separate.</w:t>
+              <w:t>v1.15.0 source maintenance. Current validation: analysis/hardening-v1.15-2026-10-30.md. Signed-package and clean-VM acceptance remain separate.</w:t>
             </w:r>
           </w:p>
         </w:tc>
@@ -499,7 +501,7 @@
                 <w:color w:val="243447"/>
                 <w:sz w:val="18"/>
               </w:rPr>
-              <w:t>Current repository code, the 86-capability inventory and analysis/curated-tools-breach-2026-10-29.md; October 22 validation and historical chapters retain their dated scope.</w:t>
+              <w:t>Current repository code, the 86-capability inventory and analysis/hardening-v1.15-2026-10-30.md; October 22 validation and historical chapters retain their dated scope.</w:t>
             </w:r>
           </w:p>
         </w:tc>
@@ -645,10 +647,6 @@
     </w:p>
     <w:p>
       <w:pPr>
-        <w:numPr>
-          <w:ilvl w:val="0"/>
-          <w:numId w:val="10"/>
-        </w:numPr>
         <w:spacing w:before="0" w:after="20" w:line="240" w:lineRule="auto"/>
       </w:pPr>
       <w:r>
@@ -662,10 +660,6 @@
     </w:p>
     <w:p>
       <w:pPr>
-        <w:numPr>
-          <w:ilvl w:val="0"/>
-          <w:numId w:val="10"/>
-        </w:numPr>
         <w:spacing w:before="0" w:after="20" w:line="240" w:lineRule="auto"/>
       </w:pPr>
       <w:r>
@@ -679,10 +673,6 @@
     </w:p>
     <w:p>
       <w:pPr>
-        <w:numPr>
-          <w:ilvl w:val="0"/>
-          <w:numId w:val="10"/>
-        </w:numPr>
         <w:spacing w:before="0" w:after="20" w:line="240" w:lineRule="auto"/>
       </w:pPr>
       <w:r>
@@ -696,10 +686,6 @@
     </w:p>
     <w:p>
       <w:pPr>
-        <w:numPr>
-          <w:ilvl w:val="0"/>
-          <w:numId w:val="10"/>
-        </w:numPr>
         <w:spacing w:before="0" w:after="20" w:line="240" w:lineRule="auto"/>
       </w:pPr>
       <w:r>
@@ -713,10 +699,6 @@
     </w:p>
     <w:p>
       <w:pPr>
-        <w:numPr>
-          <w:ilvl w:val="0"/>
-          <w:numId w:val="10"/>
-        </w:numPr>
         <w:spacing w:before="0" w:after="20" w:line="240" w:lineRule="auto"/>
       </w:pPr>
       <w:r>
@@ -730,10 +712,6 @@
     </w:p>
     <w:p>
       <w:pPr>
-        <w:numPr>
-          <w:ilvl w:val="0"/>
-          <w:numId w:val="10"/>
-        </w:numPr>
         <w:spacing w:before="0" w:after="20" w:line="240" w:lineRule="auto"/>
       </w:pPr>
       <w:r>
@@ -747,10 +725,6 @@
     </w:p>
     <w:p>
       <w:pPr>
-        <w:numPr>
-          <w:ilvl w:val="0"/>
-          <w:numId w:val="10"/>
-        </w:numPr>
         <w:spacing w:before="0" w:after="20" w:line="240" w:lineRule="auto"/>
       </w:pPr>
       <w:r>
@@ -764,10 +738,6 @@
     </w:p>
     <w:p>
       <w:pPr>
-        <w:numPr>
-          <w:ilvl w:val="0"/>
-          <w:numId w:val="10"/>
-        </w:numPr>
         <w:spacing w:before="0" w:after="20" w:line="240" w:lineRule="auto"/>
       </w:pPr>
       <w:r>
@@ -781,10 +751,6 @@
     </w:p>
     <w:p>
       <w:pPr>
-        <w:numPr>
-          <w:ilvl w:val="0"/>
-          <w:numId w:val="10"/>
-        </w:numPr>
         <w:spacing w:before="0" w:after="20" w:line="240" w:lineRule="auto"/>
       </w:pPr>
       <w:r>
@@ -798,10 +764,6 @@
     </w:p>
     <w:p>
       <w:pPr>
-        <w:numPr>
-          <w:ilvl w:val="0"/>
-          <w:numId w:val="10"/>
-        </w:numPr>
         <w:spacing w:before="0" w:after="20" w:line="240" w:lineRule="auto"/>
       </w:pPr>
       <w:r>
@@ -815,10 +777,6 @@
     </w:p>
     <w:p>
       <w:pPr>
-        <w:numPr>
-          <w:ilvl w:val="0"/>
-          <w:numId w:val="10"/>
-        </w:numPr>
         <w:spacing w:before="0" w:after="20" w:line="240" w:lineRule="auto"/>
       </w:pPr>
       <w:r>
@@ -832,10 +790,6 @@
     </w:p>
     <w:p>
       <w:pPr>
-        <w:numPr>
-          <w:ilvl w:val="0"/>
-          <w:numId w:val="10"/>
-        </w:numPr>
         <w:spacing w:before="0" w:after="20" w:line="240" w:lineRule="auto"/>
       </w:pPr>
       <w:r>
@@ -849,10 +803,6 @@
     </w:p>
     <w:p>
       <w:pPr>
-        <w:numPr>
-          <w:ilvl w:val="0"/>
-          <w:numId w:val="10"/>
-        </w:numPr>
         <w:spacing w:before="0" w:after="20" w:line="240" w:lineRule="auto"/>
       </w:pPr>
       <w:r>
@@ -866,10 +816,6 @@
     </w:p>
     <w:p>
       <w:pPr>
-        <w:numPr>
-          <w:ilvl w:val="0"/>
-          <w:numId w:val="10"/>
-        </w:numPr>
         <w:spacing w:before="0" w:after="20" w:line="240" w:lineRule="auto"/>
       </w:pPr>
       <w:r>
@@ -883,10 +829,6 @@
     </w:p>
     <w:p>
       <w:pPr>
-        <w:numPr>
-          <w:ilvl w:val="0"/>
-          <w:numId w:val="10"/>
-        </w:numPr>
         <w:spacing w:before="0" w:after="20" w:line="240" w:lineRule="auto"/>
       </w:pPr>
       <w:r>
@@ -900,10 +842,6 @@
     </w:p>
     <w:p>
       <w:pPr>
-        <w:numPr>
-          <w:ilvl w:val="0"/>
-          <w:numId w:val="10"/>
-        </w:numPr>
         <w:spacing w:before="0" w:after="20" w:line="240" w:lineRule="auto"/>
       </w:pPr>
       <w:r>
@@ -917,10 +855,6 @@
     </w:p>
     <w:p>
       <w:pPr>
-        <w:numPr>
-          <w:ilvl w:val="0"/>
-          <w:numId w:val="10"/>
-        </w:numPr>
         <w:spacing w:before="0" w:after="20" w:line="240" w:lineRule="auto"/>
       </w:pPr>
       <w:r>
@@ -934,10 +868,6 @@
     </w:p>
     <w:p>
       <w:pPr>
-        <w:numPr>
-          <w:ilvl w:val="0"/>
-          <w:numId w:val="10"/>
-        </w:numPr>
         <w:spacing w:before="0" w:after="20" w:line="240" w:lineRule="auto"/>
       </w:pPr>
       <w:r>
@@ -971,7 +901,7 @@
         <w:pStyle w:val="Normal"/>
       </w:pPr>
       <w:r>
-        <w:t xml:space="preserve">Angerona unifies Windows endpoint and network visibility, local evidence retention, case work, MITRE ATT&amp;CK mapping, governed containment, recovery, local AI assistance, and non-destructive purple-team validation. The v1.14.2 Windows-target inventory discovers 86 defensive capabilities: 13 native operational declarations and 73 explicit compatibility adapters. Every capability receives a validated contract and health snapshot. Native declaration completeness does not establish collection, tested detection, verified response or additional execution authority. Product version, implementation label, contract maturity and efficacy remain separate claims.</w:t>
+        <w:t xml:space="preserve">Angerona unifies Windows endpoint and network visibility, local evidence retention, case work, MITRE ATT&amp;CK mapping, governed containment, recovery, local AI assistance, and non-destructive purple-team validation. The v1.15.0 Windows-target inventory discovers 86 defensive capabilities: 13 native operational declarations and 73 explicit compatibility adapters. Every capability receives a validated contract and health snapshot. Native declaration completeness does not establish collection, tested detection, verified response or additional execution authority. Product version, implementation label, contract maturity and efficacy remain separate claims.</w:t>
       </w:r>
     </w:p>
     <w:p>
@@ -979,7 +909,11 @@
         <w:pStyle w:val="Normal"/>
       </w:pPr>
       <w:r>
-        <w:t xml:space="preserve">Current v1.14 reference route: use docs/live-debug-harness.md for AI-assisted testing, docs/releases/v1.14-security-integration.md for the nine security workstreams and analysis/live-debug-2026-10-22 for the current issue map, observations and validation. The Live debug and AI review chapter gives current connection and operator workflows. Earlier numbered validation, performance and version-history sections retain their dated source revisions and results; they are not the current release acceptance record.</w:t>
+        <w:rPr>
+          <w:color w:val="000000"/>
+          <w:sz w:val="22"/>
+        </w:rPr>
+        <w:t xml:space="preserve">Historical v1.14 reference route: docs/releases/v1.14-security-integration.md and analysis/live-debug-2026-10-22 retain that integration's dated scope and validation. For current v1.15 implementation, validation and unresolved limits, use docs/releases/v1.15.0.md, analysis/hardening-v1.15-2026-10-30.md and the current security-flow chapter. docs/live-debug-harness.md and the Live debug and AI review chapter provide connection and operator workflows. Earlier numbered validation, performance and version-history sections retain their dated source revisions and results; they are not the current release acceptance record.</w:t>
       </w:r>
     </w:p>
     <w:tbl>
@@ -1021,6 +955,7 @@
           </w:tcPr>
           <w:p>
             <w:pPr>
+              <w:keepNext/>
               <w:spacing w:after="0"/>
               <w:jc w:val="left"/>
             </w:pPr>
@@ -1049,6 +984,7 @@
           </w:tcPr>
           <w:p>
             <w:pPr>
+              <w:keepNext/>
               <w:spacing w:after="0"/>
               <w:jc w:val="left"/>
             </w:pPr>
@@ -1077,6 +1013,7 @@
           </w:tcPr>
           <w:p>
             <w:pPr>
+              <w:keepNext/>
               <w:spacing w:after="0"/>
               <w:jc w:val="left"/>
             </w:pPr>
@@ -1582,7 +1519,7 @@
       <w:pPr>
         <w:numPr>
           <w:ilvl w:val="0"/>
-          <w:numId w:val="12"/>
+          <w:numId w:val="1000"/>
         </w:numPr>
         <w:spacing w:before="0" w:after="20" w:line="252" w:lineRule="auto"/>
       </w:pPr>
@@ -1598,7 +1535,7 @@
       <w:pPr>
         <w:numPr>
           <w:ilvl w:val="0"/>
-          <w:numId w:val="12"/>
+          <w:numId w:val="1000"/>
         </w:numPr>
         <w:spacing w:before="0" w:after="20" w:line="252" w:lineRule="auto"/>
       </w:pPr>
@@ -1614,7 +1551,7 @@
       <w:pPr>
         <w:numPr>
           <w:ilvl w:val="0"/>
-          <w:numId w:val="12"/>
+          <w:numId w:val="1000"/>
         </w:numPr>
         <w:spacing w:before="0" w:after="20" w:line="252" w:lineRule="auto"/>
       </w:pPr>
@@ -1630,7 +1567,7 @@
       <w:pPr>
         <w:numPr>
           <w:ilvl w:val="0"/>
-          <w:numId w:val="12"/>
+          <w:numId w:val="1000"/>
         </w:numPr>
         <w:spacing w:before="0" w:after="20" w:line="252" w:lineRule="auto"/>
       </w:pPr>
@@ -1646,7 +1583,7 @@
       <w:pPr>
         <w:numPr>
           <w:ilvl w:val="0"/>
-          <w:numId w:val="12"/>
+          <w:numId w:val="1000"/>
         </w:numPr>
         <w:spacing w:before="0" w:after="20" w:line="252" w:lineRule="auto"/>
       </w:pPr>
@@ -1764,6 +1701,7 @@
           </w:tcPr>
           <w:p>
             <w:pPr>
+              <w:keepNext/>
               <w:spacing w:after="0"/>
               <w:jc w:val="left"/>
             </w:pPr>
@@ -1792,6 +1730,7 @@
           </w:tcPr>
           <w:p>
             <w:pPr>
+              <w:keepNext/>
               <w:spacing w:after="0"/>
               <w:jc w:val="left"/>
             </w:pPr>
@@ -1820,6 +1759,7 @@
           </w:tcPr>
           <w:p>
             <w:pPr>
+              <w:keepNext/>
               <w:spacing w:after="0"/>
               <w:jc w:val="left"/>
             </w:pPr>
@@ -2087,7 +2027,7 @@
       <w:pPr>
         <w:numPr>
           <w:ilvl w:val="0"/>
-          <w:numId w:val="10"/>
+          <w:numId w:val="1001"/>
         </w:numPr>
       </w:pPr>
       <w:r>
@@ -2102,7 +2042,7 @@
       <w:pPr>
         <w:numPr>
           <w:ilvl w:val="0"/>
-          <w:numId w:val="10"/>
+          <w:numId w:val="1001"/>
         </w:numPr>
       </w:pPr>
       <w:r>
@@ -2117,7 +2057,7 @@
       <w:pPr>
         <w:numPr>
           <w:ilvl w:val="0"/>
-          <w:numId w:val="10"/>
+          <w:numId w:val="1001"/>
         </w:numPr>
       </w:pPr>
       <w:r>
@@ -2132,7 +2072,7 @@
       <w:pPr>
         <w:numPr>
           <w:ilvl w:val="0"/>
-          <w:numId w:val="10"/>
+          <w:numId w:val="1001"/>
         </w:numPr>
       </w:pPr>
       <w:r>
@@ -2147,7 +2087,7 @@
       <w:pPr>
         <w:numPr>
           <w:ilvl w:val="0"/>
-          <w:numId w:val="10"/>
+          <w:numId w:val="1001"/>
         </w:numPr>
       </w:pPr>
       <w:r>
@@ -2170,7 +2110,7 @@
       <w:pPr>
         <w:numPr>
           <w:ilvl w:val="0"/>
-          <w:numId w:val="10"/>
+          <w:numId w:val="1002"/>
         </w:numPr>
       </w:pPr>
       <w:r>
@@ -2185,7 +2125,7 @@
       <w:pPr>
         <w:numPr>
           <w:ilvl w:val="0"/>
-          <w:numId w:val="10"/>
+          <w:numId w:val="1002"/>
         </w:numPr>
       </w:pPr>
       <w:r>
@@ -2200,7 +2140,7 @@
       <w:pPr>
         <w:numPr>
           <w:ilvl w:val="0"/>
-          <w:numId w:val="10"/>
+          <w:numId w:val="1002"/>
         </w:numPr>
       </w:pPr>
       <w:r>
@@ -2215,7 +2155,7 @@
       <w:pPr>
         <w:numPr>
           <w:ilvl w:val="0"/>
-          <w:numId w:val="10"/>
+          <w:numId w:val="1002"/>
         </w:numPr>
       </w:pPr>
       <w:r>
@@ -2314,6 +2254,7 @@
           </w:tcPr>
           <w:p>
             <w:pPr>
+              <w:keepNext/>
               <w:spacing w:after="0"/>
               <w:jc w:val="left"/>
             </w:pPr>
@@ -2342,6 +2283,7 @@
           </w:tcPr>
           <w:p>
             <w:pPr>
+              <w:keepNext/>
               <w:spacing w:after="0"/>
               <w:jc w:val="left"/>
             </w:pPr>
@@ -2370,6 +2312,7 @@
           </w:tcPr>
           <w:p>
             <w:pPr>
+              <w:keepNext/>
               <w:spacing w:after="0"/>
               <w:jc w:val="left"/>
             </w:pPr>
@@ -2943,7 +2886,7 @@
       <w:pPr>
         <w:numPr>
           <w:ilvl w:val="0"/>
-          <w:numId w:val="10"/>
+          <w:numId w:val="1003"/>
         </w:numPr>
         <w:spacing w:before="0" w:after="0" w:line="240" w:lineRule="auto"/>
       </w:pPr>
@@ -2960,7 +2903,7 @@
       <w:pPr>
         <w:numPr>
           <w:ilvl w:val="0"/>
-          <w:numId w:val="10"/>
+          <w:numId w:val="1003"/>
         </w:numPr>
         <w:spacing w:before="0" w:after="0" w:line="240" w:lineRule="auto"/>
       </w:pPr>
@@ -2977,7 +2920,7 @@
       <w:pPr>
         <w:numPr>
           <w:ilvl w:val="0"/>
-          <w:numId w:val="10"/>
+          <w:numId w:val="1003"/>
         </w:numPr>
         <w:spacing w:before="0" w:after="0" w:line="240" w:lineRule="auto"/>
       </w:pPr>
@@ -2994,7 +2937,7 @@
       <w:pPr>
         <w:numPr>
           <w:ilvl w:val="0"/>
-          <w:numId w:val="10"/>
+          <w:numId w:val="1003"/>
         </w:numPr>
         <w:spacing w:before="0" w:after="0" w:line="240" w:lineRule="auto"/>
       </w:pPr>
@@ -3038,6 +2981,10 @@
     <w:p>
       <w:pPr>
         <w:pStyle w:val="ListBullet"/>
+        <w:numPr>
+          <w:ilvl w:val="0"/>
+          <w:numId w:val="1004"/>
+        </w:numPr>
       </w:pPr>
       <w:r>
         <w:t>Every active non-loopback physical Wi-Fi or Ethernet path starts untrusted. Private addressing, an operating-system network category, and a familiar wireless name are context, not identity.</w:t>
@@ -3046,6 +2993,10 @@
     <w:p>
       <w:pPr>
         <w:pStyle w:val="ListBullet"/>
+        <w:numPr>
+          <w:ilvl w:val="0"/>
+          <w:numId w:val="1004"/>
+        </w:numPr>
       </w:pPr>
       <w:r>
         <w:t>The Personal Sentinel component is a vendor-neutral HTTPS attestation client for one explicitly enrolled default-gateway path. It requires normal certificate validation plus a certificate pin, a fresh nonce, a pinned policy digest, direct proxy-free transport, no redirect, and stable route context before and after the exchange.</w:t>
@@ -3054,6 +3005,10 @@
     <w:p>
       <w:pPr>
         <w:pStyle w:val="ListBullet"/>
+        <w:numPr>
+          <w:ilvl w:val="0"/>
+          <w:numId w:val="1004"/>
+        </w:numPr>
       </w:pPr>
       <w:r>
         <w:t>A verified gateway labels only that exact path as gateway-attested. It never trusts applications, users, destination resources, firmware, the upstream router, or the Internet, and it grants no response authority.</w:t>
@@ -3062,6 +3017,10 @@
     <w:p>
       <w:pPr>
         <w:pStyle w:val="ListBullet"/>
+        <w:numPr>
+          <w:ilvl w:val="0"/>
+          <w:numId w:val="1004"/>
+        </w:numPr>
       </w:pPr>
       <w:r>
         <w:t>The client does not discover, configure, credential, or operate a router. The actual intermediate appliance/server, routing policy, firmware measurement, and separate monotonic witness remain deployment projects.</w:t>
@@ -3088,7 +3047,7 @@
       <w:pPr>
         <w:numPr>
           <w:ilvl w:val="0"/>
-          <w:numId w:val="13"/>
+          <w:numId w:val="1005"/>
         </w:numPr>
       </w:pPr>
       <w:r>
@@ -3103,7 +3062,7 @@
       <w:pPr>
         <w:numPr>
           <w:ilvl w:val="0"/>
-          <w:numId w:val="13"/>
+          <w:numId w:val="1005"/>
         </w:numPr>
       </w:pPr>
       <w:r>
@@ -3118,7 +3077,7 @@
       <w:pPr>
         <w:numPr>
           <w:ilvl w:val="0"/>
-          <w:numId w:val="13"/>
+          <w:numId w:val="1005"/>
         </w:numPr>
       </w:pPr>
       <w:r>
@@ -3133,7 +3092,7 @@
       <w:pPr>
         <w:numPr>
           <w:ilvl w:val="0"/>
-          <w:numId w:val="13"/>
+          <w:numId w:val="1005"/>
         </w:numPr>
       </w:pPr>
       <w:r>
@@ -3254,6 +3213,7 @@
           </w:tcPr>
           <w:p>
             <w:pPr>
+              <w:keepNext/>
               <w:spacing w:after="0"/>
               <w:jc w:val="left"/>
             </w:pPr>
@@ -3282,6 +3242,7 @@
           </w:tcPr>
           <w:p>
             <w:pPr>
+              <w:keepNext/>
               <w:spacing w:after="0"/>
               <w:jc w:val="left"/>
             </w:pPr>
@@ -3625,6 +3586,7 @@
           </w:tcPr>
           <w:p>
             <w:pPr>
+              <w:keepNext/>
               <w:spacing w:after="0"/>
               <w:jc w:val="left"/>
             </w:pPr>
@@ -3653,6 +3615,7 @@
           </w:tcPr>
           <w:p>
             <w:pPr>
+              <w:keepNext/>
               <w:spacing w:after="0"/>
               <w:jc w:val="left"/>
             </w:pPr>
@@ -3681,6 +3644,7 @@
           </w:tcPr>
           <w:p>
             <w:pPr>
+              <w:keepNext/>
               <w:spacing w:after="0"/>
               <w:jc w:val="left"/>
             </w:pPr>
@@ -4453,6 +4417,7 @@
           </w:tcPr>
           <w:p>
             <w:pPr>
+              <w:keepNext/>
               <w:spacing w:after="0"/>
               <w:jc w:val="left"/>
             </w:pPr>
@@ -4481,6 +4446,7 @@
           </w:tcPr>
           <w:p>
             <w:pPr>
+              <w:keepNext/>
               <w:spacing w:after="0"/>
               <w:jc w:val="left"/>
             </w:pPr>
@@ -4858,6 +4824,10 @@
     <w:p>
       <w:pPr>
         <w:pStyle w:val="ListBullet"/>
+        <w:numPr>
+          <w:ilvl w:val="0"/>
+          <w:numId w:val="1006"/>
+        </w:numPr>
       </w:pPr>
       <w:r>
         <w:t>Host Adaptation tables sort by typed severity and numeric risk. Double-click opens the complete bounded JSON record without changing state.</w:t>
@@ -4866,6 +4836,10 @@
     <w:p>
       <w:pPr>
         <w:pStyle w:val="ListBullet"/>
+        <w:numPr>
+          <w:ilvl w:val="0"/>
+          <w:numId w:val="1006"/>
+        </w:numPr>
       </w:pPr>
       <w:r>
         <w:t>Live Alerts and event detail show available governed paths and evidence fields. A displayed path is context, not automatic permission to open, execute, delete, quarantine, or remediate it.</w:t>
@@ -4874,6 +4848,10 @@
     <w:p>
       <w:pPr>
         <w:pStyle w:val="ListBullet"/>
+        <w:numPr>
+          <w:ilvl w:val="0"/>
+          <w:numId w:val="1006"/>
+        </w:numPr>
       </w:pPr>
       <w:r>
         <w:t>Context Info meaning/path tables are sortable and double-clickable, so menu labels, implementation locations, and security boundaries can be inspected without hunting through multiple buttons.</w:t>
@@ -4939,7 +4917,7 @@
       <w:pPr>
         <w:numPr>
           <w:ilvl w:val="0"/>
-          <w:numId w:val="10"/>
+          <w:numId w:val="1007"/>
         </w:numPr>
       </w:pPr>
       <w:r>
@@ -4954,7 +4932,7 @@
       <w:pPr>
         <w:numPr>
           <w:ilvl w:val="0"/>
-          <w:numId w:val="10"/>
+          <w:numId w:val="1007"/>
         </w:numPr>
       </w:pPr>
       <w:r>
@@ -4981,7 +4959,7 @@
       <w:pPr>
         <w:numPr>
           <w:ilvl w:val="0"/>
-          <w:numId w:val="10"/>
+          <w:numId w:val="1008"/>
         </w:numPr>
       </w:pPr>
       <w:r>
@@ -4996,7 +4974,7 @@
       <w:pPr>
         <w:numPr>
           <w:ilvl w:val="0"/>
-          <w:numId w:val="10"/>
+          <w:numId w:val="1008"/>
         </w:numPr>
       </w:pPr>
       <w:r>
@@ -5053,6 +5031,7 @@
           </w:tcPr>
           <w:p>
             <w:pPr>
+              <w:keepNext/>
               <w:spacing w:after="0"/>
               <w:jc w:val="left"/>
             </w:pPr>
@@ -5081,6 +5060,7 @@
           </w:tcPr>
           <w:p>
             <w:pPr>
+              <w:keepNext/>
               <w:spacing w:after="0"/>
               <w:jc w:val="left"/>
             </w:pPr>
@@ -5538,7 +5518,7 @@
       <w:pPr>
         <w:numPr>
           <w:ilvl w:val="0"/>
-          <w:numId w:val="10"/>
+          <w:numId w:val="1009"/>
         </w:numPr>
       </w:pPr>
       <w:r>
@@ -5553,7 +5533,7 @@
       <w:pPr>
         <w:numPr>
           <w:ilvl w:val="0"/>
-          <w:numId w:val="10"/>
+          <w:numId w:val="1009"/>
         </w:numPr>
       </w:pPr>
       <w:r>
@@ -5568,7 +5548,7 @@
       <w:pPr>
         <w:numPr>
           <w:ilvl w:val="0"/>
-          <w:numId w:val="10"/>
+          <w:numId w:val="1009"/>
         </w:numPr>
       </w:pPr>
       <w:r>
@@ -5596,6 +5576,10 @@
     <w:p>
       <w:pPr>
         <w:pStyle w:val="ListBullet"/>
+        <w:numPr>
+          <w:ilvl w:val="0"/>
+          <w:numId w:val="1010"/>
+        </w:numPr>
       </w:pPr>
       <w:r>
         <w:t>Windows OpenSSH evidence uses fixed Admin and Operational channels and fixed event identities, with bounded retry, source reopen, recovery-tail inspection, and an honest retained warning after blind intervals.</w:t>
@@ -5604,6 +5588,10 @@
     <w:p>
       <w:pPr>
         <w:pStyle w:val="ListBullet"/>
+        <w:numPr>
+          <w:ilvl w:val="0"/>
+          <w:numId w:val="1010"/>
+        </w:numPr>
       </w:pPr>
       <w:r>
         <w:t>The guard tokenizes accounts, paths, processes, endpoints, and sources. It never reads private keys, captures credentials, probes a listener, attempts a login, removes a key, terminates a tunnel, rewrites policy, or auto-promotes its first baseline.</w:t>
@@ -5627,6 +5615,10 @@
     <w:p>
       <w:pPr>
         <w:pStyle w:val="ListBullet"/>
+        <w:numPr>
+          <w:ilvl w:val="0"/>
+          <w:numId w:val="1011"/>
+        </w:numPr>
       </w:pPr>
       <w:r>
         <w:t>A gap establishes missing confidence; it cannot identify everything that happened during the missing interval or restore deleted records. An unreadable or unauthenticated checkpoint fails closed rather than creating a clean baseline.</w:t>
@@ -5635,6 +5627,10 @@
     <w:p>
       <w:pPr>
         <w:pStyle w:val="ListBullet"/>
+        <w:numPr>
+          <w:ilvl w:val="0"/>
+          <w:numId w:val="1011"/>
+        </w:numPr>
       </w:pPr>
       <w:r>
         <w:t>Local HMAC custody detects alteration but cannot detect replay of an older matching state pair. The protocol for a separate high-water authority is built and tested, but no independently administered server or policy-bound hardware authority is configured by default; freshness therefore remains local-authenticity-only.</w:t>
@@ -5658,6 +5654,10 @@
     <w:p>
       <w:pPr>
         <w:pStyle w:val="ListBullet"/>
+        <w:numPr>
+          <w:ilvl w:val="0"/>
+          <w:numId w:val="1012"/>
+        </w:numPr>
       </w:pPr>
       <w:r>
         <w:t>A newly added path is persisted only as a provisional authenticated transition. Promotion requires the exact pending path to remain active and unchanged; absence, concurrent drift, lost freshness, failed persistence, or bounded-history pressure freezes the prior authenticated comparison baseline.</w:t>
@@ -5666,6 +5666,10 @@
     <w:p>
       <w:pPr>
         <w:pStyle w:val="ListBullet"/>
+        <w:numPr>
+          <w:ilvl w:val="0"/>
+          <w:numId w:val="1012"/>
+        </w:numPr>
       </w:pPr>
       <w:r>
         <w:t>The monitor is observe-only: it does not discover devices, change routes, operate a VPN, reconfigure profiles, change firewall policy, or trust endpoints reached through an attested gateway.</w:t>
@@ -5787,6 +5791,7 @@
           </w:tcPr>
           <w:p>
             <w:pPr>
+              <w:keepNext/>
               <w:spacing w:after="0"/>
               <w:jc w:val="left"/>
             </w:pPr>
@@ -5815,6 +5820,7 @@
           </w:tcPr>
           <w:p>
             <w:pPr>
+              <w:keepNext/>
               <w:spacing w:after="0"/>
               <w:jc w:val="left"/>
             </w:pPr>
@@ -5843,6 +5849,7 @@
           </w:tcPr>
           <w:p>
             <w:pPr>
+              <w:keepNext/>
               <w:spacing w:after="0"/>
               <w:jc w:val="left"/>
             </w:pPr>
@@ -6425,7 +6432,7 @@
       <w:pPr>
         <w:numPr>
           <w:ilvl w:val="0"/>
-          <w:numId w:val="14"/>
+          <w:numId w:val="1013"/>
         </w:numPr>
       </w:pPr>
       <w:r>
@@ -6440,7 +6447,7 @@
       <w:pPr>
         <w:numPr>
           <w:ilvl w:val="0"/>
-          <w:numId w:val="14"/>
+          <w:numId w:val="1013"/>
         </w:numPr>
       </w:pPr>
       <w:r>
@@ -6455,7 +6462,7 @@
       <w:pPr>
         <w:numPr>
           <w:ilvl w:val="0"/>
-          <w:numId w:val="14"/>
+          <w:numId w:val="1013"/>
         </w:numPr>
       </w:pPr>
       <w:r>
@@ -6470,7 +6477,7 @@
       <w:pPr>
         <w:numPr>
           <w:ilvl w:val="0"/>
-          <w:numId w:val="14"/>
+          <w:numId w:val="1013"/>
         </w:numPr>
       </w:pPr>
       <w:r>
@@ -6485,7 +6492,7 @@
       <w:pPr>
         <w:numPr>
           <w:ilvl w:val="0"/>
-          <w:numId w:val="14"/>
+          <w:numId w:val="1013"/>
         </w:numPr>
       </w:pPr>
       <w:r>
@@ -6500,7 +6507,7 @@
       <w:pPr>
         <w:numPr>
           <w:ilvl w:val="0"/>
-          <w:numId w:val="14"/>
+          <w:numId w:val="1013"/>
         </w:numPr>
       </w:pPr>
       <w:r>
@@ -6515,7 +6522,7 @@
       <w:pPr>
         <w:numPr>
           <w:ilvl w:val="0"/>
-          <w:numId w:val="14"/>
+          <w:numId w:val="1013"/>
         </w:numPr>
       </w:pPr>
       <w:r>
@@ -6619,6 +6626,7 @@
           </w:tcPr>
           <w:p>
             <w:pPr>
+              <w:keepNext/>
               <w:spacing w:after="0"/>
               <w:jc w:val="left"/>
             </w:pPr>
@@ -6647,6 +6655,7 @@
           </w:tcPr>
           <w:p>
             <w:pPr>
+              <w:keepNext/>
               <w:spacing w:after="0"/>
               <w:jc w:val="left"/>
             </w:pPr>
@@ -6944,7 +6953,7 @@
       <w:pPr>
         <w:numPr>
           <w:ilvl w:val="0"/>
-          <w:numId w:val="10"/>
+          <w:numId w:val="1014"/>
         </w:numPr>
       </w:pPr>
       <w:r>
@@ -6959,7 +6968,7 @@
       <w:pPr>
         <w:numPr>
           <w:ilvl w:val="0"/>
-          <w:numId w:val="10"/>
+          <w:numId w:val="1014"/>
         </w:numPr>
       </w:pPr>
       <w:r>
@@ -6974,7 +6983,7 @@
       <w:pPr>
         <w:numPr>
           <w:ilvl w:val="0"/>
-          <w:numId w:val="10"/>
+          <w:numId w:val="1014"/>
         </w:numPr>
       </w:pPr>
       <w:r>
@@ -6989,7 +6998,7 @@
       <w:pPr>
         <w:numPr>
           <w:ilvl w:val="0"/>
-          <w:numId w:val="10"/>
+          <w:numId w:val="1014"/>
         </w:numPr>
       </w:pPr>
       <w:r>
@@ -7021,7 +7030,7 @@
       <w:pPr>
         <w:numPr>
           <w:ilvl w:val="0"/>
-          <w:numId w:val="10"/>
+          <w:numId w:val="1015"/>
         </w:numPr>
       </w:pPr>
       <w:r>
@@ -7036,7 +7045,7 @@
       <w:pPr>
         <w:numPr>
           <w:ilvl w:val="0"/>
-          <w:numId w:val="10"/>
+          <w:numId w:val="1015"/>
         </w:numPr>
       </w:pPr>
       <w:r>
@@ -7051,7 +7060,7 @@
       <w:pPr>
         <w:numPr>
           <w:ilvl w:val="0"/>
-          <w:numId w:val="10"/>
+          <w:numId w:val="1015"/>
         </w:numPr>
       </w:pPr>
       <w:r>
@@ -7066,7 +7075,7 @@
       <w:pPr>
         <w:numPr>
           <w:ilvl w:val="0"/>
-          <w:numId w:val="10"/>
+          <w:numId w:val="1015"/>
         </w:numPr>
       </w:pPr>
       <w:r>
@@ -7141,6 +7150,7 @@
           </w:tcPr>
           <w:p>
             <w:pPr>
+              <w:keepNext/>
               <w:spacing w:after="0"/>
               <w:jc w:val="left"/>
             </w:pPr>
@@ -7169,6 +7179,7 @@
           </w:tcPr>
           <w:p>
             <w:pPr>
+              <w:keepNext/>
               <w:spacing w:after="0"/>
               <w:jc w:val="left"/>
             </w:pPr>
@@ -7571,48 +7582,64 @@
     <w:p>
       <w:pPr>
         <w:pStyle w:val="ListBullet"/>
-      </w:pPr>
-      <w:r>
-        <w:t>Enroll Recovery Baseline stores one exclusive, host-bound, authenticated, digest-verified complete Windows Firewall policy; it cannot silently replace the anchor.</w:t>
-      </w:r>
-    </w:p>
-    <w:p>
-      <w:pPr>
-        <w:pStyle w:val="ListBullet"/>
-      </w:pPr>
-      <w:r>
-        <w:t>Restore snapshots pre-state, journals the action, verifies exact firewall state, and compensates or declares recovery-required.</w:t>
-      </w:r>
-    </w:p>
-    <w:p>
-      <w:pPr>
-        <w:pStyle w:val="ListBullet"/>
-      </w:pPr>
-      <w:r>
-        <w:t>Safe automatic checkup audits once and simulates every profile without writes; it never remediates unattended.</w:t>
-      </w:r>
-    </w:p>
-    <w:p>
-      <w:pPr>
-        <w:pStyle w:val="ListBullet"/>
-      </w:pPr>
-      <w:r>
-        <w:t>The baseline restores only firewall policy; hardware, services, ports, and network context remain observational.</w:t>
-      </w:r>
-    </w:p>
-    <w:p>
-      <w:pPr>
-        <w:pStyle w:val="Heading2"/>
-      </w:pPr>
-      <w:r>
-        <w:t>10.2 Resilience</w:t>
-      </w:r>
-    </w:p>
-    <w:p>
-      <w:pPr>
         <w:numPr>
           <w:ilvl w:val="0"/>
-          <w:numId w:val="10"/>
+          <w:numId w:val="1016"/>
+        </w:numPr>
+      </w:pPr>
+      <w:r>
+        <w:t>Enroll Recovery Baseline stores one exclusive, host-bound, authenticated, digest-verified complete Windows Firewall policy; it cannot silently replace the anchor.</w:t>
+      </w:r>
+    </w:p>
+    <w:p>
+      <w:pPr>
+        <w:pStyle w:val="ListBullet"/>
+        <w:numPr>
+          <w:ilvl w:val="0"/>
+          <w:numId w:val="1016"/>
+        </w:numPr>
+      </w:pPr>
+      <w:r>
+        <w:t>Restore snapshots pre-state, journals the action, verifies exact firewall state, and compensates or declares recovery-required.</w:t>
+      </w:r>
+    </w:p>
+    <w:p>
+      <w:pPr>
+        <w:pStyle w:val="ListBullet"/>
+        <w:numPr>
+          <w:ilvl w:val="0"/>
+          <w:numId w:val="1016"/>
+        </w:numPr>
+      </w:pPr>
+      <w:r>
+        <w:t>Safe automatic checkup audits once and simulates every profile without writes; it never remediates unattended.</w:t>
+      </w:r>
+    </w:p>
+    <w:p>
+      <w:pPr>
+        <w:pStyle w:val="ListBullet"/>
+        <w:numPr>
+          <w:ilvl w:val="0"/>
+          <w:numId w:val="1016"/>
+        </w:numPr>
+      </w:pPr>
+      <w:r>
+        <w:t>The baseline restores only firewall policy; hardware, services, ports, and network context remain observational.</w:t>
+      </w:r>
+    </w:p>
+    <w:p>
+      <w:pPr>
+        <w:pStyle w:val="Heading2"/>
+      </w:pPr>
+      <w:r>
+        <w:t>10.2 Resilience</w:t>
+      </w:r>
+    </w:p>
+    <w:p>
+      <w:pPr>
+        <w:numPr>
+          <w:ilvl w:val="0"/>
+          <w:numId w:val="1017"/>
         </w:numPr>
       </w:pPr>
       <w:r>
@@ -7627,7 +7654,7 @@
       <w:pPr>
         <w:numPr>
           <w:ilvl w:val="0"/>
-          <w:numId w:val="10"/>
+          <w:numId w:val="1017"/>
         </w:numPr>
       </w:pPr>
       <w:r>
@@ -7642,7 +7669,7 @@
       <w:pPr>
         <w:numPr>
           <w:ilvl w:val="0"/>
-          <w:numId w:val="10"/>
+          <w:numId w:val="1017"/>
         </w:numPr>
       </w:pPr>
       <w:r>
@@ -7657,7 +7684,7 @@
       <w:pPr>
         <w:numPr>
           <w:ilvl w:val="0"/>
-          <w:numId w:val="10"/>
+          <w:numId w:val="1017"/>
         </w:numPr>
       </w:pPr>
       <w:r>
@@ -7749,7 +7776,7 @@
       <w:pPr>
         <w:numPr>
           <w:ilvl w:val="0"/>
-          <w:numId w:val="15"/>
+          <w:numId w:val="1018"/>
         </w:numPr>
       </w:pPr>
       <w:r>
@@ -7764,7 +7791,7 @@
       <w:pPr>
         <w:numPr>
           <w:ilvl w:val="0"/>
-          <w:numId w:val="15"/>
+          <w:numId w:val="1018"/>
         </w:numPr>
       </w:pPr>
       <w:r>
@@ -7779,7 +7806,7 @@
       <w:pPr>
         <w:numPr>
           <w:ilvl w:val="0"/>
-          <w:numId w:val="15"/>
+          <w:numId w:val="1018"/>
         </w:numPr>
       </w:pPr>
       <w:r>
@@ -7794,7 +7821,7 @@
       <w:pPr>
         <w:numPr>
           <w:ilvl w:val="0"/>
-          <w:numId w:val="15"/>
+          <w:numId w:val="1018"/>
         </w:numPr>
       </w:pPr>
       <w:r>
@@ -7809,7 +7836,7 @@
       <w:pPr>
         <w:numPr>
           <w:ilvl w:val="0"/>
-          <w:numId w:val="15"/>
+          <w:numId w:val="1018"/>
         </w:numPr>
       </w:pPr>
       <w:r>
@@ -7824,7 +7851,7 @@
       <w:pPr>
         <w:numPr>
           <w:ilvl w:val="0"/>
-          <w:numId w:val="15"/>
+          <w:numId w:val="1018"/>
         </w:numPr>
       </w:pPr>
       <w:r>
@@ -7902,7 +7929,7 @@
       <w:pPr>
         <w:numPr>
           <w:ilvl w:val="0"/>
-          <w:numId w:val="16"/>
+          <w:numId w:val="1019"/>
         </w:numPr>
       </w:pPr>
       <w:r>
@@ -7917,7 +7944,7 @@
       <w:pPr>
         <w:numPr>
           <w:ilvl w:val="0"/>
-          <w:numId w:val="16"/>
+          <w:numId w:val="1019"/>
         </w:numPr>
       </w:pPr>
       <w:r>
@@ -7932,7 +7959,7 @@
       <w:pPr>
         <w:numPr>
           <w:ilvl w:val="0"/>
-          <w:numId w:val="16"/>
+          <w:numId w:val="1019"/>
         </w:numPr>
       </w:pPr>
       <w:r>
@@ -7947,7 +7974,7 @@
       <w:pPr>
         <w:numPr>
           <w:ilvl w:val="0"/>
-          <w:numId w:val="16"/>
+          <w:numId w:val="1019"/>
         </w:numPr>
       </w:pPr>
       <w:r>
@@ -8114,6 +8141,7 @@
           </w:tcPr>
           <w:p>
             <w:pPr>
+              <w:keepNext/>
               <w:spacing w:after="0"/>
               <w:jc w:val="left"/>
             </w:pPr>
@@ -8142,6 +8170,7 @@
           </w:tcPr>
           <w:p>
             <w:pPr>
+              <w:keepNext/>
               <w:spacing w:after="0"/>
               <w:jc w:val="left"/>
             </w:pPr>
@@ -8766,6 +8795,10 @@
     <w:p>
       <w:pPr>
         <w:pStyle w:val="ListBullet"/>
+        <w:numPr>
+          <w:ilvl w:val="0"/>
+          <w:numId w:val="1020"/>
+        </w:numPr>
       </w:pPr>
       <w:r>
         <w:t>Configuration and Settings changes are atomic or compensated; alert identity is stable; analysis work is bounded to two active and six queued jobs.</w:t>
@@ -8774,6 +8807,10 @@
     <w:p>
       <w:pPr>
         <w:pStyle w:val="ListBullet"/>
+        <w:numPr>
+          <w:ilvl w:val="0"/>
+          <w:numId w:val="1020"/>
+        </w:numPr>
       </w:pPr>
       <w:r>
         <w:t>Durable integration outboxes, atomic Intel Sync replacement, typed persistence completeness, and explicit cancellation preserve failure truth across restart.</w:t>
@@ -8782,6 +8819,10 @@
     <w:p>
       <w:pPr>
         <w:pStyle w:val="ListBullet"/>
+        <w:numPr>
+          <w:ilvl w:val="0"/>
+          <w:numId w:val="1020"/>
+        </w:numPr>
       </w:pPr>
       <w:r>
         <w:t>Allow/Undo is scoped and expiring, SOAR archive is recoverable, and remediation binds exact process birth, driver prior state, and firewall identity.</w:t>
@@ -8790,6 +8831,10 @@
     <w:p>
       <w:pPr>
         <w:pStyle w:val="ListBullet"/>
+        <w:numPr>
+          <w:ilvl w:val="0"/>
+          <w:numId w:val="1020"/>
+        </w:numPr>
       </w:pPr>
       <w:r>
         <w:t>The historical Cycle 25 suite had six declared host/platform capability skips; later gates have their own explicit skip counts. Unknown failures cannot be waived as platform skips.</w:t>
@@ -8812,6 +8857,10 @@
     <w:p>
       <w:pPr>
         <w:pStyle w:val="ListBullet"/>
+        <w:numPr>
+          <w:ilvl w:val="0"/>
+          <w:numId w:val="1021"/>
+        </w:numPr>
       </w:pPr>
       <w:r>
         <w:t>The authoritative serial suite passed 1,811 tests with six expected host/platform capability skips and zero failures.</w:t>
@@ -8820,6 +8869,10 @@
     <w:p>
       <w:pPr>
         <w:pStyle w:val="ListBullet"/>
+        <w:numPr>
+          <w:ilvl w:val="0"/>
+          <w:numId w:val="1021"/>
+        </w:numPr>
       </w:pPr>
       <w:r>
         <w:t>All 346 product Python files compiled. Ruff passed; 82 module files imported; 64 register hooks validated; 80 capabilities discovered with zero errors or duplicates; the inventory contains 61 unique capability codes.</w:t>
@@ -8828,6 +8881,10 @@
     <w:p>
       <w:pPr>
         <w:pStyle w:val="ListBullet"/>
+        <w:numPr>
+          <w:ilvl w:val="0"/>
+          <w:numId w:val="1021"/>
+        </w:numPr>
       </w:pPr>
       <w:r>
         <w:t>The module/self-test gate recorded 92 passes and 12 expected inactive or platform skips plus a passing EventBus pipeline. Direct and batch application selfcheck both passed 26 of 26.</w:t>
@@ -8919,6 +8976,7 @@
           </w:tcPr>
           <w:p>
             <w:pPr>
+              <w:keepNext/>
               <w:spacing w:after="0"/>
               <w:jc w:val="left"/>
             </w:pPr>
@@ -8947,6 +9005,7 @@
           </w:tcPr>
           <w:p>
             <w:pPr>
+              <w:keepNext/>
               <w:spacing w:after="0"/>
               <w:jc w:val="left"/>
             </w:pPr>
@@ -8975,6 +9034,7 @@
           </w:tcPr>
           <w:p>
             <w:pPr>
+              <w:keepNext/>
               <w:spacing w:after="0"/>
               <w:jc w:val="left"/>
             </w:pPr>
@@ -9799,7 +9859,7 @@
       <w:pPr>
         <w:numPr>
           <w:ilvl w:val="0"/>
-          <w:numId w:val="10"/>
+          <w:numId w:val="1022"/>
         </w:numPr>
       </w:pPr>
       <w:r>
@@ -9814,7 +9874,7 @@
       <w:pPr>
         <w:numPr>
           <w:ilvl w:val="0"/>
-          <w:numId w:val="10"/>
+          <w:numId w:val="1022"/>
         </w:numPr>
       </w:pPr>
       <w:r>
@@ -9937,13 +9997,16 @@
       </w:r>
     </w:p>
     <w:p>
+      <w:pPr>
+        <w:pStyle w:val="Normal"/>
+        <w:spacing w:after="120" w:line="264" w:lineRule="auto"/>
+      </w:pPr>
       <w:r>
         <w:rPr>
-          <w:rFonts w:ascii="Calibri" w:hAnsi="Calibri" w:eastAsia="Calibri"/>
-          <w:i w:val="0"/>
-          <w:color w:val="243447"/>
+          <w:color w:val="000000"/>
+          <w:sz w:val="22"/>
         </w:rPr>
-        <w:t>R6-03 remains a defense-in-depth proposal: retaining an OS process handle and a bounded executable identity lease across the complete program-firewall action would strengthen identity custody. October review separately reproduced and fixed failed compensation being terminalized despite uncertain effects; unverified reversal now remains in recovery. Neither finding establishes complete host-mutation safety.</w:t>
+        <w:t xml:space="preserve">Historical pre-1.15 scope: R6-03 was a defense-in-depth proposal to retain an OS process handle and bounded executable identity lease across the complete program-firewall action. That proposal is superseded by the 1.15 retained process, executable and ancestor transaction custody described in the current hardening chapter. The earlier October compensation fix retains its dated scope: unverified reversal remains in recovery. Neither change establishes original mapped-image proof, PID-bound socket admission or complete host-mutation safety.</w:t>
       </w:r>
     </w:p>
     <w:p>
@@ -9958,7 +10021,7 @@
       <w:pPr>
         <w:numPr>
           <w:ilvl w:val="0"/>
-          <w:numId w:val="10"/>
+          <w:numId w:val="1023"/>
         </w:numPr>
       </w:pPr>
       <w:r>
@@ -9973,7 +10036,7 @@
       <w:pPr>
         <w:numPr>
           <w:ilvl w:val="0"/>
-          <w:numId w:val="10"/>
+          <w:numId w:val="1023"/>
         </w:numPr>
       </w:pPr>
       <w:r>
@@ -9988,7 +10051,7 @@
       <w:pPr>
         <w:numPr>
           <w:ilvl w:val="0"/>
-          <w:numId w:val="10"/>
+          <w:numId w:val="1023"/>
         </w:numPr>
       </w:pPr>
       <w:r>
@@ -10003,7 +10066,7 @@
       <w:pPr>
         <w:numPr>
           <w:ilvl w:val="0"/>
-          <w:numId w:val="10"/>
+          <w:numId w:val="1023"/>
         </w:numPr>
       </w:pPr>
       <w:r>
@@ -10018,7 +10081,7 @@
       <w:pPr>
         <w:numPr>
           <w:ilvl w:val="0"/>
-          <w:numId w:val="10"/>
+          <w:numId w:val="1023"/>
         </w:numPr>
       </w:pPr>
       <w:r>
@@ -10033,7 +10096,7 @@
       <w:pPr>
         <w:numPr>
           <w:ilvl w:val="0"/>
-          <w:numId w:val="10"/>
+          <w:numId w:val="1023"/>
         </w:numPr>
       </w:pPr>
       <w:r>
@@ -10069,6 +10132,10 @@
     <w:p>
       <w:pPr>
         <w:pStyle w:val="ListBullet"/>
+        <w:numPr>
+          <w:ilvl w:val="0"/>
+          <w:numId w:val="1024"/>
+        </w:numPr>
       </w:pPr>
       <w:r>
         <w:t>Built now: observe-only SSH posture/runtime drift, fixed-source Windows audit-clear and continuity evidence, zero-trust physical-path drift, a pinned Personal Sentinel attestation client, sanitized dashboard activity, and pinned governed ARIA defensive reference memory.</w:t>
@@ -10077,6 +10144,10 @@
     <w:p>
       <w:pPr>
         <w:pStyle w:val="ListBullet"/>
+        <w:numPr>
+          <w:ilvl w:val="0"/>
+          <w:numId w:val="1024"/>
+        </w:numPr>
       </w:pPr>
       <w:r>
         <w:t>Built as contracts but not a deployed independent service: compact witness receipt verification and the IndependentHighWater interface with rollback, fork, clone, outage, migration, and crash tests.</w:t>
@@ -10085,6 +10156,10 @@
     <w:p>
       <w:pPr>
         <w:pStyle w:val="ListBullet"/>
+        <w:numPr>
+          <w:ilvl w:val="0"/>
+          <w:numId w:val="1024"/>
+        </w:numPr>
       </w:pPr>
       <w:r>
         <w:t>Proposed or deferred: the actual gateway/firewall appliance and routing role, a separately administered monotonic witness server or policy-bound hardware authority, firmware/signed-boot measurement, resource-scoped egress leases, and authoritative SSH key-to-session provenance.</w:t>
@@ -10093,6 +10168,10 @@
     <w:p>
       <w:pPr>
         <w:pStyle w:val="ListBullet"/>
+        <w:numPr>
+          <w:ilvl w:val="0"/>
+          <w:numId w:val="1024"/>
+        </w:numPr>
       </w:pPr>
       <w:r>
         <w:t>A compromised Administrator or SYSTEM principal, kernel, hypervisor, firmware, upstream provider, stolen identity, or separately administered witness can still defeat or deny user-mode evidence. Zero trust limits implicit authority; it does not make any layer infallible.</w:t>
@@ -10146,6 +10225,7 @@
           </w:tcPr>
           <w:p>
             <w:pPr>
+              <w:keepNext/>
               <w:spacing w:after="0"/>
               <w:jc w:val="left"/>
             </w:pPr>
@@ -10174,6 +10254,7 @@
           </w:tcPr>
           <w:p>
             <w:pPr>
+              <w:keepNext/>
               <w:spacing w:after="0"/>
               <w:jc w:val="left"/>
             </w:pPr>
@@ -10202,6 +10283,7 @@
           </w:tcPr>
           <w:p>
             <w:pPr>
+              <w:keepNext/>
               <w:spacing w:after="0"/>
               <w:jc w:val="left"/>
             </w:pPr>
@@ -10751,6 +10833,7 @@
           </w:tcPr>
           <w:p>
             <w:pPr>
+              <w:keepNext/>
               <w:spacing w:after="0"/>
               <w:jc w:val="left"/>
             </w:pPr>
@@ -10779,6 +10862,7 @@
           </w:tcPr>
           <w:p>
             <w:pPr>
+              <w:keepNext/>
               <w:spacing w:after="0"/>
               <w:jc w:val="left"/>
             </w:pPr>
@@ -11767,6 +11851,51 @@
           </w:p>
         </w:tc>
       </w:tr>
+      <w:tr>
+        <w:trPr>
+          <w:cantSplit/>
+        </w:trPr>
+        <w:tc>
+          <w:tcPr>
+            <w:tcW w:w="2200" w:type="dxa"/>
+            <w:shd w:fill="FFFFFF"/>
+            <w:vAlign w:val="center"/>
+          </w:tcPr>
+          <w:p>
+            <w:pPr>
+              <w:pStyle w:val="Normal"/>
+              <w:spacing w:after="120" w:line="264" w:lineRule="auto"/>
+            </w:pPr>
+            <w:r>
+              <w:rPr>
+                <w:color w:val="000000"/>
+                <w:sz w:val="19"/>
+              </w:rPr>
+              <w:t xml:space="preserve">1.15.0</w:t>
+            </w:r>
+          </w:p>
+        </w:tc>
+        <w:tc>
+          <w:tcPr>
+            <w:tcW w:w="7160" w:type="dxa"/>
+            <w:shd w:fill="FFFFFF"/>
+            <w:vAlign w:val="center"/>
+          </w:tcPr>
+          <w:p>
+            <w:pPr>
+              <w:pStyle w:val="Normal"/>
+              <w:spacing w:after="120" w:line="264" w:lineRule="auto"/>
+            </w:pPr>
+            <w:r>
+              <w:rPr>
+                <w:color w:val="000000"/>
+                <w:sz w:val="19"/>
+              </w:rPr>
+              <w:t xml:space="preserve">Telemetry assurance and WER precursor correlation; retained containment identity; independent recorder history and freshness; installed service admission; governed driver policy; bounded servicing/TPM verification. Source validation and native/hardware deployment remain separate.</w:t>
+            </w:r>
+          </w:p>
+        </w:tc>
+      </w:tr>
     </w:tbl>
     <w:p>
       <w:pPr>
@@ -11785,7 +11914,7 @@
       <w:pPr>
         <w:numPr>
           <w:ilvl w:val="0"/>
-          <w:numId w:val="10"/>
+          <w:numId w:val="1025"/>
         </w:numPr>
       </w:pPr>
       <w:r>
@@ -11800,7 +11929,7 @@
       <w:pPr>
         <w:numPr>
           <w:ilvl w:val="0"/>
-          <w:numId w:val="10"/>
+          <w:numId w:val="1025"/>
         </w:numPr>
       </w:pPr>
       <w:r>
@@ -11815,7 +11944,7 @@
       <w:pPr>
         <w:numPr>
           <w:ilvl w:val="0"/>
-          <w:numId w:val="10"/>
+          <w:numId w:val="1025"/>
         </w:numPr>
       </w:pPr>
       <w:r>
@@ -11830,7 +11959,7 @@
       <w:pPr>
         <w:numPr>
           <w:ilvl w:val="0"/>
-          <w:numId w:val="10"/>
+          <w:numId w:val="1025"/>
         </w:numPr>
       </w:pPr>
       <w:r>
@@ -11859,6 +11988,10 @@
     <w:p>
       <w:pPr>
         <w:pStyle w:val="ListBullet"/>
+        <w:numPr>
+          <w:ilvl w:val="0"/>
+          <w:numId w:val="1026"/>
+        </w:numPr>
       </w:pPr>
       <w:r>
         <w:t>Corrected launch behavior: an Auto-contain Red Team run activates all 13 reviewed simulation-only technique signatures before the first marker is created. Activation preserves earlier signed candidate lineage and fails closed if the pack cannot be persisted.</w:t>
@@ -11867,6 +12000,10 @@
     <w:p>
       <w:pPr>
         <w:pStyle w:val="ListBullet"/>
+        <w:numPr>
+          <w:ilvl w:val="0"/>
+          <w:numId w:val="1026"/>
+        </w:numPr>
       </w:pPr>
       <w:r>
         <w:t>Scope remains exact: the pack recognizes only inert _redteam_* artifacts in the dedicated or explicitly registered drill target and nonce-tagged idle processes. It does not convert suspicious filenames elsewhere into host-wide threat authority.</w:t>
@@ -11875,6 +12012,10 @@
     <w:p>
       <w:pPr>
         <w:pStyle w:val="ListBullet"/>
+        <w:numPr>
+          <w:ilvl w:val="0"/>
+          <w:numId w:val="1026"/>
+        </w:numPr>
       </w:pPr>
       <w:r>
         <w:t>AAR correlation now prefers the exact Adversary Combat receipt with a verified postcondition over an earlier delegation wrapper. A real verified Combat receipt counts as both an applied action contract and a closure.</w:t>
@@ -11883,6 +12024,10 @@
     <w:p>
       <w:pPr>
         <w:pStyle w:val="ListBullet"/>
+        <w:numPr>
+          <w:ilvl w:val="0"/>
+          <w:numId w:val="1026"/>
+        </w:numPr>
       </w:pPr>
       <w:r>
         <w:t>The first corrected live round achieved 52/52 detection but only 51/52 response and 12/13 closure, so the validator rejected it and automatically continued.</w:t>
@@ -11891,6 +12036,10 @@
     <w:p>
       <w:pPr>
         <w:pStyle w:val="ListBullet"/>
+        <w:numPr>
+          <w:ilvl w:val="0"/>
+          <w:numId w:val="1026"/>
+        </w:numPr>
       </w:pPr>
       <w:r>
         <w:t>The second round, run redteam-1787697587-bf119f, achieved 52/52 detection, 52/52 automatic response, 13/13 action contracts, 13/13 verified closure, and a passing no-false-alert resilience control. Average detection was 0.57 seconds and average mitigation was 1.09 seconds.</w:t>
@@ -11899,6 +12048,10 @@
     <w:p>
       <w:pPr>
         <w:pStyle w:val="ListBullet"/>
+        <w:numPr>
+          <w:ilvl w:val="0"/>
+          <w:numId w:val="1026"/>
+        </w:numPr>
       </w:pPr>
       <w:r>
         <w:t>Post-run cleanup verified 223 authenticated action records, zero active reversible actions, an empty journal error, zero recovery requirements, zero remaining drill markers, and zero tagged probe processes.</w:t>
@@ -11907,6 +12060,10 @@
     <w:p>
       <w:pPr>
         <w:pStyle w:val="ListBullet"/>
+        <w:numPr>
+          <w:ilvl w:val="0"/>
+          <w:numId w:val="1026"/>
+        </w:numPr>
       </w:pPr>
       <w:r>
         <w:t>Regression evidence: 1,257 tests passed with three intentional platform skips; 308 Python files compiled; repository-wide Ruff checks passed; the headless application self-check passed 26/26; and 128 adversary-boundary negative controls passed before the live campaign.</w:t>
@@ -11935,6 +12092,10 @@
     <w:p>
       <w:pPr>
         <w:pStyle w:val="ListBullet"/>
+        <w:numPr>
+          <w:ilvl w:val="0"/>
+          <w:numId w:val="1027"/>
+        </w:numPr>
       </w:pPr>
       <w:r>
         <w:t>Covered tabs: Overview, Information, General, System, Adversary Combat, Enterprise, ARIA, Trusted Processes, Mobile Integration, and API Keys.</w:t>
@@ -11943,6 +12104,10 @@
     <w:p>
       <w:pPr>
         <w:pStyle w:val="ListBullet"/>
+        <w:numPr>
+          <w:ilvl w:val="0"/>
+          <w:numId w:val="1027"/>
+        </w:numPr>
       </w:pPr>
       <w:r>
         <w:t>Each sandbox includes the tab's related implementation files in a picker. For example, ARIA opens the Settings UI at _tab_aria and also exposes its assistant and configuration implementation files.</w:t>
@@ -11951,6 +12116,10 @@
     <w:p>
       <w:pPr>
         <w:pStyle w:val="ListBullet"/>
+        <w:numPr>
+          <w:ilvl w:val="0"/>
+          <w:numId w:val="1027"/>
+        </w:numPr>
       </w:pPr>
       <w:r>
         <w:t>Check Syntax, Save Sandbox Copy, Reset Current Copy, and Reset All Sandbox Changes operate only on the private working copy. Installed Angerona code and live sensors are never rewritten or hot-loaded by this editor.</w:t>
@@ -11959,6 +12128,10 @@
     <w:p>
       <w:pPr>
         <w:pStyle w:val="ListBullet"/>
+        <w:numPr>
+          <w:ilvl w:val="0"/>
+          <w:numId w:val="1027"/>
+        </w:numPr>
       </w:pPr>
       <w:r>
         <w:t>The Adversary Combat Settings topic now has a complete source mapping for its policy, action, receipt, history, and Undo implementation.</w:t>
@@ -11967,6 +12140,10 @@
     <w:p>
       <w:pPr>
         <w:pStyle w:val="ListBullet"/>
+        <w:numPr>
+          <w:ilvl w:val="0"/>
+          <w:numId w:val="1027"/>
+        </w:numPr>
       </w:pPr>
       <w:r>
         <w:t>Verification: 49 focused Settings/UI regression tests passed; the full suite passed 1,258 tests with three intentional platform skips; Ruff and documentation-drift checks passed.</w:t>
@@ -12022,6 +12199,10 @@
     <w:p>
       <w:pPr>
         <w:pStyle w:val="ListBullet"/>
+        <w:numPr>
+          <w:ilvl w:val="0"/>
+          <w:numId w:val="1028"/>
+        </w:numPr>
       </w:pPr>
       <w:r>
         <w:t>Fifteen findings were fixed across three review rounds. The final Round 3 path-addition repair authenticates pending membership and requires active unchanged confirmation across restart before promotion.</w:t>
@@ -12030,6 +12211,10 @@
     <w:p>
       <w:pPr>
         <w:pStyle w:val="ListBullet"/>
+        <w:numPr>
+          <w:ilvl w:val="0"/>
+          <w:numId w:val="1028"/>
+        </w:numPr>
       </w:pPr>
       <w:r>
         <w:t>Final automated evidence: 1,460 passed, five expected skips, zero failed from 1,465 tests across 208 files; 321 of 321 product files compiled; 71 of 71 modules discovered; Ruff and both 26 of 26 selfchecks passed.</w:t>
@@ -12038,6 +12223,10 @@
     <w:p>
       <w:pPr>
         <w:pStyle w:val="ListBullet"/>
+        <w:numPr>
+          <w:ilvl w:val="0"/>
+          <w:numId w:val="1028"/>
+        </w:numPr>
       </w:pPr>
       <w:r>
         <w:t>Measured applied wins range from 90.9% to 99.4% in their declared bounded cases. Round 3 intentionally retained clearer direct security transitions when alternatives were negligible or slower.</w:t>
@@ -12068,6 +12257,10 @@
     <w:p>
       <w:pPr>
         <w:pStyle w:val="ListBullet"/>
+        <w:numPr>
+          <w:ilvl w:val="0"/>
+          <w:numId w:val="1029"/>
+        </w:numPr>
       </w:pPr>
       <w:r>
         <w:t>Authenticated producer identity, schema admission, sequence/loss accounting, SSH provenance, audit-log continuity, and recovery evidence expose gaps without claiming to reconstruct erased records.</w:t>
@@ -12076,6 +12269,10 @@
     <w:p>
       <w:pPr>
         <w:pStyle w:val="ListBullet"/>
+        <w:numPr>
+          <w:ilvl w:val="0"/>
+          <w:numId w:val="1029"/>
+        </w:numPr>
       </w:pPr>
       <w:r>
         <w:t>Wi-Fi and Ethernet remain hostile-by-default. The Personal Sentinel reference authority attests an explicitly enrolled intermediate gateway path; it does not configure routers or grant endpoint, application, user, or response trust.</w:t>
@@ -12084,6 +12281,10 @@
     <w:p>
       <w:pPr>
         <w:pStyle w:val="ListBullet"/>
+        <w:numPr>
+          <w:ilvl w:val="0"/>
+          <w:numId w:val="1029"/>
+        </w:numPr>
       </w:pPr>
       <w:r>
         <w:t>New defensive coverage includes identity/session and temporal correlation, measured boot, peripheral/DMA and driver provenance, process-bound egress, RAG provenance, trusted time, recovery assurance, update authority, and release transparency.</w:t>
@@ -12092,6 +12293,10 @@
     <w:p>
       <w:pPr>
         <w:pStyle w:val="ListBullet"/>
+        <w:numPr>
+          <w:ilvl w:val="0"/>
+          <w:numId w:val="1029"/>
+        </w:numPr>
       </w:pPr>
       <w:r>
         <w:t>The dashboard's Live Defense Activity card shows only bounded, sanitized public EventBus records - never source code, secrets, private model reasoning, or chain of thought. ARIA Defense Memory v1.1.0 contains 18 pinned defensive references; an optional cloud fallback receives at most one ranked canonical redacted excerpt.</w:t>
@@ -12100,6 +12305,10 @@
     <w:p>
       <w:pPr>
         <w:pStyle w:val="ListBullet"/>
+        <w:numPr>
+          <w:ilvl w:val="0"/>
+          <w:numId w:val="1029"/>
+        </w:numPr>
       </w:pPr>
       <w:r>
         <w:t>Public first installation is the signed x64 full-trust MSIX. The classic migration wrapper is non-public and prior-install-only; portable ZIPs are upgrade-only and require an installed verifier. Signing identity, protected keys, pinned compiler images, and enterprise distribution remain external deployment controls.</w:t>
@@ -12108,6 +12317,10 @@
     <w:p>
       <w:pPr>
         <w:pStyle w:val="ListBullet"/>
+        <w:numPr>
+          <w:ilvl w:val="0"/>
+          <w:numId w:val="1029"/>
+        </w:numPr>
       </w:pPr>
       <w:r>
         <w:t>Final automated evidence: 1,675 collected across 229 test files; 1,670 passed, five expected host-capability skips, and zero failed. All 611 Python files compiled; Ruff, 26 application selfchecks, the 60-pass module harness, and discovery for 80 Windows, 14 Linux, and 13 macOS modules passed with zero discovery errors.</w:t>
@@ -12138,6 +12351,10 @@
     <w:p>
       <w:pPr>
         <w:pStyle w:val="ListBullet"/>
+        <w:numPr>
+          <w:ilvl w:val="0"/>
+          <w:numId w:val="1030"/>
+        </w:numPr>
       </w:pPr>
       <w:r>
         <w:t>Guided Auto Adapt consolidates audit, profile choice, baseline, plan, and simulation. Safe automatic checkup simulates every profile without writes; apply remains separately approved and proposal-only.</w:t>
@@ -12146,6 +12363,10 @@
     <w:p>
       <w:pPr>
         <w:pStyle w:val="ListBullet"/>
+        <w:numPr>
+          <w:ilvl w:val="0"/>
+          <w:numId w:val="1030"/>
+        </w:numPr>
       </w:pPr>
       <w:r>
         <w:t>Capability, module, adaptation, context, live activity, alert, and path surfaces provide searchable, sortable, clickable read-only detail.</w:t>
@@ -12154,6 +12375,10 @@
     <w:p>
       <w:pPr>
         <w:pStyle w:val="ListBullet"/>
+        <w:numPr>
+          <w:ilvl w:val="0"/>
+          <w:numId w:val="1030"/>
+        </w:numPr>
       </w:pPr>
       <w:r>
         <w:t>All 80 capabilities receive operational contracts and health snapshots: five native contracts and 75 explicit compatibility adapters.</w:t>
@@ -12162,6 +12387,10 @@
     <w:p>
       <w:pPr>
         <w:pStyle w:val="ListBullet"/>
+        <w:numPr>
+          <w:ilvl w:val="0"/>
+          <w:numId w:val="1030"/>
+        </w:numPr>
       </w:pPr>
       <w:r>
         <w:t>Durable outboxes, atomic Intel Sync, typed persistence completeness, exact tuner approvals, protected IPC secrets, and identity-bound remediation improve restart and failure safety.</w:t>
@@ -12170,6 +12399,10 @@
     <w:p>
       <w:pPr>
         <w:pStyle w:val="ListBullet"/>
+        <w:numPr>
+          <w:ilvl w:val="0"/>
+          <w:numId w:val="1030"/>
+        </w:numPr>
       </w:pPr>
       <w:r>
         <w:t>Standards truth is pinned to ATT&amp;CK 19.2, Navigator 5.3.2/layer 4.5, typed OCSF 1.8, and atomic Sigma admission/refusal.</w:t>
@@ -12178,6 +12411,10 @@
     <w:p>
       <w:pPr>
         <w:pStyle w:val="ListBullet"/>
+        <w:numPr>
+          <w:ilvl w:val="0"/>
+          <w:numId w:val="1030"/>
+        </w:numPr>
       </w:pPr>
       <w:r>
         <w:t>Final evidence: 1,811 tests passed, six expected capability skips, zero failed; 346 product files compiled; Ruff, 80-capability discovery, module/self-test gates, and both 26-of-26 selfchecks passed.</w:t>
@@ -12207,6 +12444,10 @@
     <w:p>
       <w:pPr>
         <w:pStyle w:val="ListBullet"/>
+        <w:numPr>
+          <w:ilvl w:val="0"/>
+          <w:numId w:val="1031"/>
+        </w:numPr>
       </w:pPr>
       <w:r>
         <w:t>Fleet Center / Fleet Fabric Lab: sealed enrollment grants, durable device bindings, bounded authenticated health and loss evidence, and governed desired-versus-effective rollout/canary evaluation. No remote transport, dispatch, HA, distributed quota, or production mTLS coordination service is implemented.</w:t>
@@ -12215,6 +12456,10 @@
     <w:p>
       <w:pPr>
         <w:pStyle w:val="ListBullet"/>
+        <w:numPr>
+          <w:ilvl w:val="0"/>
+          <w:numId w:val="1031"/>
+        </w:numPr>
       </w:pPr>
       <w:r>
         <w:t>DetectionForge: immutable replay cohorts, exact active-candidate diffs, a physically separate alert-inert shadow lane, chained quality receipts, and fresh one-use promotion or rollback receipts. It is local governed evaluation, not a distributed content service.</w:t>
@@ -12223,6 +12468,10 @@
     <w:p>
       <w:pPr>
         <w:pStyle w:val="ListBullet"/>
+        <w:numPr>
+          <w:ilvl w:val="0"/>
+          <w:numId w:val="1031"/>
+        </w:numPr>
       </w:pPr>
       <w:r>
         <w:t>AegisPath: evidence-bound exposure graphs, bounded confirmed and speculative paths, choke and blast analysis, inert breakpoint counterfactuals, and explainable KEV/EPSS/criticality priority. It does not claim exploitability, breach probability, reachability proof, or remediation proof.</w:t>
@@ -12231,6 +12480,10 @@
     <w:p>
       <w:pPr>
         <w:pStyle w:val="ListBullet"/>
+        <w:numPr>
+          <w:ilvl w:val="0"/>
+          <w:numId w:val="1031"/>
+        </w:numPr>
       </w:pPr>
       <w:r>
         <w:t>Adversarial closure: 31 initial findings (11 High, 18 Medium, 2 Low) were fixed; independent re-attacks found 15 additional bypasses, all fixed. The final bounded gates found no reopened issue.</w:t>
@@ -12239,6 +12492,10 @@
     <w:p>
       <w:pPr>
         <w:pStyle w:val="ListBullet"/>
+        <w:numPr>
+          <w:ilvl w:val="0"/>
+          <w:numId w:val="1031"/>
+        </w:numPr>
       </w:pPr>
       <w:r>
         <w:t>Inventory and QA: 84 capabilities (9 native, 75 adapters); compile 368/368; module harness 69 pass, 16 expected skips, 0 fail; selfcheck 26/26. The historical pre-documentation full serial recorded 2,788 passed, 13 intentional skips, and one expected stale README-marker failure, which the v1.13.0 documentation corrected. The authoritative five-check release gate on exact commit edefd8b07b94da4d682a35ace23057e7b22c3790 passed 2,790 tests with 13 intentional platform skips and 0 failures in 325.19 seconds. Evidence-manifest SHA-256: 23fd1c70b5b227f45175570eee14774a1693d93f1fe4e8cb914b8ce9a5d2b813. Validation is complete. Repository policy requires the guarded publisher for release completion.</w:t>
@@ -12247,6 +12504,10 @@
     <w:p>
       <w:pPr>
         <w:pStyle w:val="ListBullet"/>
+        <w:numPr>
+          <w:ilvl w:val="0"/>
+          <w:numId w:val="1031"/>
+        </w:numPr>
       </w:pPr>
       <w:r>
         <w:t>Trust limits: local fleet SQLite/HMAC is not an independent rollback witness; DetectionForge needs process isolation for forcible evaluator termination and an external anchor for all-file rollback; AegisPath provider and absence authority are local trust, and its simulation is inert.</w:t>
@@ -12277,6 +12538,10 @@
     <w:p>
       <w:pPr>
         <w:pStyle w:val="ListBullet"/>
+        <w:numPr>
+          <w:ilvl w:val="0"/>
+          <w:numId w:val="1032"/>
+        </w:numPr>
       </w:pPr>
       <w:r>
         <w:t>Round 1 closed repository-wide canvas exposure, legacy detection governance bypass, detached runtime ownership, multi-package eviction, and an unbound Fleet monitor. AegisPath gained immutable path/node indexes.</w:t>
@@ -12285,6 +12550,10 @@
     <w:p>
       <w:pPr>
         <w:pStyle w:val="ListBullet"/>
+        <w:numPr>
+          <w:ilvl w:val="0"/>
+          <w:numId w:val="1032"/>
+        </w:numPr>
       </w:pPr>
       <w:r>
         <w:t>Round 2 bound detection state, registry, runtime, receipts, expiry, and recovery into one fail-closed authority; hardened descriptor-only canvas serving and cancellable Local SOC startup; authenticated every retained Fleet health row; and replaced 3N+1 repeated signature verification with a guarded exact-row custody projection.</w:t>
@@ -12293,6 +12562,10 @@
     <w:p>
       <w:pPr>
         <w:pStyle w:val="ListBullet"/>
+        <w:numPr>
+          <w:ilvl w:val="0"/>
+          <w:numId w:val="1032"/>
+        </w:numPr>
       </w:pPr>
       <w:r>
         <w:t>Round 3 added a nondecreasing promotion time floor, creator-PID-bound runtime-owner lease tied to exact registry/state/quality/policy/clock/path authority with fork-safe descriptor reset, governance anchor, journaled quarantine convergence, safe legacy migration, zero-mutation invalid/replay intake, restart-safe Fleet quotas, transactional quota reservation, and coherent publisher-key snapshots across multi-package validation.</w:t>
@@ -12401,6 +12674,7 @@
           </w:tcPr>
           <w:p>
             <w:pPr>
+              <w:keepNext/>
               <w:spacing w:after="0"/>
               <w:jc w:val="left"/>
             </w:pPr>
@@ -12429,6 +12703,7 @@
           </w:tcPr>
           <w:p>
             <w:pPr>
+              <w:keepNext/>
               <w:spacing w:after="0"/>
               <w:jc w:val="left"/>
             </w:pPr>
@@ -13079,7 +13354,7 @@
       <w:pPr>
         <w:numPr>
           <w:ilvl w:val="0"/>
-          <w:numId w:val="10"/>
+          <w:numId w:val="1033"/>
         </w:numPr>
       </w:pPr>
       <w:r>
@@ -13094,7 +13369,7 @@
       <w:pPr>
         <w:numPr>
           <w:ilvl w:val="0"/>
-          <w:numId w:val="10"/>
+          <w:numId w:val="1033"/>
         </w:numPr>
       </w:pPr>
       <w:r>
@@ -13109,7 +13384,7 @@
       <w:pPr>
         <w:numPr>
           <w:ilvl w:val="0"/>
-          <w:numId w:val="10"/>
+          <w:numId w:val="1033"/>
         </w:numPr>
       </w:pPr>
       <w:r>
@@ -13124,7 +13399,7 @@
       <w:pPr>
         <w:numPr>
           <w:ilvl w:val="0"/>
-          <w:numId w:val="10"/>
+          <w:numId w:val="1033"/>
         </w:numPr>
       </w:pPr>
       <w:r>
@@ -13139,7 +13414,7 @@
       <w:pPr>
         <w:numPr>
           <w:ilvl w:val="0"/>
-          <w:numId w:val="10"/>
+          <w:numId w:val="1033"/>
         </w:numPr>
       </w:pPr>
       <w:r>
@@ -13154,7 +13429,7 @@
       <w:pPr>
         <w:numPr>
           <w:ilvl w:val="0"/>
-          <w:numId w:val="10"/>
+          <w:numId w:val="1033"/>
         </w:numPr>
       </w:pPr>
       <w:r>
@@ -13169,7 +13444,7 @@
       <w:pPr>
         <w:numPr>
           <w:ilvl w:val="0"/>
-          <w:numId w:val="10"/>
+          <w:numId w:val="1033"/>
         </w:numPr>
       </w:pPr>
       <w:r>
@@ -13184,7 +13459,7 @@
       <w:pPr>
         <w:numPr>
           <w:ilvl w:val="0"/>
-          <w:numId w:val="10"/>
+          <w:numId w:val="1033"/>
         </w:numPr>
       </w:pPr>
       <w:r>
@@ -13199,7 +13474,7 @@
       <w:pPr>
         <w:numPr>
           <w:ilvl w:val="0"/>
-          <w:numId w:val="10"/>
+          <w:numId w:val="1033"/>
         </w:numPr>
       </w:pPr>
       <w:r>
@@ -13214,7 +13489,7 @@
       <w:pPr>
         <w:numPr>
           <w:ilvl w:val="0"/>
-          <w:numId w:val="10"/>
+          <w:numId w:val="1033"/>
         </w:numPr>
       </w:pPr>
       <w:r>
@@ -13407,6 +13682,7 @@
           </w:tcPr>
           <w:p>
             <w:pPr>
+              <w:keepNext/>
               <w:spacing w:after="0"/>
               <w:jc w:val="left"/>
             </w:pPr>
@@ -13435,6 +13711,7 @@
           </w:tcPr>
           <w:p>
             <w:pPr>
+              <w:keepNext/>
               <w:spacing w:after="0"/>
               <w:jc w:val="left"/>
             </w:pPr>
@@ -14307,7 +14584,11 @@
         <w:pStyle w:val="Normal"/>
       </w:pPr>
       <w:r>
-        <w:t xml:space="preserve">The installed response-service boundary is separate from the ordinary-user desktop and sensor graph. Its native pipe authenticates the actual Windows peer token and verifies the installed service before sending requests. Source Python, a caller-supplied name or a same-user bearer secret does not become privileged authority. Immutable publisher/package pins, protected state and a restricted SCM identity must be provisioned independently. The initial service surface is diagnostic only; unavailable native process-egress enforcement remains visibly unavailable. A path firewall rule or observed connection cannot prove PID-birth-bound socket admission.</w:t>
+        <w:rPr>
+          <w:color w:val="000000"/>
+          <w:sz w:val="22"/>
+        </w:rPr>
+        <w:t xml:space="preserve">Historical v1.14 integration scope: the installed response-service boundary is separate from the ordinary-user desktop and sensor graph. Its native pipe authenticates the actual Windows peer token and verifies the installed service before requests. Source Python, a caller-supplied name or a same-user bearer secret does not become privileged authority. Immutable publisher/package pins, protected state and a restricted SCM identity require independent provisioning. The initial/default v1 profile remains diagnostic-only. Current 1.15 adds a separately enrolled, pinned v2 managed driver-policy executor; its unsigned policy and deployment limits are described in the current hardening chapter. Native PID-bound process-egress enforcement remains unavailable. A path firewall rule or observed connection cannot prove PID-birth-bound socket admission.</w:t>
       </w:r>
     </w:p>
     <w:p>
@@ -14392,7 +14673,7 @@
           <w:color w:val="000000"/>
           <w:sz w:val="22"/>
         </w:rPr>
-        <w:t xml:space="preserve">Current operating guidance 29 October 2026</w:t>
+        <w:t xml:space="preserve">Current operating guidance 30 October 2026</w:t>
       </w:r>
     </w:p>
     <w:p>
@@ -15017,6 +15298,7 @@
           <w:p>
             <w:pPr>
               <w:pStyle w:val="Normal"/>
+              <w:keepNext/>
               <w:spacing w:after="120" w:line="264" w:lineRule="auto"/>
             </w:pPr>
             <w:r>
@@ -15038,6 +15320,7 @@
           <w:p>
             <w:pPr>
               <w:pStyle w:val="Normal"/>
+              <w:keepNext/>
               <w:spacing w:after="120" w:line="264" w:lineRule="auto"/>
             </w:pPr>
             <w:r>
@@ -15658,6 +15941,7 @@
           <w:p>
             <w:pPr>
               <w:pStyle w:val="Normal"/>
+              <w:keepNext/>
               <w:spacing w:after="120" w:line="264" w:lineRule="auto"/>
             </w:pPr>
             <w:r>
@@ -15679,6 +15963,7 @@
           <w:p>
             <w:pPr>
               <w:pStyle w:val="Normal"/>
+              <w:keepNext/>
               <w:spacing w:after="120" w:line="264" w:lineRule="auto"/>
             </w:pPr>
             <w:r>
@@ -16077,6 +16362,837 @@
           <w:sz w:val="22"/>
         </w:rPr>
         <w:t xml:space="preserve">The GitHub recovery implementation follows the official blob, commit and tree object APIs. Each integration's actual configured endpoint and live contract remain the operating authority.</w:t>
+      </w:r>
+    </w:p>
+    <w:p>
+      <w:pPr>
+        <w:pStyle w:val="Heading3"/>
+        <w:keepNext/>
+        <w:spacing w:after="120" w:line="264" w:lineRule="auto"/>
+      </w:pPr>
+      <w:r>
+        <w:rPr>
+          <w:color w:val="000000"/>
+        </w:rPr>
+        <w:t xml:space="preserve">10 Version 1.15 hardening layers</w:t>
+      </w:r>
+    </w:p>
+    <w:p>
+      <w:pPr>
+        <w:keepNext/>
+        <w:spacing w:after="120"/>
+      </w:pPr>
+      <w:r>
+        <w:drawing>
+          <wp:inline xmlns:wp="http://schemas.openxmlformats.org/drawingml/2006/wordprocessingDrawing" distT="0" distB="0" distL="0" distR="0">
+            <wp:extent cx="5943600" cy="4331398"/>
+            <wp:docPr id="9006" name="security-flow-hardening.png" descr="security flow hardening"/>
+            <a:graphic xmlns:a="http://schemas.openxmlformats.org/drawingml/2006/main">
+              <a:graphicData uri="http://schemas.openxmlformats.org/drawingml/2006/picture">
+                <pic:pic xmlns:pic="http://schemas.openxmlformats.org/drawingml/2006/picture">
+                  <pic:nvPicPr>
+                    <pic:cNvPr id="0" name="security-flow-hardening.png"/>
+                    <pic:cNvPicPr/>
+                  </pic:nvPicPr>
+                  <pic:blipFill>
+                    <a:blip r:embed="rIdAngeronaSecurityFlow6"/>
+                    <a:stretch>
+                      <a:fillRect/>
+                    </a:stretch>
+                  </pic:blipFill>
+                  <pic:spPr>
+                    <a:xfrm>
+                      <a:off x="0" y="0"/>
+                      <a:ext cx="5943600" cy="4331398"/>
+                    </a:xfrm>
+                    <a:prstGeom prst="rect">
+                      <a:avLst/>
+                    </a:prstGeom>
+                  </pic:spPr>
+                </pic:pic>
+              </a:graphicData>
+            </a:graphic>
+          </wp:inline>
+        </w:drawing>
+      </w:r>
+    </w:p>
+    <w:p>
+      <w:pPr>
+        <w:pStyle w:val="Caption"/>
+        <w:spacing w:after="120" w:line="264" w:lineRule="auto"/>
+      </w:pPr>
+      <w:r>
+        <w:rPr>
+          <w:color w:val="000000"/>
+          <w:sz w:val="22"/>
+        </w:rPr>
+        <w:t xml:space="preserve">Figure 6 hardening flow</w:t>
+      </w:r>
+    </w:p>
+    <w:p>
+      <w:pPr>
+        <w:pStyle w:val="Normal"/>
+        <w:spacing w:after="120" w:line="264" w:lineRule="auto"/>
+      </w:pPr>
+      <w:r>
+        <w:rPr>
+          <w:color w:val="000000"/>
+          <w:sz w:val="22"/>
+        </w:rPr>
+        <w:t xml:space="preserve">The source implementation adds the layers below. Installed and independent paths require their own enrollment; they do not silently become active because the source version changes. Release notes and the sanitized Full-mode review retain the focused checks, observed limits and unresolved work.</w:t>
+      </w:r>
+    </w:p>
+    <w:tbl>
+      <w:tblPr>
+        <w:tblW w:w="9360" w:type="dxa"/>
+        <w:tblLayout w:type="fixed"/>
+        <w:tblBorders>
+          <w:top w:val="single" w:sz="4" w:color="D9D9D9"/>
+          <w:left w:val="single" w:sz="4" w:color="D9D9D9"/>
+          <w:bottom w:val="single" w:sz="4" w:color="D9D9D9"/>
+          <w:right w:val="single" w:sz="4" w:color="D9D9D9"/>
+          <w:insideH w:val="single" w:sz="4" w:color="D9D9D9"/>
+          <w:insideV w:val="single" w:sz="4" w:color="D9D9D9"/>
+        </w:tblBorders>
+        <w:tblCellMar>
+          <w:top w:w="100" w:type="dxa"/>
+          <w:left w:w="110" w:type="dxa"/>
+          <w:bottom w:w="100" w:type="dxa"/>
+          <w:right w:w="110" w:type="dxa"/>
+        </w:tblCellMar>
+      </w:tblPr>
+      <w:tblGrid>
+        <w:gridCol w:w="2400"/>
+        <w:gridCol w:w="3480"/>
+        <w:gridCol w:w="3480"/>
+      </w:tblGrid>
+      <w:tr>
+        <w:trPr>
+          <w:cantSplit/>
+          <w:tblHeader/>
+        </w:trPr>
+        <w:tc>
+          <w:tcPr>
+            <w:tcW w:w="2400" w:type="dxa"/>
+            <w:shd w:fill="DCE7F0"/>
+            <w:vAlign w:val="center"/>
+          </w:tcPr>
+          <w:p>
+            <w:pPr>
+              <w:pStyle w:val="Normal"/>
+              <w:keepNext/>
+              <w:spacing w:after="120" w:line="264" w:lineRule="auto"/>
+            </w:pPr>
+            <w:r>
+              <w:rPr>
+                <w:b/>
+                <w:color w:val="000000"/>
+                <w:sz w:val="19"/>
+              </w:rPr>
+              <w:t xml:space="preserve">Attack surface</w:t>
+            </w:r>
+          </w:p>
+        </w:tc>
+        <w:tc>
+          <w:tcPr>
+            <w:tcW w:w="3480" w:type="dxa"/>
+            <w:shd w:fill="DCE7F0"/>
+            <w:vAlign w:val="center"/>
+          </w:tcPr>
+          <w:p>
+            <w:pPr>
+              <w:pStyle w:val="Normal"/>
+              <w:keepNext/>
+              <w:spacing w:after="120" w:line="264" w:lineRule="auto"/>
+            </w:pPr>
+            <w:r>
+              <w:rPr>
+                <w:b/>
+                <w:color w:val="000000"/>
+                <w:sz w:val="19"/>
+              </w:rPr>
+              <w:t xml:space="preserve">Implemented layer</w:t>
+            </w:r>
+          </w:p>
+        </w:tc>
+        <w:tc>
+          <w:tcPr>
+            <w:tcW w:w="3480" w:type="dxa"/>
+            <w:shd w:fill="DCE7F0"/>
+            <w:vAlign w:val="center"/>
+          </w:tcPr>
+          <w:p>
+            <w:pPr>
+              <w:pStyle w:val="Normal"/>
+              <w:keepNext/>
+              <w:spacing w:after="120" w:line="264" w:lineRule="auto"/>
+            </w:pPr>
+            <w:r>
+              <w:rPr>
+                <w:b/>
+                <w:color w:val="000000"/>
+                <w:sz w:val="19"/>
+              </w:rPr>
+              <w:t xml:space="preserve">Remaining boundary</w:t>
+            </w:r>
+          </w:p>
+        </w:tc>
+      </w:tr>
+      <w:tr>
+        <w:trPr>
+          <w:cantSplit/>
+        </w:trPr>
+        <w:tc>
+          <w:tcPr>
+            <w:tcW w:w="2400" w:type="dxa"/>
+            <w:shd w:fill="FFFFFF"/>
+            <w:vAlign w:val="center"/>
+          </w:tcPr>
+          <w:p>
+            <w:pPr>
+              <w:pStyle w:val="Normal"/>
+              <w:spacing w:after="120" w:line="264" w:lineRule="auto"/>
+            </w:pPr>
+            <w:r>
+              <w:rPr>
+                <w:color w:val="000000"/>
+                <w:sz w:val="19"/>
+              </w:rPr>
+              <w:t xml:space="preserve">Alive but blind sensor process</w:t>
+            </w:r>
+          </w:p>
+        </w:tc>
+        <w:tc>
+          <w:tcPr>
+            <w:tcW w:w="3480" w:type="dxa"/>
+            <w:shd w:fill="FFFFFF"/>
+            <w:vAlign w:val="center"/>
+          </w:tcPr>
+          <w:p>
+            <w:pPr>
+              <w:pStyle w:val="Normal"/>
+              <w:spacing w:after="120" w:line="264" w:lineRule="auto"/>
+            </w:pPr>
+            <w:r>
+              <w:rPr>
+                <w:color w:val="000000"/>
+                <w:sz w:val="19"/>
+              </w:rPr>
+              <w:t xml:space="preserve">Separate native ETW/Sysmon canary provenance, generation, benign probe and recorder acknowledgment; missing receipts remain explicit.</w:t>
+            </w:r>
+          </w:p>
+        </w:tc>
+        <w:tc>
+          <w:tcPr>
+            <w:tcW w:w="3480" w:type="dxa"/>
+            <w:shd w:fill="FFFFFF"/>
+            <w:vAlign w:val="center"/>
+          </w:tcPr>
+          <w:p>
+            <w:pPr>
+              <w:pStyle w:val="Normal"/>
+              <w:spacing w:after="120" w:line="264" w:lineRule="auto"/>
+            </w:pPr>
+            <w:r>
+              <w:rPr>
+                <w:color w:val="000000"/>
+                <w:sz w:val="19"/>
+              </w:rPr>
+              <w:t xml:space="preserve">Userspace echoes and EKG liveness do not establish intact callbacks. Unavailable native collectors are unavailable, not a confirmed attack.</w:t>
+            </w:r>
+          </w:p>
+        </w:tc>
+      </w:tr>
+      <w:tr>
+        <w:trPr>
+          <w:cantSplit/>
+        </w:trPr>
+        <w:tc>
+          <w:tcPr>
+            <w:tcW w:w="2400" w:type="dxa"/>
+            <w:shd w:fill="F4F6F8"/>
+            <w:vAlign w:val="center"/>
+          </w:tcPr>
+          <w:p>
+            <w:pPr>
+              <w:pStyle w:val="Normal"/>
+              <w:spacing w:after="120" w:line="264" w:lineRule="auto"/>
+            </w:pPr>
+            <w:r>
+              <w:rPr>
+                <w:color w:val="000000"/>
+                <w:sz w:val="19"/>
+              </w:rPr>
+              <w:t xml:space="preserve">WER dump/suspend precursor</w:t>
+            </w:r>
+          </w:p>
+        </w:tc>
+        <w:tc>
+          <w:tcPr>
+            <w:tcW w:w="3480" w:type="dxa"/>
+            <w:shd w:fill="F4F6F8"/>
+            <w:vAlign w:val="center"/>
+          </w:tcPr>
+          <w:p>
+            <w:pPr>
+              <w:pStyle w:val="Normal"/>
+              <w:spacing w:after="120" w:line="264" w:lineRule="auto"/>
+            </w:pPr>
+            <w:r>
+              <w:rPr>
+                <w:color w:val="000000"/>
+                <w:sz w:val="19"/>
+              </w:rPr>
+              <w:t xml:space="preserve">Bounded creation/access correlation against a current native-owned process cache, with exact birth/GUID evidence where available.</w:t>
+            </w:r>
+          </w:p>
+        </w:tc>
+        <w:tc>
+          <w:tcPr>
+            <w:tcW w:w="3480" w:type="dxa"/>
+            <w:shd w:fill="F4F6F8"/>
+            <w:vAlign w:val="center"/>
+          </w:tcPr>
+          <w:p>
+            <w:pPr>
+              <w:pStyle w:val="Normal"/>
+              <w:spacing w:after="120" w:line="264" w:lineRule="auto"/>
+            </w:pPr>
+            <w:r>
+              <w:rPr>
+                <w:color w:val="000000"/>
+                <w:sz w:val="19"/>
+              </w:rPr>
+              <w:t xml:space="preserve">Post-event observation cannot guarantee pre-dump blocking. Certified ELAM/PPL deployment is not supplied.</w:t>
+            </w:r>
+          </w:p>
+        </w:tc>
+      </w:tr>
+      <w:tr>
+        <w:trPr>
+          <w:cantSplit/>
+        </w:trPr>
+        <w:tc>
+          <w:tcPr>
+            <w:tcW w:w="2400" w:type="dxa"/>
+            <w:shd w:fill="FFFFFF"/>
+            <w:vAlign w:val="center"/>
+          </w:tcPr>
+          <w:p>
+            <w:pPr>
+              <w:pStyle w:val="Normal"/>
+              <w:spacing w:after="120" w:line="264" w:lineRule="auto"/>
+            </w:pPr>
+            <w:r>
+              <w:rPr>
+                <w:color w:val="000000"/>
+                <w:sz w:val="19"/>
+              </w:rPr>
+              <w:t xml:space="preserve">Executable/path replacement during containment</w:t>
+            </w:r>
+          </w:p>
+        </w:tc>
+        <w:tc>
+          <w:tcPr>
+            <w:tcW w:w="3480" w:type="dxa"/>
+            <w:shd w:fill="FFFFFF"/>
+            <w:vAlign w:val="center"/>
+          </w:tcPr>
+          <w:p>
+            <w:pPr>
+              <w:pStyle w:val="Normal"/>
+              <w:spacing w:after="120" w:line="264" w:lineRule="auto"/>
+            </w:pPr>
+            <w:r>
+              <w:rPr>
+                <w:color w:val="000000"/>
+                <w:sz w:val="19"/>
+              </w:rPr>
+              <w:t xml:space="preserve">Retained OS process, executable and ancestor leases through durable transaction outcomes and managed compensation.</w:t>
+            </w:r>
+          </w:p>
+        </w:tc>
+        <w:tc>
+          <w:tcPr>
+            <w:tcW w:w="3480" w:type="dxa"/>
+            <w:shd w:fill="FFFFFF"/>
+            <w:vAlign w:val="center"/>
+          </w:tcPr>
+          <w:p>
+            <w:pPr>
+              <w:pStyle w:val="Normal"/>
+              <w:spacing w:after="120" w:line="264" w:lineRule="auto"/>
+            </w:pPr>
+            <w:r>
+              <w:rPr>
+                <w:color w:val="000000"/>
+                <w:sz w:val="19"/>
+              </w:rPr>
+              <w:t xml:space="preserve">The acquired file is not original mapped-image proof. PID-bound ALE admission, socket inheritance and established-flow teardown need a native backend.</w:t>
+            </w:r>
+          </w:p>
+        </w:tc>
+      </w:tr>
+      <w:tr>
+        <w:trPr>
+          <w:cantSplit/>
+        </w:trPr>
+        <w:tc>
+          <w:tcPr>
+            <w:tcW w:w="2400" w:type="dxa"/>
+            <w:shd w:fill="F4F6F8"/>
+            <w:vAlign w:val="center"/>
+          </w:tcPr>
+          <w:p>
+            <w:pPr>
+              <w:pStyle w:val="Normal"/>
+              <w:spacing w:after="120" w:line="264" w:lineRule="auto"/>
+            </w:pPr>
+            <w:r>
+              <w:rPr>
+                <w:color w:val="000000"/>
+                <w:sz w:val="19"/>
+              </w:rPr>
+              <w:t xml:space="preserve">OS or whole-root rollback</w:t>
+            </w:r>
+          </w:p>
+        </w:tc>
+        <w:tc>
+          <w:tcPr>
+            <w:tcW w:w="3480" w:type="dxa"/>
+            <w:shd w:fill="F4F6F8"/>
+            <w:vAlign w:val="center"/>
+          </w:tcPr>
+          <w:p>
+            <w:pPr>
+              <w:pStyle w:val="Normal"/>
+              <w:spacing w:after="120" w:line="264" w:lineRule="auto"/>
+            </w:pPr>
+            <w:r>
+              <w:rPr>
+                <w:color w:val="000000"/>
+                <w:sz w:val="19"/>
+              </w:rPr>
+              <w:t xml:space="preserve">Bounded recognized servicing operations, independent freshness composition and issuer-pinned TPM certification/policy-plan code.</w:t>
+            </w:r>
+          </w:p>
+        </w:tc>
+        <w:tc>
+          <w:tcPr>
+            <w:tcW w:w="3480" w:type="dxa"/>
+            <w:shd w:fill="F4F6F8"/>
+            <w:vAlign w:val="center"/>
+          </w:tcPr>
+          <w:p>
+            <w:pPr>
+              <w:pStyle w:val="Normal"/>
+              <w:spacing w:after="120" w:line="264" w:lineRule="auto"/>
+            </w:pPr>
+            <w:r>
+              <w:rPr>
+                <w:color w:val="000000"/>
+                <w:sz w:val="19"/>
+              </w:rPr>
+              <w:t xml:space="preserve">Disk VERSIONINFO is not loaded-image or patch truth. Physical enrollment, protected serialized writes and vendor mitigations remain separate.</w:t>
+            </w:r>
+          </w:p>
+        </w:tc>
+      </w:tr>
+      <w:tr>
+        <w:trPr>
+          <w:cantSplit/>
+        </w:trPr>
+        <w:tc>
+          <w:tcPr>
+            <w:tcW w:w="2400" w:type="dxa"/>
+            <w:shd w:fill="FFFFFF"/>
+            <w:vAlign w:val="center"/>
+          </w:tcPr>
+          <w:p>
+            <w:pPr>
+              <w:pStyle w:val="Normal"/>
+              <w:spacing w:after="120" w:line="264" w:lineRule="auto"/>
+            </w:pPr>
+            <w:r>
+              <w:rPr>
+                <w:color w:val="000000"/>
+                <w:sz w:val="19"/>
+              </w:rPr>
+              <w:t xml:space="preserve">Same-user history forgery</w:t>
+            </w:r>
+          </w:p>
+        </w:tc>
+        <w:tc>
+          <w:tcPr>
+            <w:tcW w:w="3480" w:type="dxa"/>
+            <w:shd w:fill="FFFFFF"/>
+            <w:vAlign w:val="center"/>
+          </w:tcPr>
+          <w:p>
+            <w:pPr>
+              <w:pStyle w:val="Normal"/>
+              <w:spacing w:after="120" w:line="264" w:lineRule="auto"/>
+            </w:pPr>
+            <w:r>
+              <w:rPr>
+                <w:color w:val="000000"/>
+                <w:sz w:val="19"/>
+              </w:rPr>
+              <w:t xml:space="preserve">Optional remote signatures commit exact recorder row bytes; service-private engine admission separates installed key/storage custody.</w:t>
+            </w:r>
+          </w:p>
+        </w:tc>
+        <w:tc>
+          <w:tcPr>
+            <w:tcW w:w="3480" w:type="dxa"/>
+            <w:shd w:fill="FFFFFF"/>
+            <w:vAlign w:val="center"/>
+          </w:tcPr>
+          <w:p>
+            <w:pPr>
+              <w:pStyle w:val="Normal"/>
+              <w:spacing w:after="120" w:line="264" w:lineRule="auto"/>
+            </w:pPr>
+            <w:r>
+              <w:rPr>
+                <w:color w:val="000000"/>
+                <w:sz w:val="19"/>
+              </w:rPr>
+              <w:t xml:space="preserve">Source Observe shares the user's failure domain. A compromised authority, whole-authority rollback and physical independence need separate controls.</w:t>
+            </w:r>
+          </w:p>
+        </w:tc>
+      </w:tr>
+    </w:tbl>
+    <w:p>
+      <w:pPr>
+        <w:pStyle w:val="Normal"/>
+        <w:spacing w:after="120" w:line="264" w:lineRule="auto"/>
+      </w:pPr>
+      <w:r>
+        <w:rPr>
+          <w:color w:val="000000"/>
+          <w:sz w:val="22"/>
+        </w:rPr>
+        <w:t xml:space="preserve"/>
+      </w:r>
+    </w:p>
+    <w:p>
+      <w:pPr>
+        <w:pStyle w:val="Heading3"/>
+        <w:keepNext/>
+        <w:spacing w:after="120" w:line="264" w:lineRule="auto"/>
+      </w:pPr>
+      <w:r>
+        <w:rPr>
+          <w:color w:val="000000"/>
+        </w:rPr>
+        <w:t xml:space="preserve">Independent recorder history and storage</w:t>
+      </w:r>
+    </w:p>
+    <w:p>
+      <w:pPr>
+        <w:pStyle w:val="Normal"/>
+        <w:spacing w:after="120" w:line="264" w:lineRule="auto"/>
+      </w:pPr>
+      <w:r>
+        <w:rPr>
+          <w:color w:val="000000"/>
+          <w:sz w:val="22"/>
+        </w:rPr>
+        <w:t xml:space="preserve">Independent recorder integrity is off by default. Enrollment uses the protected runtime request identity, pinned private HTTPS, mTLS, distinct authority signing keys and fresh signed head replies. The authority admits only the next epoch/predecessor/nonoverlapping row range. A durable pending claim supports exact reply-loss reconciliation; missing and changed history are separate outcomes. It does not rotate or claim secure erasure of Python keys.</w:t>
+      </w:r>
+    </w:p>
+    <w:p>
+      <w:pPr>
+        <w:pStyle w:val="Normal"/>
+        <w:spacing w:after="120" w:line="264" w:lineRule="auto"/>
+      </w:pPr>
+      <w:r>
+        <w:rPr>
+          <w:color w:val="000000"/>
+          <w:sz w:val="22"/>
+        </w:rPr>
+        <w:t xml:space="preserve">The archive defaults to 16 MiB and 128 epochs, with a 4–64 MiB setting. At the 60-second cadence the count limit can fill in roughly two hours of new data. Existing receipts are preserved and sealing pauses; there is no silent rollover or protection-startup block. Historical SQL work uses freshly proved indexed row identity, at most ten ranges per cycle and a five-second cooperative budget. STOP drains the retained reader and enrollment owner before SQLite release.</w:t>
+      </w:r>
+    </w:p>
+    <w:p>
+      <w:pPr>
+        <w:pStyle w:val="Heading3"/>
+        <w:keepNext/>
+        <w:spacing w:after="120" w:line="264" w:lineRule="auto"/>
+      </w:pPr>
+      <w:r>
+        <w:rPr>
+          <w:color w:val="000000"/>
+        </w:rPr>
+        <w:t xml:space="preserve">Installed service and driver-policy authority</w:t>
+      </w:r>
+    </w:p>
+    <w:p>
+      <w:pPr>
+        <w:pStyle w:val="Normal"/>
+        <w:spacing w:after="120" w:line="264" w:lineRule="auto"/>
+      </w:pPr>
+      <w:r>
+        <w:rPr>
+          <w:color w:val="000000"/>
+          <w:sz w:val="22"/>
+        </w:rPr>
+        <w:t xml:space="preserve">The isolated engine validates the actual NT SERVICE\AngeronaProtection virtual account, SCM own-process registration, restricted service token, package and native ProgramData root before loading configuration, keys or sensors. A separate enrolled desktop viewer receives bounded status only, with no key/settings mutation or fallback local engine. Lifecycle counts do not attest detector coverage. Actual signed installer provisioning and clean-VM acceptance remain required.</w:t>
+      </w:r>
+    </w:p>
+    <w:p>
+      <w:pPr>
+        <w:pStyle w:val="Normal"/>
+        <w:spacing w:after="120" w:line="264" w:lineRule="auto"/>
+      </w:pPr>
+      <w:r>
+        <w:rPr>
+          <w:color w:val="000000"/>
+          <w:sz w:val="22"/>
+        </w:rPr>
+        <w:t xml:space="preserve">Managed driver policy is diagnostic-only in default v1. Only an explicitly pinned installed v2 own-unsigned-multiple-policy profile registers its executor. Server-owned plans, two independent OS-bound non-requester approvals, durable single-use capabilities, fixed reviewed local materials and native readback govern each operation. Bounded asynchronous jobs retain native custody through STOP. Uncertain completion holds rather than retrying stale handle numbers. Its unsigned removable policy, admin tampering, boot fallback/reboot and already-loaded-driver limits remain explicit; kernel_prevention_verified stays false.</w:t>
+      </w:r>
+    </w:p>
+    <w:p>
+      <w:pPr>
+        <w:pStyle w:val="Heading3"/>
+        <w:keepNext/>
+        <w:spacing w:after="120" w:line="264" w:lineRule="auto"/>
+      </w:pPr>
+      <w:r>
+        <w:rPr>
+          <w:color w:val="000000"/>
+        </w:rPr>
+        <w:t xml:space="preserve">Observation and version history</w:t>
+      </w:r>
+    </w:p>
+    <w:tbl>
+      <w:tblPr>
+        <w:tblW w:w="9360" w:type="dxa"/>
+        <w:tblLayout w:type="fixed"/>
+        <w:tblBorders>
+          <w:top w:val="single" w:sz="4" w:color="D9D9D9"/>
+          <w:left w:val="single" w:sz="4" w:color="D9D9D9"/>
+          <w:bottom w:val="single" w:sz="4" w:color="D9D9D9"/>
+          <w:right w:val="single" w:sz="4" w:color="D9D9D9"/>
+          <w:insideH w:val="single" w:sz="4" w:color="D9D9D9"/>
+          <w:insideV w:val="single" w:sz="4" w:color="D9D9D9"/>
+        </w:tblBorders>
+        <w:tblCellMar>
+          <w:top w:w="100" w:type="dxa"/>
+          <w:left w:w="110" w:type="dxa"/>
+          <w:bottom w:w="100" w:type="dxa"/>
+          <w:right w:w="110" w:type="dxa"/>
+        </w:tblCellMar>
+      </w:tblPr>
+      <w:tblGrid>
+        <w:gridCol w:w="2400"/>
+        <w:gridCol w:w="3480"/>
+        <w:gridCol w:w="3480"/>
+      </w:tblGrid>
+      <w:tr>
+        <w:trPr>
+          <w:cantSplit/>
+          <w:tblHeader/>
+        </w:trPr>
+        <w:tc>
+          <w:tcPr>
+            <w:tcW w:w="2400" w:type="dxa"/>
+            <w:shd w:fill="DCE7F0"/>
+            <w:vAlign w:val="center"/>
+          </w:tcPr>
+          <w:p>
+            <w:pPr>
+              <w:pStyle w:val="Normal"/>
+              <w:keepNext/>
+              <w:spacing w:after="120" w:line="264" w:lineRule="auto"/>
+            </w:pPr>
+            <w:r>
+              <w:rPr>
+                <w:b/>
+                <w:color w:val="000000"/>
+                <w:sz w:val="19"/>
+              </w:rPr>
+              <w:t xml:space="preserve">Version</w:t>
+            </w:r>
+          </w:p>
+        </w:tc>
+        <w:tc>
+          <w:tcPr>
+            <w:tcW w:w="3480" w:type="dxa"/>
+            <w:shd w:fill="DCE7F0"/>
+            <w:vAlign w:val="center"/>
+          </w:tcPr>
+          <w:p>
+            <w:pPr>
+              <w:pStyle w:val="Normal"/>
+              <w:keepNext/>
+              <w:spacing w:after="120" w:line="264" w:lineRule="auto"/>
+            </w:pPr>
+            <w:r>
+              <w:rPr>
+                <w:b/>
+                <w:color w:val="000000"/>
+                <w:sz w:val="19"/>
+              </w:rPr>
+              <w:t xml:space="preserve">Change</w:t>
+            </w:r>
+          </w:p>
+        </w:tc>
+        <w:tc>
+          <w:tcPr>
+            <w:tcW w:w="3480" w:type="dxa"/>
+            <w:shd w:fill="DCE7F0"/>
+            <w:vAlign w:val="center"/>
+          </w:tcPr>
+          <w:p>
+            <w:pPr>
+              <w:pStyle w:val="Normal"/>
+              <w:keepNext/>
+              <w:spacing w:after="120" w:line="264" w:lineRule="auto"/>
+            </w:pPr>
+            <w:r>
+              <w:rPr>
+                <w:b/>
+                <w:color w:val="000000"/>
+                <w:sz w:val="19"/>
+              </w:rPr>
+              <w:t xml:space="preserve">Evidence</w:t>
+            </w:r>
+          </w:p>
+        </w:tc>
+      </w:tr>
+      <w:tr>
+        <w:trPr>
+          <w:cantSplit/>
+        </w:trPr>
+        <w:tc>
+          <w:tcPr>
+            <w:tcW w:w="2400" w:type="dxa"/>
+            <w:shd w:fill="FFFFFF"/>
+            <w:vAlign w:val="center"/>
+          </w:tcPr>
+          <w:p>
+            <w:pPr>
+              <w:pStyle w:val="Normal"/>
+              <w:spacing w:after="120" w:line="264" w:lineRule="auto"/>
+            </w:pPr>
+            <w:r>
+              <w:rPr>
+                <w:color w:val="000000"/>
+                <w:sz w:val="19"/>
+              </w:rPr>
+              <w:t xml:space="preserve">1.15.0</w:t>
+            </w:r>
+          </w:p>
+        </w:tc>
+        <w:tc>
+          <w:tcPr>
+            <w:tcW w:w="3480" w:type="dxa"/>
+            <w:shd w:fill="FFFFFF"/>
+            <w:vAlign w:val="center"/>
+          </w:tcPr>
+          <w:p>
+            <w:pPr>
+              <w:pStyle w:val="Normal"/>
+              <w:spacing w:after="120" w:line="264" w:lineRule="auto"/>
+            </w:pPr>
+            <w:r>
+              <w:rPr>
+                <w:color w:val="000000"/>
+                <w:sz w:val="19"/>
+              </w:rPr>
+              <w:t xml:space="preserve">Telemetry assurance, transaction custody, independent recorder history, installed service admission, governed driver policy and bounded rollback review.</w:t>
+            </w:r>
+          </w:p>
+        </w:tc>
+        <w:tc>
+          <w:tcPr>
+            <w:tcW w:w="3480" w:type="dxa"/>
+            <w:shd w:fill="FFFFFF"/>
+            <w:vAlign w:val="center"/>
+          </w:tcPr>
+          <w:p>
+            <w:pPr>
+              <w:pStyle w:val="Normal"/>
+              <w:spacing w:after="120" w:line="264" w:lineRule="auto"/>
+            </w:pPr>
+            <w:r>
+              <w:rPr>
+                <w:color w:val="000000"/>
+                <w:sz w:val="19"/>
+              </w:rPr>
+              <w:t xml:space="preserve">Focused offline cohorts and a fresh 180-second Full observation, with coverage and CPU/UI follow-ups retained; signed/hardware acceptance remains separate.</w:t>
+            </w:r>
+          </w:p>
+        </w:tc>
+      </w:tr>
+    </w:tbl>
+    <w:p>
+      <w:pPr>
+        <w:pStyle w:val="Normal"/>
+        <w:spacing w:after="120" w:line="264" w:lineRule="auto"/>
+      </w:pPr>
+      <w:r>
+        <w:rPr>
+          <w:color w:val="000000"/>
+          <w:sz w:val="22"/>
+        </w:rPr>
+        <w:t xml:space="preserve"/>
+      </w:r>
+    </w:p>
+    <w:p>
+      <w:pPr>
+        <w:pStyle w:val="Normal"/>
+        <w:spacing w:after="120" w:line="264" w:lineRule="auto"/>
+      </w:pPr>
+      <w:r>
+        <w:rPr>
+          <w:color w:val="000000"/>
+          <w:sz w:val="22"/>
+        </w:rPr>
+        <w:t xml:space="preserve">The Full observation ran 75/75 enabled workers but kept native ETW/Sysmon gaps, six intermittent WER-owned-cache warnings and an initial 4,446-record retention gap. No confirmed breach was established. Core/inventory CPU cost and occasional UI delays remain unresolved. The broad selfcheck retains its host Ollama listener-attestation failure. A later focused Watchdog wording fix describes worker lifecycle/deadlines without overriding detector health or coverage. Counter-Agentic's later focused presentation fix includes bounded socket state, endpoints and role; a port observation alone does not imply a listener, hijack or connection initiator. Both fixes have offline gates and preserve detection and response policy; the 180-second capture predates the changed wording.</w:t>
+      </w:r>
+    </w:p>
+    <w:p>
+      <w:pPr>
+        <w:pStyle w:val="Heading3"/>
+        <w:keepNext/>
+        <w:spacing w:after="120" w:line="264" w:lineRule="auto"/>
+      </w:pPr>
+      <w:r>
+        <w:rPr>
+          <w:color w:val="000000"/>
+        </w:rPr>
+        <w:t xml:space="preserve">Availability and evidence continuity</w:t>
+      </w:r>
+    </w:p>
+    <w:p>
+      <w:pPr>
+        <w:pStyle w:val="Normal"/>
+        <w:spacing w:after="120" w:line="264" w:lineRule="auto"/>
+      </w:pPr>
+      <w:r>
+        <w:rPr>
+          <w:color w:val="000000"/>
+          <w:sz w:val="22"/>
+        </w:rPr>
+        <w:t xml:space="preserve">An earlier 120-second follow-up session ended with a confirmed native PySide access violation after STOP. Static saved-dump unwinding included QObject/widget destruction and event dispatch, but the exact cause is unknown. This remains an unresolved P0 availability finding. The final logging-enabled 120-second session exited natively with zero and retired retained generations with source and preferences unchanged; that does not establish a crash fix. Its observation was not accepted because a bounded inventory guard fired twice, with count versus deadline cause unknown. It retained an initial 2,898-record gap, native ETW/Sysmon unavailability and 69 unknown collector states despite 75/75 running workers. No confirmed breach was established.</w:t>
+      </w:r>
+    </w:p>
+    <w:p>
+      <w:pPr>
+        <w:pStyle w:val="Normal"/>
+        <w:spacing w:after="120" w:line="264" w:lineRule="auto"/>
+      </w:pPr>
+      <w:r>
+        <w:rPr>
+          <w:color w:val="000000"/>
+          <w:sz w:val="22"/>
+        </w:rPr>
+        <w:t xml:space="preserve">Crash logging now reports both configured STARTUP writes, Python/thread/Qt hook arming and one native-fault destination, with partial/unavailable states that do not block startup. Its 55-pass observability gate is separate from native availability. Both named crash logs were later absent for an unproved reason; captured diagnostic text is preserved privately. A logged COM exception preceded continued events and was not the process exit failure. Missing logs are not attributed to an attacker, source cleanup or an external cleaner.</w:t>
       </w:r>
     </w:p>
     <w:p>
@@ -16144,6 +17260,7 @@
           <w:p>
             <w:pPr>
               <w:pStyle w:val="Normal"/>
+              <w:keepNext/>
               <w:spacing w:after="120" w:line="264" w:lineRule="auto"/>
             </w:pPr>
             <w:r>
@@ -16165,6 +17282,7 @@
           <w:p>
             <w:pPr>
               <w:pStyle w:val="Normal"/>
+              <w:keepNext/>
               <w:spacing w:after="120" w:line="264" w:lineRule="auto"/>
             </w:pPr>
             <w:r>
@@ -16186,6 +17304,7 @@
           <w:p>
             <w:pPr>
               <w:pStyle w:val="Normal"/>
+              <w:keepNext/>
               <w:spacing w:after="120" w:line="264" w:lineRule="auto"/>
             </w:pPr>
             <w:r>
@@ -16207,6 +17326,7 @@
           <w:p>
             <w:pPr>
               <w:pStyle w:val="Normal"/>
+              <w:keepNext/>
               <w:spacing w:after="120" w:line="264" w:lineRule="auto"/>
             </w:pPr>
             <w:r>
@@ -18487,6 +19607,7 @@
           <w:p>
             <w:pPr>
               <w:pStyle w:val="Normal"/>
+              <w:keepNext/>
               <w:spacing w:after="120" w:line="264" w:lineRule="auto"/>
             </w:pPr>
             <w:r>
@@ -18508,6 +19629,7 @@
           <w:p>
             <w:pPr>
               <w:pStyle w:val="Normal"/>
+              <w:keepNext/>
               <w:spacing w:after="120" w:line="264" w:lineRule="auto"/>
             </w:pPr>
             <w:r>
@@ -22642,6 +23764,7 @@
     <w:p>
       <w:pPr>
         <w:pStyle w:val="Normal"/>
+        <w:keepLines/>
         <w:spacing w:after="120" w:line="264" w:lineRule="auto"/>
       </w:pPr>
       <w:r>
@@ -22649,20 +23772,7 @@
           <w:color w:val="000000"/>
           <w:sz w:val="22"/>
         </w:rPr>
-        <w:t xml:space="preserve">• AndroidQF acquisition is separate from examining an existing collection. It</w:t>
-      </w:r>
-    </w:p>
-    <w:p>
-      <w:pPr>
-        <w:pStyle w:val="Normal"/>
-        <w:spacing w:after="120" w:line="264" w:lineRule="auto"/>
-      </w:pPr>
-      <w:r>
-        <w:rPr>
-          <w:color w:val="000000"/>
-          <w:sz w:val="22"/>
-        </w:rPr>
-        <w:t xml:space="preserve">downloads a collector, needs device-owner consent, changes device state and can retain sensitive partial output.</w:t>
+        <w:t xml:space="preserve">• AndroidQF acquisition is separate from examining an existing collection. It downloads a collector, needs device-owner consent, changes device state and can retain sensitive partial output.</w:t>
       </w:r>
     </w:p>
     <w:p>
@@ -22819,6 +23929,7 @@
           <w:p>
             <w:pPr>
               <w:pStyle w:val="Normal"/>
+              <w:keepNext/>
               <w:spacing w:after="120" w:line="264" w:lineRule="auto"/>
             </w:pPr>
             <w:r>
@@ -22840,6 +23951,7 @@
           <w:p>
             <w:pPr>
               <w:pStyle w:val="Normal"/>
+              <w:keepNext/>
               <w:spacing w:after="120" w:line="264" w:lineRule="auto"/>
             </w:pPr>
             <w:r>
@@ -23274,6 +24386,7 @@
           <w:p>
             <w:pPr>
               <w:pStyle w:val="Normal"/>
+              <w:keepNext/>
               <w:spacing w:after="120" w:line="264" w:lineRule="auto"/>
             </w:pPr>
             <w:r>
@@ -23295,6 +24408,7 @@
           <w:p>
             <w:pPr>
               <w:pStyle w:val="Normal"/>
+              <w:keepNext/>
               <w:spacing w:after="120" w:line="264" w:lineRule="auto"/>
             </w:pPr>
             <w:r>
@@ -23316,6 +24430,7 @@
           <w:p>
             <w:pPr>
               <w:pStyle w:val="Normal"/>
+              <w:keepNext/>
               <w:spacing w:after="120" w:line="264" w:lineRule="auto"/>
             </w:pPr>
             <w:r>
@@ -24134,6 +25249,7 @@
           <w:p>
             <w:pPr>
               <w:pStyle w:val="Normal"/>
+              <w:keepNext/>
               <w:spacing w:after="120" w:line="264" w:lineRule="auto"/>
             </w:pPr>
             <w:r>
@@ -24155,6 +25271,7 @@
           <w:p>
             <w:pPr>
               <w:pStyle w:val="Normal"/>
+              <w:keepNext/>
               <w:spacing w:after="120" w:line="264" w:lineRule="auto"/>
             </w:pPr>
             <w:r>
@@ -24877,6 +25994,500 @@
           <w:sz w:val="22"/>
         </w:rPr>
         <w:t xml:space="preserve">The security-flow matrix maps focused regression suites to the implementation. README historical totals remain dated evidence; final validation and fresh runtime observation are separate receipts for the published revision.</w:t>
+      </w:r>
+    </w:p>
+    <w:p>
+      <w:pPr>
+        <w:pStyle w:val="Heading2"/>
+        <w:keepNext/>
+        <w:spacing w:after="120" w:line="264" w:lineRule="auto"/>
+      </w:pPr>
+      <w:r>
+        <w:rPr>
+          <w:color w:val="000000"/>
+        </w:rPr>
+        <w:t xml:space="preserve">Independent recorder integrity</w:t>
+      </w:r>
+    </w:p>
+    <w:p>
+      <w:pPr>
+        <w:pStyle w:val="Normal"/>
+        <w:spacing w:after="120" w:line="264" w:lineRule="auto"/>
+      </w:pPr>
+      <w:r>
+        <w:rPr>
+          <w:color w:val="000000"/>
+          <w:sz w:val="22"/>
+        </w:rPr>
+        <w:t xml:space="preserve">Angerona 1.15 can ask a separately administered authority to sign commitments to committed Flight Recorder rows. This option is off by default. Local collection and the dashboard continue if the authority, enrollment or archive is unavailable. A signature commits bytes; it does not verify the truth of an event, sensor coverage, an uncompromised kernel or the physical independence of the authority.</w:t>
+      </w:r>
+    </w:p>
+    <w:p>
+      <w:pPr>
+        <w:pStyle w:val="Normal"/>
+        <w:spacing w:after="120" w:line="264" w:lineRule="auto"/>
+      </w:pPr>
+      <w:r>
+        <w:rPr>
+          <w:color w:val="000000"/>
+          <w:sz w:val="22"/>
+        </w:rPr>
+        <w:t xml:space="preserve">The image is an offline demonstration. Its receipt, counts and connection state are synthetic; no host key, witness or service was accessed to create it.</w:t>
+      </w:r>
+    </w:p>
+    <w:p>
+      <w:pPr>
+        <w:pStyle w:val="Heading3"/>
+        <w:keepNext/>
+        <w:spacing w:after="120" w:line="264" w:lineRule="auto"/>
+      </w:pPr>
+      <w:r>
+        <w:rPr>
+          <w:color w:val="000000"/>
+        </w:rPr>
+        <w:t xml:space="preserve">What it changes</w:t>
+      </w:r>
+    </w:p>
+    <w:p>
+      <w:pPr>
+        <w:pStyle w:val="Normal"/>
+        <w:spacing w:after="120" w:line="264" w:lineRule="auto"/>
+      </w:pPr>
+      <w:r>
+        <w:rPr>
+          <w:color w:val="000000"/>
+          <w:sz w:val="22"/>
+        </w:rPr>
+        <w:t xml:space="preserve">The authority has a dedicated append operation. It checks each epoch's exact predecessor, next epoch number and increasing, nonoverlapping row range before signing. The host's request key and the authority's Ed25519 signing key must have different raw public-key material, even when their labels differ. The authority's signing private key remains on the independent machine.</w:t>
+      </w:r>
+    </w:p>
+    <w:p>
+      <w:pPr>
+        <w:pStyle w:val="Normal"/>
+        <w:spacing w:after="120" w:line="264" w:lineRule="auto"/>
+      </w:pPr>
+      <w:r>
+        <w:rPr>
+          <w:color w:val="000000"/>
+          <w:sz w:val="22"/>
+        </w:rPr>
+        <w:t xml:space="preserve">Each archived receipt commits an ordered index of per-row SHA-256 commitments, including the original stored timestamp, module, severity, message, details text and HMAC. Rewriting an older row and recomputing a valid host HMAC cannot produce a matching independent receipt. Missing rows, including holes caused by severity-based retention, remain unavailable evidence. Angerona does not attribute that loss to an attacker or silently call it successful verification.</w:t>
+      </w:r>
+    </w:p>
+    <w:p>
+      <w:pPr>
+        <w:pStyle w:val="Normal"/>
+        <w:spacing w:after="120" w:line="264" w:lineRule="auto"/>
+      </w:pPr>
+      <w:r>
+        <w:rPr>
+          <w:color w:val="000000"/>
+          <w:sz w:val="22"/>
+        </w:rPr>
+        <w:t xml:space="preserve">This design avoids claiming secure erasure of Python objects or rotating the existing recorder key. Possession of the current host request credential can authorize new append requests; it does not authorize replacement of already sealed ranges. Compromise of the authority or its signing key is a separate failure boundary.</w:t>
+      </w:r>
+    </w:p>
+    <w:p>
+      <w:pPr>
+        <w:pStyle w:val="Normal"/>
+        <w:spacing w:after="120" w:line="264" w:lineRule="auto"/>
+      </w:pPr>
+      <w:r>
+        <w:rPr>
+          <w:color w:val="000000"/>
+          <w:sz w:val="22"/>
+        </w:rPr>
+        <w:t xml:space="preserve">The online guide includes this workflow diagram; Figure 6 shows the combined 1.15 hardening layers.</w:t>
+      </w:r>
+    </w:p>
+    <w:p>
+      <w:pPr>
+        <w:pStyle w:val="Heading3"/>
+        <w:keepNext/>
+        <w:spacing w:after="120" w:line="264" w:lineRule="auto"/>
+      </w:pPr>
+      <w:r>
+        <w:rPr>
+          <w:color w:val="000000"/>
+        </w:rPr>
+        <w:t xml:space="preserve">Enrollment</w:t>
+      </w:r>
+    </w:p>
+    <w:p>
+      <w:pPr>
+        <w:pStyle w:val="Normal"/>
+        <w:spacing w:after="120" w:line="264" w:lineRule="auto"/>
+      </w:pPr>
+      <w:r>
+        <w:rPr>
+          <w:color w:val="000000"/>
+          <w:sz w:val="22"/>
+        </w:rPr>
+        <w:t xml:space="preserve">1. Prepare an authority on another independently administered machine, outside the monitored host's disk snapshots and restore jobs. The supplied authority server requires protected state and keys, mutual TLS, a private bind address, separate client-public and authority-private Ed25519 keys, and the matching installation/client IDs. Enable both --enable-recorder-epochs and --enable-client-response-floors. Protection against rollback of the authority's own entire state requires a separately supplied generation floor or accepted hardware binding.</w:t>
+      </w:r>
+    </w:p>
+    <w:p>
+      <w:pPr>
+        <w:pStyle w:val="Normal"/>
+        <w:spacing w:after="120" w:line="264" w:lineRule="auto"/>
+      </w:pPr>
+      <w:r>
+        <w:rPr>
+          <w:color w:val="000000"/>
+          <w:sz w:val="22"/>
+        </w:rPr>
+        <w:t xml:space="preserve">2. In Settings &gt; General &gt; Independent recorder integrity, expand Remote witness enrollment and storage. Use Create or show this host's public enrollment key to resolve the profile's protected request identity on a retained worker. Enroll that public key and the displayed IDs on the authority. Existing malformed or unavailable private identities are held, rather than automatically replaced. No private request key is displayed.</w:t>
+      </w:r>
+    </w:p>
+    <w:p>
+      <w:pPr>
+        <w:pStyle w:val="Normal"/>
+        <w:spacing w:after="120" w:line="264" w:lineRule="auto"/>
+      </w:pPr>
+      <w:r>
+        <w:rPr>
+          <w:color w:val="000000"/>
+          <w:sz w:val="22"/>
+        </w:rPr>
+        <w:t xml:space="preserve">3. Enter the authority's private HTTPS IP address ending in /v1/authority, TLS certificate SHA-256 pin, authority Ed25519 public PEM, matching IDs, and absolute local client-certificate/key paths. An optional CA file can supply the authority's PKI chain. TLS validation and the pin are both required. Public, loopback, metadata and DNS-discovered endpoints are not accepted by this enrollment profile.</w:t>
+      </w:r>
+    </w:p>
+    <w:p>
+      <w:pPr>
+        <w:pStyle w:val="Normal"/>
+        <w:spacing w:after="120" w:line="264" w:lineRule="auto"/>
+      </w:pPr>
+      <w:r>
+        <w:rPr>
+          <w:color w:val="000000"/>
+          <w:sz w:val="22"/>
+        </w:rPr>
+        <w:t xml:space="preserve">4. Confirm independent administration, choose the storage limit, enable the option, save and restart. The declaration is an operator assertion, not physical-host attestation. Settings contains public enrollment metadata and TLS file paths; the request private key belongs to the OS credential store.</w:t>
+      </w:r>
+    </w:p>
+    <w:p>
+      <w:pPr>
+        <w:pStyle w:val="Normal"/>
+        <w:spacing w:after="120" w:line="264" w:lineRule="auto"/>
+      </w:pPr>
+      <w:r>
+        <w:rPr>
+          <w:color w:val="000000"/>
+          <w:sz w:val="22"/>
+        </w:rPr>
+        <w:t xml:space="preserve">The GUI-generated identity belongs to the current runtime profile. An isolated NT SERVICE\AngeronaProtection installation requires credentials provisioned under that actual service account and its protected data root. An interactive user's identity does not automatically enroll the service. The status-only protection console has no key or settings mutation endpoint.</w:t>
+      </w:r>
+    </w:p>
+    <w:p>
+      <w:pPr>
+        <w:pStyle w:val="Heading3"/>
+        <w:keepNext/>
+        <w:spacing w:after="120" w:line="264" w:lineRule="auto"/>
+      </w:pPr>
+      <w:r>
+        <w:rPr>
+          <w:color w:val="000000"/>
+        </w:rPr>
+        <w:t xml:space="preserve">Storage, progress and recovery</w:t>
+      </w:r>
+    </w:p>
+    <w:p>
+      <w:pPr>
+        <w:pStyle w:val="Normal"/>
+        <w:spacing w:after="120" w:line="264" w:lineRule="auto"/>
+      </w:pPr>
+      <w:r>
+        <w:rPr>
+          <w:color w:val="000000"/>
+          <w:sz w:val="22"/>
+        </w:rPr>
+        <w:t xml:space="preserve">The default receipt archive budget is 16 MiB, configurable from 4–64 MiB, with at most 128 sealed epochs. The admission budget includes archived, pending and write-scratch bytes, and reserves room before a remote append. Metadata has its own 1 MiB per-file bound. These are application admission limits, not an OS disk quota or protection against unrelated writers.</w:t>
+      </w:r>
+    </w:p>
+    <w:p>
+      <w:pPr>
+        <w:pStyle w:val="Normal"/>
+        <w:spacing w:after="120" w:line="264" w:lineRule="auto"/>
+      </w:pPr>
+      <w:r>
+        <w:rPr>
+          <w:color w:val="000000"/>
+          <w:sz w:val="22"/>
+        </w:rPr>
+        <w:t xml:space="preserve">At the default 60-second cadence, continuous new rows may reach the epoch-count limit in roughly two hours, earlier if the byte limit is reached. The worker preserves existing receipts, pauses sealing and reports the hold. It does not delete originals, silently start a new history or block protection startup. Review/export and controlled archive lifecycle management require explicit operator handling; automatic long-term rollover is not provided in this version.</w:t>
+      </w:r>
+    </w:p>
+    <w:p>
+      <w:pPr>
+        <w:pStyle w:val="Normal"/>
+        <w:spacing w:after="120" w:line="264" w:lineRule="auto"/>
+      </w:pPr>
+      <w:r>
+        <w:rPr>
+          <w:color w:val="000000"/>
+          <w:sz w:val="22"/>
+        </w:rPr>
+        <w:t xml:space="preserve">Each capture is limited to 4,096 rows and 16 MiB of row data; larger valid batches are split into bounded prefixes. Historical verification checks up to 10 ranges per cycle with a cooperative five-second local-work budget. Cached status shows the sealed tip, archive use, pending commit, verification backlog, known missing rows and latest changed rows. A completed cycle does not mean every historic row was checked during that cycle. Supplementary SQLite runtime limits are used where available; mandatory bounded SQL projections also apply on supported Python versions without that API.</w:t>
+      </w:r>
+    </w:p>
+    <w:p>
+      <w:pPr>
+        <w:pStyle w:val="Normal"/>
+        <w:spacing w:after="120" w:line="264" w:lineRule="auto"/>
+      </w:pPr>
+      <w:r>
+        <w:rPr>
+          <w:color w:val="000000"/>
+          <w:sz w:val="22"/>
+        </w:rPr>
+        <w:t xml:space="preserve">A durable pending claim precedes the remote append. On reply loss or failed local finalization, restart reconciles only that exact claim with a fresh signed authority head. Unexpected ahead/behind/forked state, missing archives, corrupt metadata and unexplained scratch are preserved and held for review. There is no automatic baseline reset, key replacement or evidence repair.</w:t>
+      </w:r>
+    </w:p>
+    <w:p>
+      <w:pPr>
+        <w:pStyle w:val="Normal"/>
+        <w:spacing w:after="120" w:line="264" w:lineRule="auto"/>
+      </w:pPr>
+      <w:r>
+        <w:rPr>
+          <w:color w:val="000000"/>
+          <w:sz w:val="22"/>
+        </w:rPr>
+        <w:t xml:space="preserve">Closing Settings detaches its view. The runtime still owns an admitted credential task and drains it on STOP. Both that task and the recorder reader must actually retire before their storage/custody is released. Uncertain native cleanup retains its owner and cannot claim successful replacement.</w:t>
+      </w:r>
+    </w:p>
+    <w:p>
+      <w:pPr>
+        <w:pStyle w:val="Heading3"/>
+        <w:keepNext/>
+        <w:spacing w:after="120" w:line="264" w:lineRule="auto"/>
+      </w:pPr>
+      <w:r>
+        <w:rPr>
+          <w:color w:val="000000"/>
+        </w:rPr>
+        <w:t xml:space="preserve">Freshness limits</w:t>
+      </w:r>
+    </w:p>
+    <w:p>
+      <w:pPr>
+        <w:pStyle w:val="Normal"/>
+        <w:spacing w:after="120" w:line="264" w:lineRule="auto"/>
+      </w:pPr>
+      <w:r>
+        <w:rPr>
+          <w:color w:val="000000"/>
+          <w:sz w:val="22"/>
+        </w:rPr>
+        <w:t xml:space="preserve">Archived signatures alone are historical authenticity, not proof of the current authority head. Production requests require pinned HTTPS, fresh signed nonce-bound responses and a remote response continuity floor. That floor is outside the monitored host's snapshot boundary; it is not a local counter file. Rollback of the authority's own entire trusted root still needs independent generation-floor or hardware protection. A response sequence floor alone is not a permanent incident latch or proof against every authority rollback.</w:t>
+      </w:r>
+    </w:p>
+    <w:p>
+      <w:pPr>
+        <w:pStyle w:val="Normal"/>
+        <w:spacing w:after="120" w:line="264" w:lineRule="auto"/>
+      </w:pPr>
+      <w:r>
+        <w:rPr>
+          <w:color w:val="000000"/>
+          <w:sz w:val="22"/>
+        </w:rPr>
+        <w:t xml:space="preserve">The separate TPM verification library requires authenticated physical-device enrollment and a protected external writer. It is not automatically deployed or substituted for a missing witness. See the 1.15 release scope for the other hardening layers and their remaining deployment requirements.</w:t>
+      </w:r>
+    </w:p>
+    <w:p>
+      <w:pPr>
+        <w:pStyle w:val="Heading2"/>
+        <w:keepNext/>
+        <w:spacing w:after="120" w:line="264" w:lineRule="auto"/>
+      </w:pPr>
+      <w:r>
+        <w:rPr>
+          <w:color w:val="000000"/>
+        </w:rPr>
+        <w:t xml:space="preserve">Managed vulnerable-driver policy</w:t>
+      </w:r>
+    </w:p>
+    <w:p>
+      <w:pPr>
+        <w:pStyle w:val="Normal"/>
+        <w:spacing w:after="120" w:line="264" w:lineRule="auto"/>
+      </w:pPr>
+      <w:r>
+        <w:rPr>
+          <w:color w:val="000000"/>
+          <w:sz w:val="22"/>
+        </w:rPr>
+        <w:t xml:space="preserve">Angerona 1.15 includes an installed-service path for preparing, approving and applying a reviewed driver deny policy. Source Observe has no enrollment or elevation shortcut. The default response-service v1 provisioning remains diagnostic-only. Only an explicitly provisioned v2 profile can register the native policy executor.</w:t>
+      </w:r>
+    </w:p>
+    <w:p>
+      <w:pPr>
+        <w:pStyle w:val="Normal"/>
+        <w:spacing w:after="120" w:line="264" w:lineRule="auto"/>
+      </w:pPr>
+      <w:r>
+        <w:rPr>
+          <w:color w:val="000000"/>
+          <w:sz w:val="22"/>
+        </w:rPr>
+        <w:t xml:space="preserve">The implemented profile is an unsigned, removable multiple-policy base deny policy. Its checks constrain kernel driver denials while preserving the required user-mode allow rules. It does not activate HVCI, change Secure Boot, install a kernel driver or remove arbitrary Windows policies. Local administrators can tamper with an unsigned policy; boot audit fallback and reboot requirements remain part of deployment review.</w:t>
+      </w:r>
+    </w:p>
+    <w:p>
+      <w:pPr>
+        <w:pStyle w:val="Heading3"/>
+        <w:keepNext/>
+        <w:spacing w:after="120" w:line="264" w:lineRule="auto"/>
+      </w:pPr>
+      <w:r>
+        <w:rPr>
+          <w:color w:val="000000"/>
+        </w:rPr>
+        <w:t xml:space="preserve">Fixed enrollment</w:t>
+      </w:r>
+    </w:p>
+    <w:p>
+      <w:pPr>
+        <w:pStyle w:val="Normal"/>
+        <w:spacing w:after="120" w:line="264" w:lineRule="auto"/>
+      </w:pPr>
+      <w:r>
+        <w:rPr>
+          <w:color w:val="000000"/>
+          <w:sz w:val="22"/>
+        </w:rPr>
+        <w:t xml:space="preserve">A signed installed package, immutable publisher pins, actual SCM registration, restricted service token, native administration rights and protected data/key custody are prerequisites. Installation must supply exact angerona.response-service.provisioning.v2 provisioning with the own-unsigned-multiple-policy profile and its pinned manifest hash.</w:t>
+      </w:r>
+    </w:p>
+    <w:p>
+      <w:pPr>
+        <w:pStyle w:val="Normal"/>
+        <w:spacing w:after="120" w:line="264" w:lineRule="auto"/>
+      </w:pPr>
+      <w:r>
+        <w:rPr>
+          <w:color w:val="000000"/>
+          <w:sz w:val="22"/>
+        </w:rPr>
+        <w:t xml:space="preserve">The fixed service root is native ProgramData's Angerona/ResponseBroker/DriverPolicy. The profile references reviewed local material IDs and pinned artifacts: the manifest, catalog, XML, compiled CIP, compatibility reports and fixed native-tool hashes/publishers. Separate private broker, journal, capability and transport keys stay under service custody. Downloaded blocklists, arbitrary caller paths, script text and GUI claims do not enroll authority. Review the actual service composition and host admission.</w:t>
+      </w:r>
+    </w:p>
+    <w:p>
+      <w:pPr>
+        <w:pStyle w:val="Heading3"/>
+        <w:keepNext/>
+        <w:spacing w:after="120" w:line="264" w:lineRule="auto"/>
+      </w:pPr>
+      <w:r>
+        <w:rPr>
+          <w:color w:val="000000"/>
+        </w:rPr>
+        <w:t xml:space="preserve">Audit, approval, enforcement and removal</w:t>
+      </w:r>
+    </w:p>
+    <w:p>
+      <w:pPr>
+        <w:pStyle w:val="Normal"/>
+        <w:spacing w:after="120" w:line="264" w:lineRule="auto"/>
+      </w:pPr>
+      <w:r>
+        <w:rPr>
+          <w:color w:val="000000"/>
+          <w:sz w:val="22"/>
+        </w:rPr>
+        <w:t xml:space="preserve">The online guide includes this workflow diagram; Figure 6 shows the combined 1.15 hardening layers.</w:t>
+      </w:r>
+    </w:p>
+    <w:p>
+      <w:pPr>
+        <w:pStyle w:val="Normal"/>
+        <w:spacing w:after="120" w:line="264" w:lineRule="auto"/>
+      </w:pPr>
+      <w:r>
+        <w:rPr>
+          <w:color w:val="000000"/>
+          <w:sz w:val="22"/>
+        </w:rPr>
+        <w:t xml:space="preserve">The requester prepares a server-owned plan and receives its proposal digest. Two other enrolled OS users independently sign the exact approval purpose. The requester can then request execution. Enforce mode requires the previous audit evidence, elapsed review window and separately pinned compatibility and recovery review. Removal requires its own approved plan and proof of the exact owned unsigned policy. Signed/UEFI-locked policy removal is unavailable.</w:t>
+      </w:r>
+    </w:p>
+    <w:p>
+      <w:pPr>
+        <w:pStyle w:val="Normal"/>
+        <w:spacing w:after="120" w:line="264" w:lineRule="auto"/>
+      </w:pPr>
+      <w:r>
+        <w:rPr>
+          <w:color w:val="000000"/>
+          <w:sz w:val="22"/>
+        </w:rPr>
+        <w:t xml:space="preserve">The closed IPC operations are driver.status, driver.prepare, driver.approve, driver.execute, driver.poll and driver.cancel. Prepare/approve/execute queue onto one retained service worker and immediately return opaque job IDs; polling reads bounded cached results. The native pipe captures the Windows peer identity. Requests cannot supply a replacement peer, executor, credential verifier, native guard or raw policy. Each request, including polling/cancellation, rechecks the pinned provisioning generation and current enrollment. A changed profile requires controlled service review and restart, rather than silent authority replacement.</w:t>
+      </w:r>
+    </w:p>
+    <w:p>
+      <w:pPr>
+        <w:pStyle w:val="Normal"/>
+        <w:spacing w:after="120" w:line="264" w:lineRule="auto"/>
+      </w:pPr>
+      <w:r>
+        <w:rPr>
+          <w:color w:val="000000"/>
+          <w:sz w:val="22"/>
+        </w:rPr>
+        <w:t xml:space="preserve">Cancellation fences future work. It cannot undo a native change that already committed. An interrupted or uncertain operation requires reconciliation with the durable intent journal and actual native configuration before retrying. The runtime bounds its plan and job caches to 64 entries each; capacity holds require operator review rather than unbounded cache growth.</w:t>
+      </w:r>
+    </w:p>
+    <w:p>
+      <w:pPr>
+        <w:pStyle w:val="Heading3"/>
+        <w:keepNext/>
+        <w:spacing w:after="120" w:line="264" w:lineRule="auto"/>
+      </w:pPr>
+      <w:r>
+        <w:rPr>
+          <w:color w:val="000000"/>
+        </w:rPr>
+        <w:t xml:space="preserve">Configuration receipts and remaining acceptance</w:t>
+      </w:r>
+    </w:p>
+    <w:p>
+      <w:pPr>
+        <w:pStyle w:val="Normal"/>
+        <w:spacing w:after="120" w:line="264" w:lineRule="auto"/>
+      </w:pPr>
+      <w:r>
+        <w:rPr>
+          <w:color w:val="000000"/>
+          <w:sz w:val="22"/>
+        </w:rPr>
+        <w:t xml:space="preserve">configured means the admitted backend or an exact native configuration postcondition was observed in its stated scope. The service always reports kernel_prevention_verified: false. Configuration readback alone does not prove a driver was blocked, remove an already loaded driver, restore stripped callbacks, verify telemetry, or prove reboot compatibility. Actual Windows build-specific audit/enforce/reboot/removal testing belongs in a disposable signed-installation acceptance environment.</w:t>
+      </w:r>
+    </w:p>
+    <w:p>
+      <w:pPr>
+        <w:pStyle w:val="Normal"/>
+        <w:spacing w:after="120" w:line="264" w:lineRule="auto"/>
+      </w:pPr>
+      <w:r>
+        <w:rPr>
+          <w:color w:val="000000"/>
+          <w:sz w:val="22"/>
+        </w:rPr>
+        <w:t xml:space="preserve">The native paths retain process/job, file, pipe, OVERLAPPED, event, buffer and peer/token/SCM handle owners. STOP cancels queued work and requires real retirement before releasing custody. Unknown completion or close results keep their owners and fence replacement; they cannot become successful cleanup receipts. This implementation does not grant ELAM/PPL protection or immunity to an administrator or kernel compromise.</w:t>
+      </w:r>
+    </w:p>
+    <w:p>
+      <w:pPr>
+        <w:pStyle w:val="Normal"/>
+        <w:spacing w:after="120" w:line="264" w:lineRule="auto"/>
+      </w:pPr>
+      <w:r>
+        <w:rPr>
+          <w:color w:val="000000"/>
+          <w:sz w:val="22"/>
+        </w:rPr>
+        <w:t xml:space="preserve">No WDAC, SCM, ACL, HVCI, Secure Boot or TPM change is performed merely by installing the source update or opening its dashboard. Signed installation, native rights, real enrollment/materials, ConfigCI availability, independent operator workflows and clean-VM acceptance remain deployment requirements.</w:t>
       </w:r>
     </w:p>
     <w:p>
@@ -25160,7 +26771,7 @@
         <w:color w:val="667085"/>
         <w:sz w:val="17"/>
       </w:rPr>
-      <w:t>Angerona Suite  |  v1.14.2  |  29 October 2026</w:t>
+      <w:t>Angerona Suite  |  v1.15.0  |  30 October 2026</w:t>
     </w:r>
   </w:p>
 </w:ftr>
@@ -25200,7 +26811,7 @@
         <w:color w:val="667085"/>
         <w:sz w:val="17"/>
       </w:rPr>
-      <w:t>ANGERONA  |  MASTER MANUAL  |  v1.14.2</w:t>
+      <w:t>ANGERONA  |  MASTER MANUAL  |  v1.15.0</w:t>
     </w:r>
   </w:p>
 </w:hdr>
@@ -25389,6 +27000,50 @@
       </w:rPr>
     </w:lvl>
   </w:abstractNum>
+  <!-- ANGERONA_LIST_ABSTRACTS_START -->
+  <!-- ANGERONA_BULLET_SOURCE 1000 9 -->
+  <w:abstractNum xmlns:w="http://schemas.openxmlformats.org/wordprocessingml/2006/main" w:abstractNumId="1000">
+    <w:multiLevelType w:val="singleLevel"/>
+    <w:lvl w:ilvl="0">
+      <w:start w:val="1"/>
+      <w:numFmt w:val="bullet"/>
+      <w:lvlText w:val="•"/>
+      <w:lvlJc w:val="left"/>
+      <w:pPr>
+        <w:tabs>
+          <w:tab w:val="num" w:pos="540"/>
+        </w:tabs>
+        <w:ind w:left="540" w:hanging="270"/>
+        <w:spacing w:after="80" w:line="300" w:lineRule="auto"/>
+      </w:pPr>
+      <w:rPr>
+        <w:rFonts w:ascii="Calibri" w:hAnsi="Calibri" w:eastAsia="Calibri" w:cs="Calibri"/>
+      </w:rPr>
+    </w:lvl>
+  </w:abstractNum>
+  <!-- ANGERONA_BULLET_SOURCE 1001 8 -->
+  <w:abstractNum xmlns:w="http://schemas.openxmlformats.org/wordprocessingml/2006/main" w:abstractNumId="1001">
+    <w:nsid w:val="FFFFFF89"/>
+    <w:multiLevelType w:val="singleLevel"/>
+    <w:tmpl w:val="29761A62"/>
+    <w:lvl w:ilvl="0">
+      <w:start w:val="1"/>
+      <w:numFmt w:val="bullet"/>
+      <w:pStyle w:val="ListBullet"/>
+      <w:lvlText w:val="•"/>
+      <w:lvlJc w:val="left"/>
+      <w:pPr>
+        <w:tabs>
+          <w:tab w:val="num" w:pos="360"/>
+        </w:tabs>
+        <w:ind w:left="360" w:hanging="360"/>
+      </w:pPr>
+      <w:rPr>
+        <w:rFonts w:ascii="Calibri" w:hAnsi="Calibri" w:hint="default" w:eastAsia="Calibri" w:cs="Calibri"/>
+      </w:rPr>
+    </w:lvl>
+  </w:abstractNum>
+  <!-- ANGERONA_LIST_ABSTRACTS_END -->
   <w:num w:numId="1">
     <w:abstractNumId w:val="8"/>
   </w:num>
@@ -25487,6 +27142,213 @@
       <w:startOverride w:val="1"/>
     </w:lvlOverride>
   </w:num>
+  <!-- ANGERONA_LIST_RESTARTS_START -->
+  <!-- ANGERONA_LIST_FORMAT_V3 -->
+  <w:num xmlns:w="http://schemas.openxmlformats.org/wordprocessingml/2006/main" w:numId="1000">
+    <w:abstractNumId w:val="10"/>
+    <w:lvlOverride w:ilvl="0">
+      <w:startOverride w:val="1"/>
+    </w:lvlOverride>
+  </w:num>
+  <w:num xmlns:w="http://schemas.openxmlformats.org/wordprocessingml/2006/main" w:numId="1001">
+    <w:abstractNumId w:val="1000"/>
+    <w:lvlOverride w:ilvl="0">
+      <w:startOverride w:val="1"/>
+    </w:lvlOverride>
+  </w:num>
+  <w:num xmlns:w="http://schemas.openxmlformats.org/wordprocessingml/2006/main" w:numId="1002">
+    <w:abstractNumId w:val="1000"/>
+    <w:lvlOverride w:ilvl="0">
+      <w:startOverride w:val="1"/>
+    </w:lvlOverride>
+  </w:num>
+  <w:num xmlns:w="http://schemas.openxmlformats.org/wordprocessingml/2006/main" w:numId="1003">
+    <w:abstractNumId w:val="1000"/>
+    <w:lvlOverride w:ilvl="0">
+      <w:startOverride w:val="1"/>
+    </w:lvlOverride>
+  </w:num>
+  <w:num xmlns:w="http://schemas.openxmlformats.org/wordprocessingml/2006/main" w:numId="1004">
+    <w:abstractNumId w:val="1001"/>
+    <w:lvlOverride w:ilvl="0">
+      <w:startOverride w:val="1"/>
+    </w:lvlOverride>
+  </w:num>
+  <w:num xmlns:w="http://schemas.openxmlformats.org/wordprocessingml/2006/main" w:numId="1005">
+    <w:abstractNumId w:val="10"/>
+    <w:lvlOverride w:ilvl="0">
+      <w:startOverride w:val="1"/>
+    </w:lvlOverride>
+  </w:num>
+  <w:num xmlns:w="http://schemas.openxmlformats.org/wordprocessingml/2006/main" w:numId="1006">
+    <w:abstractNumId w:val="1001"/>
+    <w:lvlOverride w:ilvl="0">
+      <w:startOverride w:val="1"/>
+    </w:lvlOverride>
+  </w:num>
+  <w:num xmlns:w="http://schemas.openxmlformats.org/wordprocessingml/2006/main" w:numId="1007">
+    <w:abstractNumId w:val="1000"/>
+    <w:lvlOverride w:ilvl="0">
+      <w:startOverride w:val="1"/>
+    </w:lvlOverride>
+  </w:num>
+  <w:num xmlns:w="http://schemas.openxmlformats.org/wordprocessingml/2006/main" w:numId="1008">
+    <w:abstractNumId w:val="1000"/>
+    <w:lvlOverride w:ilvl="0">
+      <w:startOverride w:val="1"/>
+    </w:lvlOverride>
+  </w:num>
+  <w:num xmlns:w="http://schemas.openxmlformats.org/wordprocessingml/2006/main" w:numId="1009">
+    <w:abstractNumId w:val="1000"/>
+    <w:lvlOverride w:ilvl="0">
+      <w:startOverride w:val="1"/>
+    </w:lvlOverride>
+  </w:num>
+  <w:num xmlns:w="http://schemas.openxmlformats.org/wordprocessingml/2006/main" w:numId="1010">
+    <w:abstractNumId w:val="1001"/>
+    <w:lvlOverride w:ilvl="0">
+      <w:startOverride w:val="1"/>
+    </w:lvlOverride>
+  </w:num>
+  <w:num xmlns:w="http://schemas.openxmlformats.org/wordprocessingml/2006/main" w:numId="1011">
+    <w:abstractNumId w:val="1001"/>
+    <w:lvlOverride w:ilvl="0">
+      <w:startOverride w:val="1"/>
+    </w:lvlOverride>
+  </w:num>
+  <w:num xmlns:w="http://schemas.openxmlformats.org/wordprocessingml/2006/main" w:numId="1012">
+    <w:abstractNumId w:val="1001"/>
+    <w:lvlOverride w:ilvl="0">
+      <w:startOverride w:val="1"/>
+    </w:lvlOverride>
+  </w:num>
+  <w:num xmlns:w="http://schemas.openxmlformats.org/wordprocessingml/2006/main" w:numId="1013">
+    <w:abstractNumId w:val="10"/>
+    <w:lvlOverride w:ilvl="0">
+      <w:startOverride w:val="1"/>
+    </w:lvlOverride>
+  </w:num>
+  <w:num xmlns:w="http://schemas.openxmlformats.org/wordprocessingml/2006/main" w:numId="1014">
+    <w:abstractNumId w:val="1000"/>
+    <w:lvlOverride w:ilvl="0">
+      <w:startOverride w:val="1"/>
+    </w:lvlOverride>
+  </w:num>
+  <w:num xmlns:w="http://schemas.openxmlformats.org/wordprocessingml/2006/main" w:numId="1015">
+    <w:abstractNumId w:val="1000"/>
+    <w:lvlOverride w:ilvl="0">
+      <w:startOverride w:val="1"/>
+    </w:lvlOverride>
+  </w:num>
+  <w:num xmlns:w="http://schemas.openxmlformats.org/wordprocessingml/2006/main" w:numId="1016">
+    <w:abstractNumId w:val="1001"/>
+    <w:lvlOverride w:ilvl="0">
+      <w:startOverride w:val="1"/>
+    </w:lvlOverride>
+  </w:num>
+  <w:num xmlns:w="http://schemas.openxmlformats.org/wordprocessingml/2006/main" w:numId="1017">
+    <w:abstractNumId w:val="1000"/>
+    <w:lvlOverride w:ilvl="0">
+      <w:startOverride w:val="1"/>
+    </w:lvlOverride>
+  </w:num>
+  <w:num xmlns:w="http://schemas.openxmlformats.org/wordprocessingml/2006/main" w:numId="1018">
+    <w:abstractNumId w:val="10"/>
+    <w:lvlOverride w:ilvl="0">
+      <w:startOverride w:val="1"/>
+    </w:lvlOverride>
+  </w:num>
+  <w:num xmlns:w="http://schemas.openxmlformats.org/wordprocessingml/2006/main" w:numId="1019">
+    <w:abstractNumId w:val="10"/>
+    <w:lvlOverride w:ilvl="0">
+      <w:startOverride w:val="1"/>
+    </w:lvlOverride>
+  </w:num>
+  <w:num xmlns:w="http://schemas.openxmlformats.org/wordprocessingml/2006/main" w:numId="1020">
+    <w:abstractNumId w:val="1001"/>
+    <w:lvlOverride w:ilvl="0">
+      <w:startOverride w:val="1"/>
+    </w:lvlOverride>
+  </w:num>
+  <w:num xmlns:w="http://schemas.openxmlformats.org/wordprocessingml/2006/main" w:numId="1021">
+    <w:abstractNumId w:val="1001"/>
+    <w:lvlOverride w:ilvl="0">
+      <w:startOverride w:val="1"/>
+    </w:lvlOverride>
+  </w:num>
+  <w:num xmlns:w="http://schemas.openxmlformats.org/wordprocessingml/2006/main" w:numId="1022">
+    <w:abstractNumId w:val="1000"/>
+    <w:lvlOverride w:ilvl="0">
+      <w:startOverride w:val="1"/>
+    </w:lvlOverride>
+  </w:num>
+  <w:num xmlns:w="http://schemas.openxmlformats.org/wordprocessingml/2006/main" w:numId="1023">
+    <w:abstractNumId w:val="1000"/>
+    <w:lvlOverride w:ilvl="0">
+      <w:startOverride w:val="1"/>
+    </w:lvlOverride>
+  </w:num>
+  <w:num xmlns:w="http://schemas.openxmlformats.org/wordprocessingml/2006/main" w:numId="1024">
+    <w:abstractNumId w:val="1001"/>
+    <w:lvlOverride w:ilvl="0">
+      <w:startOverride w:val="1"/>
+    </w:lvlOverride>
+  </w:num>
+  <w:num xmlns:w="http://schemas.openxmlformats.org/wordprocessingml/2006/main" w:numId="1025">
+    <w:abstractNumId w:val="1000"/>
+    <w:lvlOverride w:ilvl="0">
+      <w:startOverride w:val="1"/>
+    </w:lvlOverride>
+  </w:num>
+  <w:num xmlns:w="http://schemas.openxmlformats.org/wordprocessingml/2006/main" w:numId="1026">
+    <w:abstractNumId w:val="1001"/>
+    <w:lvlOverride w:ilvl="0">
+      <w:startOverride w:val="1"/>
+    </w:lvlOverride>
+  </w:num>
+  <w:num xmlns:w="http://schemas.openxmlformats.org/wordprocessingml/2006/main" w:numId="1027">
+    <w:abstractNumId w:val="1001"/>
+    <w:lvlOverride w:ilvl="0">
+      <w:startOverride w:val="1"/>
+    </w:lvlOverride>
+  </w:num>
+  <w:num xmlns:w="http://schemas.openxmlformats.org/wordprocessingml/2006/main" w:numId="1028">
+    <w:abstractNumId w:val="1001"/>
+    <w:lvlOverride w:ilvl="0">
+      <w:startOverride w:val="1"/>
+    </w:lvlOverride>
+  </w:num>
+  <w:num xmlns:w="http://schemas.openxmlformats.org/wordprocessingml/2006/main" w:numId="1029">
+    <w:abstractNumId w:val="1001"/>
+    <w:lvlOverride w:ilvl="0">
+      <w:startOverride w:val="1"/>
+    </w:lvlOverride>
+  </w:num>
+  <w:num xmlns:w="http://schemas.openxmlformats.org/wordprocessingml/2006/main" w:numId="1030">
+    <w:abstractNumId w:val="1001"/>
+    <w:lvlOverride w:ilvl="0">
+      <w:startOverride w:val="1"/>
+    </w:lvlOverride>
+  </w:num>
+  <w:num xmlns:w="http://schemas.openxmlformats.org/wordprocessingml/2006/main" w:numId="1031">
+    <w:abstractNumId w:val="1001"/>
+    <w:lvlOverride w:ilvl="0">
+      <w:startOverride w:val="1"/>
+    </w:lvlOverride>
+  </w:num>
+  <w:num xmlns:w="http://schemas.openxmlformats.org/wordprocessingml/2006/main" w:numId="1032">
+    <w:abstractNumId w:val="1001"/>
+    <w:lvlOverride w:ilvl="0">
+      <w:startOverride w:val="1"/>
+    </w:lvlOverride>
+  </w:num>
+  <w:num xmlns:w="http://schemas.openxmlformats.org/wordprocessingml/2006/main" w:numId="1033">
+    <w:abstractNumId w:val="1000"/>
+    <w:lvlOverride w:ilvl="0">
+      <w:startOverride w:val="1"/>
+    </w:lvlOverride>
+  </w:num>
+  <!-- ANGERONA_LIST_RESTARTS_END -->
 </w:numbering>
 </file>
 

</xml_diff>

<commit_message>
fix: harden 1.15 recorder custody and resolve CI regressions
</commit_message>
<xml_diff>
--- a/Angerona_Master_Manual.docx
+++ b/Angerona_Master_Manual.docx
@@ -26180,6 +26180,84 @@
     </w:p>
     <w:p>
       <w:pPr>
+        <w:pStyle w:val="Normal"/>
+        <w:spacing w:after="120" w:line="264" w:lineRule="auto"/>
+      </w:pPr>
+      <w:r>
+        <w:rPr>
+          <w:color w:val="000000"/>
+          <w:sz w:val="22"/>
+        </w:rPr>
+        <w:t xml:space="preserve">Full Setup also exposes these eleven public enrollment/storage settings and points to the running-dashboard controls above for protected host identity enrollment. Setup does not generate a request identity, collect private PEM contents or contact the authority. A client TLS key setting is a local file path, not the private key's contents. Profiles keep witnessing disabled; a missing witness or credential holds this optional feature while local protection continues.</w:t>
+      </w:r>
+    </w:p>
+    <w:p>
+      <w:pPr>
+        <w:pStyle w:val="Heading3"/>
+        <w:keepNext/>
+        <w:spacing w:after="120" w:line="264" w:lineRule="auto"/>
+      </w:pPr>
+      <w:r>
+        <w:rPr>
+          <w:color w:val="000000"/>
+        </w:rPr>
+        <w:t xml:space="preserve">Windows metadata custody</w:t>
+      </w:r>
+    </w:p>
+    <w:p>
+      <w:pPr>
+        <w:pStyle w:val="Normal"/>
+        <w:spacing w:after="120" w:line="264" w:lineRule="auto"/>
+      </w:pPr>
+      <w:r>
+        <w:rPr>
+          <w:color w:val="000000"/>
+          <w:sz w:val="22"/>
+        </w:rPr>
+        <w:t xml:space="preserve">New pending, write-scratch and writer-lock files are created with the actual current token user's owner SID and a protected DACL for that user, SYSTEM and Administrators before bytes are written. Admission checks the opened object's security descriptor, file identity and single-link state. Existing inherited private files can be admitted; nonprivate, aliased or multilink objects are preserved and held rather than repaired, deleted or overwritten automatically.</w:t>
+      </w:r>
+    </w:p>
+    <w:p>
+      <w:pPr>
+        <w:pStyle w:val="Normal"/>
+        <w:spacing w:after="120" w:line="264" w:lineRule="auto"/>
+      </w:pPr>
+      <w:r>
+        <w:rPr>
+          <w:color w:val="000000"/>
+          <w:sz w:val="22"/>
+        </w:rPr>
+        <w:t xml:space="preserve">The native file handle has one owner across transfer to the CRT descriptor. Uncertain creation, transfer or auxiliary/file/descriptor cleanup retains tracked custody and prevents optional-worker replacement. Numeric handles are not blindly retried after an ambiguous close. The SQLite protection writer remains usable, and ordinary file-lease callers and POSIX mode 0600 keep their existing behavior. Parent-directory checks are path checks, not retained directory leases. Private files in source mode remain inside the same-user, administrator and kernel trust boundaries; these DACLs do not establish a new independent security principal.</w:t>
+      </w:r>
+    </w:p>
+    <w:p>
+      <w:pPr>
+        <w:pStyle w:val="Normal"/>
+        <w:spacing w:after="120" w:line="264" w:lineRule="auto"/>
+      </w:pPr>
+      <w:r>
+        <w:rPr>
+          <w:color w:val="000000"/>
+          <w:sz w:val="22"/>
+        </w:rPr>
+        <w:t xml:space="preserve">An ordinary-user probe accepted inherited private fixtures and observed token owner equal to token user. It did not reproduce the proposed elevated-CI Administrators-owner explanation. Focused checks covered 82 distinct cases across a 79-pass/three-fixture-failure run and a corrected three-pass rerun with unchanged product bytes. This is not a single all-pass cohort or signed-service deployment acceptance. See the sanitized follow-up.</w:t>
+      </w:r>
+    </w:p>
+    <w:p>
+      <w:pPr>
+        <w:pStyle w:val="Normal"/>
+        <w:spacing w:after="120" w:line="264" w:lineRule="auto"/>
+      </w:pPr>
+      <w:r>
+        <w:rPr>
+          <w:color w:val="000000"/>
+          <w:sz w:val="22"/>
+        </w:rPr>
+        <w:t xml:space="preserve">The final changed-source Full/STOP observation met bounded lifecycle acceptance and retired all observed generations with unchanged source/preferences. It did not enroll a witness or prove complete sensor coverage. Critical/degraded and unknown states, a fresh-status settling delay and the earlier unresolved native shutdown crash remain separate limitations in the follow-up record.</w:t>
+      </w:r>
+    </w:p>
+    <w:p>
+      <w:pPr>
         <w:pStyle w:val="Heading3"/>
         <w:keepNext/>
         <w:spacing w:after="120" w:line="264" w:lineRule="auto"/>
@@ -26487,7 +26565,7 @@
           <w:color w:val="000000"/>
           <w:sz w:val="22"/>
         </w:rPr>
-        <w:t xml:space="preserve">No WDAC, SCM, ACL, HVCI, Secure Boot or TPM change is performed merely by installing the source update or opening its dashboard. Signed installation, native rights, real enrollment/materials, ConfigCI availability, independent operator workflows and clean-VM acceptance remain deployment requirements.</w:t>
+        <w:t xml:space="preserve">Source updates do not activate host enforcement. Signed installation, native rights, enrollment, ConfigCI availability, independent approvals and clean-VM acceptance remain required.</w:t>
       </w:r>
     </w:p>
     <w:p>

</xml_diff>

<commit_message>
fix: bind WER snapshots and batch Windows birth observations
</commit_message>
<xml_diff>
--- a/Angerona_Master_Manual.docx
+++ b/Angerona_Master_Manual.docx
@@ -16643,7 +16643,7 @@
                 <w:color w:val="000000"/>
                 <w:sz w:val="19"/>
               </w:rPr>
-              <w:t xml:space="preserve">Bounded creation/access correlation against a current native-owned process cache, with exact birth/GUID evidence where available.</w:t>
+              <w:t xml:space="preserve">Acquire cached native ownership before its shared admission/correlation clock; retain exact birth/GUID requirements and typed unavailable reasons.</w:t>
             </w:r>
           </w:p>
         </w:tc>
@@ -16875,6 +16875,19 @@
           <w:sz w:val="22"/>
         </w:rPr>
         <w:t xml:space="preserve"/>
+      </w:r>
+    </w:p>
+    <w:p>
+      <w:pPr>
+        <w:pStyle w:val="Normal"/>
+        <w:spacing w:after="120" w:line="264" w:lineRule="auto"/>
+      </w:pPr>
+      <w:r>
+        <w:rPr>
+          <w:color w:val="000000"/>
+          <w:sz w:val="22"/>
+        </w:rPr>
+        <w:t xml:space="preserve">Native AMD64 Windows with reviewed psutil 7.2.2 can bracket advisory metadata with two fresh raw birth maps, retaining two fresh process objects and bounded partial/loss evidence. Maps neither establish executable custody nor authorize response. The inventory/WER follow-up separates a held paired comparison from candidate-only requests and later lifecycle acceptance; WER live typed availability remains unmeasured.</w:t>
       </w:r>
     </w:p>
     <w:p>

</xml_diff>

<commit_message>
fix: expose cached WER status and correct CI fixtures
</commit_message>
<xml_diff>
--- a/Angerona_Master_Manual.docx
+++ b/Angerona_Master_Manual.docx
@@ -16643,7 +16643,7 @@
                 <w:color w:val="000000"/>
                 <w:sz w:val="19"/>
               </w:rPr>
-              <w:t xml:space="preserve">Acquire cached native ownership before its shared admission/correlation clock; retain exact birth/GUID requirements and typed unavailable reasons.</w:t>
+              <w:t xml:space="preserve">Shared post-acquisition admission clock, exact birth/GUID requirements and read-only cached admission/expiry/loss status.</w:t>
             </w:r>
           </w:p>
         </w:tc>
@@ -16663,7 +16663,7 @@
                 <w:color w:val="000000"/>
                 <w:sz w:val="19"/>
               </w:rPr>
-              <w:t xml:space="preserve">Post-event observation cannot guarantee pre-dump blocking. Certified ELAM/PPL deployment is not supplied.</w:t>
+              <w:t xml:space="preserve">Copied status is not atomic upstream truth. Post-event observation cannot guarantee pre-dump blocking; certified ELAM/PPL is not supplied.</w:t>
             </w:r>
           </w:p>
         </w:tc>
@@ -16887,7 +16887,7 @@
           <w:color w:val="000000"/>
           <w:sz w:val="22"/>
         </w:rPr>
-        <w:t xml:space="preserve">Native AMD64 Windows with reviewed psutil 7.2.2 can bracket advisory metadata with two fresh raw birth maps, retaining two fresh process objects and bounded partial/loss evidence. Maps neither establish executable custody nor authorize response. The inventory/WER follow-up separates a held paired comparison from candidate-only requests and later lifecycle acceptance; WER live typed availability remains unmeasured.</w:t>
+        <w:t xml:space="preserve">Native AMD64 Windows with reviewed psutil 7.2.2 can bracket advisory metadata with two fresh raw birth maps, retaining two fresh process objects and bounded partial/loss evidence. Maps neither establish executable custody nor authorize response. The inventory/WER follow-up separates a held paired comparison from candidate-only requests. The later WER/status review measures copied admission/expiry views, without proving current upstream delivery or continuous availability.</w:t>
       </w:r>
     </w:p>
     <w:p>

</xml_diff>